<commit_message>
Refine MCQ pseudocode layout and sync late-question template spans.
Nested block indentation and Word spacing at code-block edges replace extra blank paragraphs; Q25–27 spans match the reference template and Exam02 is regenerated.

Co-authored-by: Cursor <cursoragent@cursor.com>
</commit_message>
<xml_diff>
--- a/Subjects/S5-ICT/past-papers/2025-2026/Term 02/WrittenExam/25_26_S5_ICT_Exam02.docx
+++ b/Subjects/S5-ICT/past-papers/2025-2026/Term 02/WrittenExam/25_26_S5_ICT_Exam02.docx
@@ -8965,6 +8965,7 @@
           <w:tab w:pos="2268" w:val="left"/>
         </w:tabs>
         <w:snapToGrid w:val="0"/>
+        <w:spacing w:before="120"/>
         <w:ind w:left="567" w:hanging="567"/>
         <w:rPr>
           <w:spacing w:val="20"/>
@@ -8976,7 +8977,6 @@
           <w:rFonts w:ascii="Courier New" w:hAnsi="Courier New"/>
         </w:rPr>
         <w:tab/>
-        <w:tab/>
         <w:t>total ← 0</w:t>
       </w:r>
     </w:p>
@@ -9010,7 +9010,7 @@
           <w:spacing w:val="20"/>
           <w:szCs w:val="20"/>
         </w:rPr>
-        <w:tab/>
+        <w:t>重</w:t>
       </w:r>
       <w:r>
         <w:rPr>
@@ -9018,7 +9018,7 @@
           <w:spacing w:val="20"/>
           <w:szCs w:val="20"/>
         </w:rPr>
-        <w:t>重</w:t>
+        <w:t>複</w:t>
       </w:r>
       <w:r>
         <w:rPr>
@@ -9026,19 +9026,20 @@
           <w:spacing w:val="20"/>
           <w:szCs w:val="20"/>
         </w:rPr>
-        <w:t>複 i 由 1 至 n：total ← total + i</w:t>
-      </w:r>
-    </w:p>
-    <w:p>
-      <w:pPr>
-        <w:tabs>
-          <w:tab w:pos="567" w:val="left"/>
-          <w:tab w:pos="993" w:val="left"/>
-          <w:tab w:pos="1418" w:val="left"/>
-          <w:tab w:pos="1843" w:val="left"/>
-          <w:tab w:pos="2268" w:val="left"/>
-        </w:tabs>
-        <w:snapToGrid w:val="0"/>
+        <w:t xml:space="preserve"> i 由 1 至 n：total ← total + i</w:t>
+      </w:r>
+    </w:p>
+    <w:p>
+      <w:pPr>
+        <w:tabs>
+          <w:tab w:pos="567" w:val="left"/>
+          <w:tab w:pos="993" w:val="left"/>
+          <w:tab w:pos="1418" w:val="left"/>
+          <w:tab w:pos="1843" w:val="left"/>
+          <w:tab w:pos="2268" w:val="left"/>
+        </w:tabs>
+        <w:snapToGrid w:val="0"/>
+        <w:spacing w:after="120"/>
         <w:ind w:left="567" w:hanging="567"/>
         <w:rPr>
           <w:spacing w:val="20"/>
@@ -9059,7 +9060,7 @@
           <w:spacing w:val="20"/>
           <w:szCs w:val="20"/>
         </w:rPr>
-        <w:tab/>
+        <w:t>輸</w:t>
       </w:r>
       <w:r>
         <w:rPr>
@@ -9067,7 +9068,7 @@
           <w:spacing w:val="20"/>
           <w:szCs w:val="20"/>
         </w:rPr>
-        <w:t>輸</w:t>
+        <w:t>出</w:t>
       </w:r>
       <w:r>
         <w:rPr>
@@ -9075,7 +9076,7 @@
           <w:spacing w:val="20"/>
           <w:szCs w:val="20"/>
         </w:rPr>
-        <w:t>出 total</w:t>
+        <w:t xml:space="preserve"> total</w:t>
       </w:r>
     </w:p>
     <w:p>
@@ -9526,6 +9527,7 @@
           <w:tab w:pos="2268" w:val="left"/>
         </w:tabs>
         <w:snapToGrid w:val="0"/>
+        <w:spacing w:before="120"/>
         <w:ind w:left="567" w:hanging="567"/>
         <w:rPr>
           <w:spacing w:val="20"/>
@@ -9537,7 +9539,6 @@
           <w:rFonts w:ascii="Courier New" w:hAnsi="Courier New"/>
         </w:rPr>
         <w:tab/>
-        <w:tab/>
         <w:t>count ← 0</w:t>
       </w:r>
     </w:p>
@@ -9571,7 +9572,7 @@
           <w:spacing w:val="20"/>
           <w:szCs w:val="20"/>
         </w:rPr>
-        <w:tab/>
+        <w:t>當</w:t>
       </w:r>
       <w:r>
         <w:rPr>
@@ -9579,7 +9580,7 @@
           <w:spacing w:val="20"/>
           <w:szCs w:val="20"/>
         </w:rPr>
-        <w:t>當</w:t>
+        <w:t xml:space="preserve"> </w:t>
       </w:r>
       <w:r>
         <w:rPr>
@@ -9587,7 +9588,7 @@
           <w:spacing w:val="20"/>
           <w:szCs w:val="20"/>
         </w:rPr>
-        <w:t xml:space="preserve"> </w:t>
+        <w:t>c</w:t>
       </w:r>
       <w:r>
         <w:rPr>
@@ -9595,6 +9596,48 @@
           <w:spacing w:val="20"/>
           <w:szCs w:val="20"/>
         </w:rPr>
+        <w:t>o</w:t>
+      </w:r>
+      <w:r>
+        <w:rPr>
+          <w:rFonts w:hint="eastAsia" w:ascii="Courier New" w:hAnsi="Courier New"/>
+          <w:spacing w:val="20"/>
+          <w:szCs w:val="20"/>
+        </w:rPr>
+        <w:t>unt &lt; 3：輸出 count</w:t>
+      </w:r>
+    </w:p>
+    <w:p>
+      <w:pPr>
+        <w:tabs>
+          <w:tab w:pos="567" w:val="left"/>
+          <w:tab w:pos="993" w:val="left"/>
+          <w:tab w:pos="1418" w:val="left"/>
+          <w:tab w:pos="1843" w:val="left"/>
+          <w:tab w:pos="2268" w:val="left"/>
+        </w:tabs>
+        <w:snapToGrid w:val="0"/>
+        <w:spacing w:after="120"/>
+        <w:ind w:left="567" w:hanging="567"/>
+        <w:rPr>
+          <w:spacing w:val="20"/>
+          <w:szCs w:val="20"/>
+        </w:rPr>
+      </w:pPr>
+      <w:r>
+        <w:rPr>
+          <w:rFonts w:hint="eastAsia" w:ascii="Courier New" w:hAnsi="Courier New"/>
+          <w:spacing w:val="20"/>
+          <w:szCs w:val="20"/>
+        </w:rPr>
+        <w:tab/>
+      </w:r>
+      <w:r>
+        <w:rPr>
+          <w:rFonts w:hint="eastAsia" w:ascii="Courier New" w:hAnsi="Courier New"/>
+          <w:spacing w:val="20"/>
+          <w:szCs w:val="20"/>
+        </w:rPr>
         <w:t>c</w:t>
       </w:r>
       <w:r>
@@ -9603,7 +9646,31 @@
           <w:spacing w:val="20"/>
           <w:szCs w:val="20"/>
         </w:rPr>
-        <w:t>ount &lt; 3：輸出 count；count ← count + 1</w:t>
+        <w:t>o</w:t>
+      </w:r>
+      <w:r>
+        <w:rPr>
+          <w:rFonts w:hint="eastAsia" w:ascii="Courier New" w:hAnsi="Courier New"/>
+          <w:spacing w:val="20"/>
+          <w:szCs w:val="20"/>
+        </w:rPr>
+        <w:t>u</w:t>
+      </w:r>
+      <w:r>
+        <w:rPr>
+          <w:rFonts w:hint="eastAsia" w:ascii="Courier New" w:hAnsi="Courier New"/>
+          <w:spacing w:val="20"/>
+          <w:szCs w:val="20"/>
+        </w:rPr>
+        <w:t>n</w:t>
+      </w:r>
+      <w:r>
+        <w:rPr>
+          <w:rFonts w:hint="eastAsia" w:ascii="Courier New" w:hAnsi="Courier New"/>
+          <w:spacing w:val="20"/>
+          <w:szCs w:val="20"/>
+        </w:rPr>
+        <w:t>t ← count + 1</w:t>
       </w:r>
     </w:p>
     <w:p>
@@ -9682,6 +9749,22 @@
           <w:tab w:pos="2268" w:val="left"/>
         </w:tabs>
         <w:snapToGrid w:val="0"/>
+        <w:rPr>
+          <w:spacing w:val="20"/>
+          <w:szCs w:val="20"/>
+        </w:rPr>
+      </w:pPr>
+    </w:p>
+    <w:p>
+      <w:pPr>
+        <w:tabs>
+          <w:tab w:pos="567" w:val="left"/>
+          <w:tab w:pos="993" w:val="left"/>
+          <w:tab w:pos="1418" w:val="left"/>
+          <w:tab w:pos="1843" w:val="left"/>
+          <w:tab w:pos="2268" w:val="left"/>
+        </w:tabs>
+        <w:snapToGrid w:val="0"/>
         <w:ind w:left="567" w:hanging="567"/>
         <w:rPr>
           <w:spacing w:val="20"/>
@@ -9690,51 +9773,43 @@
       </w:pPr>
       <w:r>
         <w:rPr>
-          <w:rFonts w:hint="eastAsia"/>
-          <w:spacing w:val="20"/>
-          <w:szCs w:val="20"/>
-        </w:rPr>
-        <w:t xml:space="preserve"> </w:t>
-      </w:r>
-      <w:r>
-        <w:rPr>
-          <w:rFonts w:hint="eastAsia"/>
-          <w:spacing w:val="20"/>
-          <w:szCs w:val="20"/>
-        </w:rPr>
-        <w:t xml:space="preserve"> </w:t>
-      </w:r>
-      <w:r>
-        <w:rPr>
-          <w:rFonts w:hint="eastAsia"/>
-          <w:spacing w:val="20"/>
-          <w:szCs w:val="20"/>
-        </w:rPr>
-        <w:t xml:space="preserve"> </w:t>
-      </w:r>
-      <w:r>
-        <w:rPr>
-          <w:rFonts w:hint="eastAsia"/>
-          <w:spacing w:val="20"/>
-          <w:szCs w:val="20"/>
-        </w:rPr>
-        <w:t xml:space="preserve"> </w:t>
-      </w:r>
-      <w:r>
-        <w:rPr>
-          <w:rFonts w:hint="eastAsia"/>
-          <w:spacing w:val="20"/>
-          <w:szCs w:val="20"/>
-        </w:rPr>
-        <w:t xml:space="preserve"> </w:t>
-      </w:r>
-      <w:r>
-        <w:rPr>
-          <w:rFonts w:hint="eastAsia"/>
-          <w:spacing w:val="20"/>
-          <w:szCs w:val="20"/>
-        </w:rPr>
-        <w:t xml:space="preserve"> </w:t>
+          <w:rFonts w:ascii="新細明體" w:hAnsi="新細明體"/>
+          <w:spacing w:val="20"/>
+          <w:szCs w:val="20"/>
+        </w:rPr>
+        <w:tab/>
+      </w:r>
+      <w:r>
+        <w:rPr>
+          <w:rFonts w:ascii="新細明體" w:hAnsi="新細明體"/>
+          <w:spacing w:val="20"/>
+          <w:szCs w:val="20"/>
+        </w:rPr>
+        <w:t>A</w:t>
+      </w:r>
+      <w:r>
+        <w:rPr>
+          <w:rFonts w:hint="eastAsia" w:ascii="新細明體" w:hAnsi="新細明體"/>
+          <w:spacing w:val="20"/>
+          <w:szCs w:val="20"/>
+        </w:rPr>
+        <w:t>.</w:t>
+      </w:r>
+      <w:r>
+        <w:rPr>
+          <w:rFonts w:hint="eastAsia" w:ascii="新細明體" w:hAnsi="新細明體"/>
+          <w:spacing w:val="20"/>
+          <w:szCs w:val="20"/>
+        </w:rPr>
+        <w:tab/>
+      </w:r>
+      <w:r>
+        <w:rPr>
+          <w:rFonts w:hint="eastAsia" w:ascii="新細明體" w:hAnsi="新細明體"/>
+          <w:spacing w:val="20"/>
+          <w:szCs w:val="20"/>
+        </w:rPr>
+        <w:t>0, 1, 2, 3</w:t>
       </w:r>
     </w:p>
     <w:p>
@@ -9755,12 +9830,43 @@
       </w:pPr>
       <w:r>
         <w:rPr>
-          <w:rFonts w:ascii="新細明體" w:hAnsi="新細明體"/>
-        </w:rPr>
-        <w:tab/>
-        <w:t>A.</w:t>
-        <w:tab/>
-        <w:t>0, 1, 2, 3</w:t>
+          <w:rFonts w:hint="eastAsia" w:ascii="新細明體" w:hAnsi="新細明體"/>
+          <w:spacing w:val="20"/>
+          <w:szCs w:val="20"/>
+        </w:rPr>
+        <w:tab/>
+      </w:r>
+      <w:r>
+        <w:rPr>
+          <w:rFonts w:hint="eastAsia" w:ascii="新細明體" w:hAnsi="新細明體"/>
+          <w:spacing w:val="20"/>
+          <w:szCs w:val="20"/>
+        </w:rPr>
+        <w:t>B</w:t>
+      </w:r>
+      <w:r>
+        <w:rPr>
+          <w:rFonts w:hint="eastAsia" w:ascii="新細明體" w:hAnsi="新細明體"/>
+          <w:spacing w:val="20"/>
+          <w:szCs w:val="20"/>
+        </w:rPr>
+        <w:t>.</w:t>
+      </w:r>
+      <w:r>
+        <w:rPr>
+          <w:rFonts w:hint="eastAsia" w:ascii="新細明體" w:hAnsi="新細明體"/>
+          <w:spacing w:val="20"/>
+          <w:szCs w:val="20"/>
+        </w:rPr>
+        <w:tab/>
+      </w:r>
+      <w:r>
+        <w:rPr>
+          <w:rFonts w:hint="eastAsia" w:ascii="新細明體" w:hAnsi="新細明體"/>
+          <w:spacing w:val="20"/>
+          <w:szCs w:val="20"/>
+        </w:rPr>
+        <w:t>0, 1, 2</w:t>
       </w:r>
     </w:p>
     <w:p>
@@ -9781,19 +9887,19 @@
       </w:pPr>
       <w:r>
         <w:rPr>
-          <w:rFonts w:ascii="新細明體" w:hAnsi="新細明體"/>
-          <w:spacing w:val="20"/>
-          <w:szCs w:val="20"/>
-        </w:rPr>
-        <w:tab/>
-      </w:r>
-      <w:r>
-        <w:rPr>
-          <w:rFonts w:ascii="新細明體" w:hAnsi="新細明體"/>
-          <w:spacing w:val="20"/>
-          <w:szCs w:val="20"/>
-        </w:rPr>
-        <w:t>B</w:t>
+          <w:rFonts w:hint="eastAsia" w:ascii="新細明體" w:hAnsi="新細明體"/>
+          <w:spacing w:val="20"/>
+          <w:szCs w:val="20"/>
+        </w:rPr>
+        <w:tab/>
+      </w:r>
+      <w:r>
+        <w:rPr>
+          <w:rFonts w:hint="eastAsia" w:ascii="新細明體" w:hAnsi="新細明體"/>
+          <w:spacing w:val="20"/>
+          <w:szCs w:val="20"/>
+        </w:rPr>
+        <w:t>C</w:t>
       </w:r>
       <w:r>
         <w:rPr>
@@ -9817,7 +9923,7 @@
           <w:spacing w:val="20"/>
           <w:szCs w:val="20"/>
         </w:rPr>
-        <w:t>0, 1, 2</w:t>
+        <w:t>1, 2, 3</w:t>
       </w:r>
     </w:p>
     <w:p>
@@ -9850,7 +9956,7 @@
           <w:spacing w:val="20"/>
           <w:szCs w:val="20"/>
         </w:rPr>
-        <w:t>C</w:t>
+        <w:t>D</w:t>
       </w:r>
       <w:r>
         <w:rPr>
@@ -9874,134 +9980,19 @@
           <w:spacing w:val="20"/>
           <w:szCs w:val="20"/>
         </w:rPr>
-        <w:t>1, 2, 3</w:t>
-      </w:r>
-    </w:p>
-    <w:p>
-      <w:pPr>
-        <w:tabs>
-          <w:tab w:pos="567" w:val="left"/>
-          <w:tab w:pos="993" w:val="left"/>
-          <w:tab w:pos="1418" w:val="left"/>
-          <w:tab w:pos="1843" w:val="left"/>
-          <w:tab w:pos="2268" w:val="left"/>
-        </w:tabs>
-        <w:snapToGrid w:val="0"/>
-        <w:ind w:left="567" w:hanging="567"/>
-        <w:rPr>
-          <w:spacing w:val="20"/>
-          <w:szCs w:val="20"/>
-        </w:rPr>
-      </w:pPr>
-      <w:r>
-        <w:rPr>
-          <w:rFonts w:hint="eastAsia" w:ascii="新細明體" w:hAnsi="新細明體"/>
-          <w:spacing w:val="20"/>
-          <w:szCs w:val="20"/>
-        </w:rPr>
-        <w:tab/>
-      </w:r>
-      <w:r>
-        <w:rPr>
-          <w:rFonts w:hint="eastAsia" w:ascii="新細明體" w:hAnsi="新細明體"/>
-          <w:spacing w:val="20"/>
-          <w:szCs w:val="20"/>
-        </w:rPr>
-        <w:t>D</w:t>
-      </w:r>
-      <w:r>
-        <w:rPr>
-          <w:rFonts w:hint="eastAsia" w:ascii="新細明體" w:hAnsi="新細明體"/>
-          <w:spacing w:val="20"/>
-          <w:szCs w:val="20"/>
-        </w:rPr>
-        <w:t>.</w:t>
-      </w:r>
-      <w:r>
-        <w:rPr>
-          <w:rFonts w:hint="eastAsia" w:ascii="新細明體" w:hAnsi="新細明體"/>
-          <w:spacing w:val="20"/>
-          <w:szCs w:val="20"/>
-        </w:rPr>
-        <w:tab/>
-      </w:r>
-      <w:r>
-        <w:rPr>
-          <w:rFonts w:hint="eastAsia" w:ascii="新細明體" w:hAnsi="新細明體"/>
-          <w:spacing w:val="20"/>
-          <w:szCs w:val="20"/>
-        </w:rPr>
         <w:t>3</w:t>
       </w:r>
-    </w:p>
-    <w:p>
-      <w:pPr>
-        <w:tabs>
-          <w:tab w:pos="567" w:val="left"/>
-          <w:tab w:pos="993" w:val="left"/>
-          <w:tab w:pos="1418" w:val="left"/>
-          <w:tab w:pos="1843" w:val="left"/>
-          <w:tab w:pos="2268" w:val="left"/>
-        </w:tabs>
-        <w:snapToGrid w:val="0"/>
-        <w:spacing w:before="0" w:after="0" w:lineRule="exact" w:line="20"/>
-        <w:ind w:left="567" w:hanging="567"/>
-        <w:rPr>
-          <w:spacing w:val="20"/>
-          <w:szCs w:val="20"/>
-        </w:rPr>
-      </w:pPr>
-      <w:r>
-        <w:rPr>
-          <w:rFonts w:hint="eastAsia"/>
-          <w:spacing w:val="20"/>
-          <w:szCs w:val="20"/>
-        </w:rPr>
-        <w:t xml:space="preserve"> </w:t>
-      </w:r>
-      <w:r>
-        <w:rPr>
-          <w:rFonts w:hint="eastAsia"/>
-          <w:spacing w:val="20"/>
-          <w:szCs w:val="20"/>
-        </w:rPr>
-        <w:t xml:space="preserve"> </w:t>
-      </w:r>
-      <w:r>
-        <w:rPr>
-          <w:rFonts w:hint="eastAsia"/>
-          <w:spacing w:val="20"/>
-          <w:szCs w:val="20"/>
-        </w:rPr>
-        <w:t xml:space="preserve"> </w:t>
-      </w:r>
-      <w:r>
-        <w:rPr>
-          <w:rFonts w:hint="eastAsia"/>
-          <w:spacing w:val="20"/>
-          <w:szCs w:val="20"/>
-        </w:rPr>
-        <w:t xml:space="preserve"> </w:t>
-      </w:r>
-      <w:r>
-        <w:rPr>
-          <w:rFonts w:hint="eastAsia"/>
-          <w:spacing w:val="20"/>
-          <w:szCs w:val="20"/>
-        </w:rPr>
-        <w:t xml:space="preserve"> </w:t>
-      </w:r>
-      <w:r>
-        <w:rPr>
-          <w:rFonts w:hint="eastAsia"/>
-          <w:spacing w:val="20"/>
-          <w:szCs w:val="20"/>
-        </w:rPr>
-        <w:t xml:space="preserve"> </w:t>
-      </w:r>
-      <w:r>
-        <w:rPr>
-          <w:rFonts w:hint="eastAsia"/>
+      <w:r>
+        <w:rPr>
+          <w:rFonts w:hint="eastAsia" w:ascii="新細明體" w:hAnsi="新細明體"/>
+          <w:spacing w:val="20"/>
+          <w:szCs w:val="20"/>
+        </w:rPr>
+        <w:t xml:space="preserve"> </w:t>
+      </w:r>
+      <w:r>
+        <w:rPr>
+          <w:rFonts w:hint="eastAsia" w:ascii="新細明體" w:hAnsi="新細明體"/>
           <w:spacing w:val="20"/>
           <w:szCs w:val="20"/>
         </w:rPr>
@@ -10140,6 +10131,7 @@
           <w:tab w:pos="2268" w:val="left"/>
         </w:tabs>
         <w:snapToGrid w:val="0"/>
+        <w:spacing w:before="120" w:after="120"/>
         <w:ind w:left="567" w:hanging="567"/>
         <w:rPr>
           <w:spacing w:val="20"/>
@@ -10150,7 +10142,6 @@
         <w:rPr>
           <w:rFonts w:ascii="Courier New" w:hAnsi="Courier New"/>
         </w:rPr>
-        <w:tab/>
         <w:tab/>
         <w:t>while i &lt;= 8:</w:t>
       </w:r>
@@ -10985,6 +10976,7 @@
           <w:tab w:pos="2268" w:val="left"/>
         </w:tabs>
         <w:snapToGrid w:val="0"/>
+        <w:spacing w:before="120"/>
         <w:ind w:left="567" w:hanging="567"/>
         <w:rPr>
           <w:spacing w:val="20"/>
@@ -10996,8 +10988,7 @@
           <w:rFonts w:ascii="Courier New" w:hAnsi="Courier New"/>
         </w:rPr>
         <w:tab/>
-        <w:tab/>
-        <w:t>found ← 假；i ← 1</w:t>
+        <w:t>found ← 假</w:t>
       </w:r>
     </w:p>
     <w:p>
@@ -11031,15 +11022,15 @@
           <w:spacing w:val="20"/>
           <w:szCs w:val="20"/>
         </w:rPr>
-        <w:tab/>
-      </w:r>
-      <w:r>
-        <w:rPr>
-          <w:rFonts w:ascii="Courier New" w:hAnsi="Courier New" w:cs="Courier New"/>
-          <w:spacing w:val="20"/>
-          <w:szCs w:val="20"/>
-        </w:rPr>
-        <w:t>當 i ≤ 5 且 found = 假</w:t>
+        <w:t>i</w:t>
+      </w:r>
+      <w:r>
+        <w:rPr>
+          <w:rFonts w:ascii="Courier New" w:hAnsi="Courier New" w:cs="Courier New"/>
+          <w:spacing w:val="20"/>
+          <w:szCs w:val="20"/>
+        </w:rPr>
+        <w:t xml:space="preserve"> ← 1</w:t>
       </w:r>
     </w:p>
     <w:p>
@@ -11073,16 +11064,15 @@
           <w:spacing w:val="20"/>
           <w:szCs w:val="20"/>
         </w:rPr>
-        <w:tab/>
-      </w:r>
-      <w:r>
-        <w:rPr>
-          <w:rFonts w:ascii="Courier New" w:hAnsi="Courier New" w:cs="Courier New"/>
-          <w:spacing w:val="20"/>
-          <w:szCs w:val="20"/>
-        </w:rPr>
-        <w:tab/>
-        <w:t>若 A[i] = 4 則 found ← 真；i ← i + 1</w:t>
+        <w:t>當</w:t>
+      </w:r>
+      <w:r>
+        <w:rPr>
+          <w:rFonts w:ascii="Courier New" w:hAnsi="Courier New" w:cs="Courier New"/>
+          <w:spacing w:val="20"/>
+          <w:szCs w:val="20"/>
+        </w:rPr>
+        <w:t xml:space="preserve"> i ≤ 5 且 found = 假</w:t>
       </w:r>
     </w:p>
     <w:p>
@@ -11116,16 +11106,100 @@
           <w:spacing w:val="20"/>
           <w:szCs w:val="20"/>
         </w:rPr>
-        <w:tab/>
-      </w:r>
-      <w:r>
-        <w:rPr>
-          <w:rFonts w:ascii="Courier New" w:hAnsi="Courier New" w:cs="Courier New"/>
-          <w:spacing w:val="20"/>
-          <w:szCs w:val="20"/>
-        </w:rPr>
-        <w:tab/>
-        <w:t>輸出 i</w:t>
+        <w:t>若</w:t>
+      </w:r>
+      <w:r>
+        <w:rPr>
+          <w:rFonts w:ascii="Courier New" w:hAnsi="Courier New" w:cs="Courier New"/>
+          <w:spacing w:val="20"/>
+          <w:szCs w:val="20"/>
+        </w:rPr>
+        <w:t xml:space="preserve"> A[i] = 4 則 found ← 真</w:t>
+      </w:r>
+    </w:p>
+    <w:p>
+      <w:pPr>
+        <w:tabs>
+          <w:tab w:pos="567" w:val="left"/>
+          <w:tab w:pos="993" w:val="left"/>
+          <w:tab w:pos="1418" w:val="left"/>
+          <w:tab w:pos="1843" w:val="left"/>
+          <w:tab w:pos="2268" w:val="left"/>
+        </w:tabs>
+        <w:snapToGrid w:val="0"/>
+        <w:ind w:left="567" w:hanging="567"/>
+        <w:rPr>
+          <w:rFonts w:ascii="Courier New" w:hAnsi="Courier New" w:cs="Courier New"/>
+          <w:spacing w:val="20"/>
+          <w:szCs w:val="20"/>
+        </w:rPr>
+      </w:pPr>
+      <w:r>
+        <w:rPr>
+          <w:rFonts w:ascii="Courier New" w:hAnsi="Courier New" w:cs="Courier New"/>
+          <w:spacing w:val="20"/>
+          <w:szCs w:val="20"/>
+        </w:rPr>
+        <w:tab/>
+      </w:r>
+      <w:r>
+        <w:rPr>
+          <w:rFonts w:ascii="Courier New" w:hAnsi="Courier New" w:cs="Courier New"/>
+          <w:spacing w:val="20"/>
+          <w:szCs w:val="20"/>
+        </w:rPr>
+        <w:t>i</w:t>
+      </w:r>
+      <w:r>
+        <w:rPr>
+          <w:rFonts w:ascii="Courier New" w:hAnsi="Courier New" w:cs="Courier New"/>
+          <w:spacing w:val="20"/>
+          <w:szCs w:val="20"/>
+        </w:rPr>
+        <w:t xml:space="preserve"> ← i + 1</w:t>
+      </w:r>
+    </w:p>
+    <w:p>
+      <w:pPr>
+        <w:tabs>
+          <w:tab w:pos="567" w:val="left"/>
+          <w:tab w:pos="993" w:val="left"/>
+          <w:tab w:pos="1418" w:val="left"/>
+          <w:tab w:pos="1843" w:val="left"/>
+          <w:tab w:pos="2268" w:val="left"/>
+        </w:tabs>
+        <w:snapToGrid w:val="0"/>
+        <w:spacing w:after="120"/>
+        <w:ind w:left="567" w:hanging="567"/>
+        <w:rPr>
+          <w:rFonts w:ascii="Courier New" w:hAnsi="Courier New" w:cs="Courier New"/>
+          <w:spacing w:val="20"/>
+          <w:szCs w:val="20"/>
+        </w:rPr>
+      </w:pPr>
+      <w:r>
+        <w:rPr>
+          <w:rFonts w:ascii="Courier New" w:hAnsi="Courier New" w:cs="Courier New"/>
+          <w:spacing w:val="20"/>
+          <w:szCs w:val="20"/>
+        </w:rPr>
+        <w:tab/>
+      </w:r>
+      <w:r>
+        <w:rPr>
+          <w:rFonts w:ascii="Courier New" w:hAnsi="Courier New" w:cs="Courier New"/>
+          <w:spacing w:val="20"/>
+          <w:szCs w:val="20"/>
+        </w:rPr>
+        <w:t>輸</w:t>
+      </w:r>
+      <w:r>
+        <w:rPr>
+          <w:rFonts w:ascii="Courier New" w:hAnsi="Courier New" w:cs="Courier New"/>
+          <w:spacing w:val="20"/>
+          <w:szCs w:val="20"/>
+        </w:rPr>
+        <w:t>出 i</w:t>
       </w:r>
     </w:p>
     <w:p>
@@ -11141,22 +11215,611 @@
         <w:snapToGrid w:val="0"/>
         <w:ind w:left="567" w:hanging="567"/>
         <w:rPr>
-          <w:rFonts w:ascii="Courier New" w:hAnsi="Courier New" w:cs="Courier New"/>
-          <w:spacing w:val="20"/>
-          <w:szCs w:val="20"/>
-        </w:rPr>
-      </w:pPr>
+          <w:spacing w:val="20"/>
+          <w:szCs w:val="20"/>
+        </w:rPr>
+      </w:pPr>
+      <w:r>
+        <w:rPr>
+          <w:rFonts w:ascii="新細明體" w:hAnsi="新細明體"/>
+        </w:rPr>
+        <w:t>輸出是？</w:t>
+      </w:r>
+    </w:p>
+    <w:p>
+      <w:pPr>
+        <w:tabs>
+          <w:tab w:pos="567" w:val="left"/>
+          <w:tab w:pos="993" w:val="left"/>
+          <w:tab w:pos="1418" w:val="left"/>
+          <w:tab w:pos="1843" w:val="left"/>
+          <w:tab w:pos="2268" w:val="left"/>
+        </w:tabs>
+        <w:snapToGrid w:val="0"/>
+        <w:ind w:left="567" w:hanging="567"/>
+        <w:rPr>
+          <w:spacing w:val="20"/>
+          <w:szCs w:val="20"/>
+        </w:rPr>
+      </w:pPr>
+      <w:r>
+        <w:rPr>
+          <w:rFonts w:hint="eastAsia"/>
+          <w:spacing w:val="20"/>
+          <w:szCs w:val="20"/>
+        </w:rPr>
+        <w:t xml:space="preserve"> </w:t>
+      </w:r>
+      <w:r>
+        <w:rPr>
+          <w:rFonts w:hint="eastAsia"/>
+          <w:spacing w:val="20"/>
+          <w:szCs w:val="20"/>
+        </w:rPr>
+        <w:t xml:space="preserve"> </w:t>
+      </w:r>
+      <w:r>
+        <w:rPr>
+          <w:rFonts w:hint="eastAsia"/>
+          <w:spacing w:val="20"/>
+          <w:szCs w:val="20"/>
+        </w:rPr>
+        <w:t xml:space="preserve"> </w:t>
+      </w:r>
+      <w:r>
+        <w:rPr>
+          <w:rFonts w:hint="eastAsia"/>
+          <w:spacing w:val="20"/>
+          <w:szCs w:val="20"/>
+        </w:rPr>
+        <w:t xml:space="preserve"> </w:t>
+      </w:r>
+      <w:r>
+        <w:rPr>
+          <w:rFonts w:ascii="Courier New" w:hAnsi="Courier New" w:cs="Courier New"/>
+          <w:spacing w:val="20"/>
+          <w:szCs w:val="20"/>
+        </w:rPr>
+        <w:t xml:space="preserve"> </w:t>
+      </w:r>
+      <w:r>
+        <w:rPr>
+          <w:rFonts w:hint="eastAsia"/>
+          <w:spacing w:val="20"/>
+          <w:szCs w:val="20"/>
+        </w:rPr>
+        <w:t xml:space="preserve"> </w:t>
+      </w:r>
+      <w:r>
+        <w:rPr>
+          <w:rFonts w:hint="eastAsia"/>
+          <w:spacing w:val="20"/>
+          <w:szCs w:val="20"/>
+        </w:rPr>
+        <w:t xml:space="preserve"> </w:t>
+      </w:r>
+      <w:r>
+        <w:rPr>
+          <w:rFonts w:hint="eastAsia"/>
+          <w:spacing w:val="20"/>
+          <w:szCs w:val="20"/>
+        </w:rPr>
+        <w:t xml:space="preserve"> </w:t>
+      </w:r>
+      <w:r>
+        <w:rPr>
+          <w:rFonts w:ascii="Courier New" w:hAnsi="Courier New" w:cs="Courier New"/>
+          <w:spacing w:val="20"/>
+          <w:szCs w:val="20"/>
+        </w:rPr>
+        <w:t xml:space="preserve"> </w:t>
+      </w:r>
+    </w:p>
+    <w:p>
+      <w:pPr>
+        <w:tabs>
+          <w:tab w:pos="567" w:val="left"/>
+          <w:tab w:pos="993" w:val="left"/>
+          <w:tab w:pos="1418" w:val="left"/>
+          <w:tab w:pos="1843" w:val="left"/>
+          <w:tab w:pos="2268" w:val="left"/>
+        </w:tabs>
+        <w:snapToGrid w:val="0"/>
+        <w:ind w:left="567" w:hanging="567"/>
+        <w:rPr>
+          <w:spacing w:val="20"/>
+          <w:szCs w:val="20"/>
+        </w:rPr>
+      </w:pPr>
+      <w:r>
+        <w:rPr>
+          <w:rFonts w:hint="eastAsia" w:ascii="新細明體" w:hAnsi="新細明體"/>
+          <w:spacing w:val="20"/>
+          <w:szCs w:val="20"/>
+        </w:rPr>
+        <w:tab/>
+      </w:r>
+      <w:r>
+        <w:rPr>
+          <w:rFonts w:hint="eastAsia" w:ascii="新細明體" w:hAnsi="新細明體"/>
+          <w:spacing w:val="20"/>
+          <w:szCs w:val="20"/>
+        </w:rPr>
+        <w:t>A</w:t>
+      </w:r>
+      <w:r>
+        <w:rPr>
+          <w:rFonts w:hint="eastAsia" w:ascii="新細明體" w:hAnsi="新細明體"/>
+          <w:spacing w:val="20"/>
+          <w:szCs w:val="20"/>
+        </w:rPr>
+        <w:t>.</w:t>
+      </w:r>
+      <w:r>
+        <w:rPr>
+          <w:rFonts w:hint="eastAsia" w:ascii="新細明體" w:hAnsi="新細明體"/>
+          <w:spacing w:val="20"/>
+          <w:szCs w:val="20"/>
+        </w:rPr>
+        <w:tab/>
+      </w:r>
       <w:r>
         <w:rPr>
           <w:rFonts w:ascii="新細明體" w:hAnsi="新細明體" w:cs="Courier New"/>
           <w:spacing w:val="20"/>
           <w:szCs w:val="20"/>
         </w:rPr>
+        <w:t>0</w:t>
+      </w:r>
+      <w:r>
+        <w:rPr>
+          <w:rFonts w:hint="eastAsia" w:ascii="新細明體" w:hAnsi="新細明體"/>
+          <w:spacing w:val="20"/>
+          <w:szCs w:val="20"/>
+        </w:rPr>
+        <w:t xml:space="preserve"> </w:t>
+      </w:r>
+      <w:r>
+        <w:rPr>
+          <w:rFonts w:hint="eastAsia" w:ascii="新細明體" w:hAnsi="新細明體"/>
+          <w:spacing w:val="20"/>
+          <w:szCs w:val="20"/>
+        </w:rPr>
+        <w:t xml:space="preserve"> </w:t>
+      </w:r>
+      <w:r>
+        <w:rPr>
+          <w:rFonts w:hint="eastAsia" w:ascii="新細明體" w:hAnsi="新細明體"/>
+          <w:spacing w:val="20"/>
+          <w:szCs w:val="20"/>
+        </w:rPr>
+        <w:t xml:space="preserve"> </w:t>
+      </w:r>
+      <w:r>
+        <w:rPr>
+          <w:rFonts w:ascii="新細明體" w:hAnsi="新細明體" w:cs="Courier New"/>
+          <w:spacing w:val="20"/>
+          <w:szCs w:val="20"/>
+        </w:rPr>
+        <w:t xml:space="preserve"> </w:t>
+      </w:r>
+    </w:p>
+    <w:p>
+      <w:pPr>
+        <w:tabs>
+          <w:tab w:pos="567" w:val="left"/>
+          <w:tab w:pos="993" w:val="left"/>
+          <w:tab w:pos="1418" w:val="left"/>
+          <w:tab w:pos="1843" w:val="left"/>
+          <w:tab w:pos="2268" w:val="left"/>
+        </w:tabs>
+        <w:snapToGrid w:val="0"/>
+        <w:ind w:left="567" w:hanging="567"/>
+        <w:rPr>
+          <w:spacing w:val="20"/>
+          <w:szCs w:val="20"/>
+        </w:rPr>
+      </w:pPr>
+      <w:r>
+        <w:rPr>
+          <w:rFonts w:hint="eastAsia" w:ascii="新細明體" w:hAnsi="新細明體"/>
+          <w:spacing w:val="20"/>
+          <w:szCs w:val="20"/>
+        </w:rPr>
+        <w:tab/>
+      </w:r>
+      <w:r>
+        <w:rPr>
+          <w:rFonts w:hint="eastAsia" w:ascii="新細明體" w:hAnsi="新細明體"/>
+          <w:spacing w:val="20"/>
+          <w:szCs w:val="20"/>
+        </w:rPr>
+        <w:t>B</w:t>
+      </w:r>
+      <w:r>
+        <w:rPr>
+          <w:rFonts w:hint="eastAsia" w:ascii="新細明體" w:hAnsi="新細明體"/>
+          <w:spacing w:val="20"/>
+          <w:szCs w:val="20"/>
+        </w:rPr>
+        <w:t>.</w:t>
+      </w:r>
+      <w:r>
+        <w:rPr>
+          <w:rFonts w:hint="eastAsia" w:ascii="新細明體" w:hAnsi="新細明體"/>
+          <w:spacing w:val="20"/>
+          <w:szCs w:val="20"/>
+        </w:rPr>
+        <w:tab/>
+      </w:r>
+      <w:r>
+        <w:rPr>
+          <w:rFonts w:ascii="新細明體" w:hAnsi="新細明體" w:cs="Courier New"/>
+          <w:spacing w:val="20"/>
+          <w:szCs w:val="20"/>
+        </w:rPr>
+        <w:t>5</w:t>
+      </w:r>
+      <w:r>
+        <w:rPr>
+          <w:rFonts w:hint="eastAsia" w:ascii="新細明體" w:hAnsi="新細明體"/>
+          <w:spacing w:val="20"/>
+          <w:szCs w:val="20"/>
+        </w:rPr>
+        <w:t xml:space="preserve"> </w:t>
+      </w:r>
+      <w:r>
+        <w:rPr>
+          <w:rFonts w:hint="eastAsia" w:ascii="新細明體" w:hAnsi="新細明體"/>
+          <w:spacing w:val="20"/>
+          <w:szCs w:val="20"/>
+        </w:rPr>
+        <w:t xml:space="preserve"> </w:t>
+      </w:r>
+      <w:r>
+        <w:rPr>
+          <w:rFonts w:hint="eastAsia" w:ascii="新細明體" w:hAnsi="新細明體"/>
+          <w:spacing w:val="20"/>
+          <w:szCs w:val="20"/>
+        </w:rPr>
+        <w:t xml:space="preserve"> </w:t>
+      </w:r>
+      <w:r>
+        <w:rPr>
+          <w:rFonts w:ascii="新細明體" w:hAnsi="新細明體" w:cs="Courier New"/>
+          <w:spacing w:val="20"/>
+          <w:szCs w:val="20"/>
+        </w:rPr>
+        <w:t xml:space="preserve"> </w:t>
+      </w:r>
+      <w:r>
+        <w:rPr>
+          <w:rFonts w:hint="eastAsia" w:ascii="新細明體" w:hAnsi="新細明體"/>
+          <w:spacing w:val="20"/>
+          <w:szCs w:val="20"/>
+        </w:rPr>
+        <w:t xml:space="preserve"> </w:t>
+      </w:r>
+      <w:r>
+        <w:rPr>
+          <w:rFonts w:hint="eastAsia" w:ascii="新細明體" w:hAnsi="新細明體"/>
+          <w:spacing w:val="20"/>
+          <w:szCs w:val="20"/>
+        </w:rPr>
+        <w:t xml:space="preserve"> </w:t>
+      </w:r>
+    </w:p>
+    <w:p>
+      <w:pPr>
+        <w:tabs>
+          <w:tab w:pos="567" w:val="left"/>
+          <w:tab w:pos="993" w:val="left"/>
+          <w:tab w:pos="1418" w:val="left"/>
+          <w:tab w:pos="1843" w:val="left"/>
+          <w:tab w:pos="2268" w:val="left"/>
+        </w:tabs>
+        <w:snapToGrid w:val="0"/>
+        <w:ind w:left="567" w:hanging="567"/>
+        <w:rPr>
+          <w:spacing w:val="20"/>
+          <w:szCs w:val="20"/>
+        </w:rPr>
+      </w:pPr>
+      <w:r>
+        <w:rPr>
+          <w:rFonts w:hint="eastAsia" w:ascii="新細明體" w:hAnsi="新細明體"/>
+          <w:spacing w:val="20"/>
+          <w:szCs w:val="20"/>
+        </w:rPr>
+        <w:tab/>
+      </w:r>
+      <w:r>
+        <w:rPr>
+          <w:rFonts w:hint="eastAsia" w:ascii="新細明體" w:hAnsi="新細明體"/>
+          <w:spacing w:val="20"/>
+          <w:szCs w:val="20"/>
+        </w:rPr>
+        <w:t>C</w:t>
+      </w:r>
+      <w:r>
+        <w:rPr>
+          <w:rFonts w:hint="eastAsia" w:ascii="新細明體" w:hAnsi="新細明體"/>
+          <w:spacing w:val="20"/>
+          <w:szCs w:val="20"/>
+        </w:rPr>
+        <w:t>.</w:t>
+      </w:r>
+      <w:r>
+        <w:rPr>
+          <w:rFonts w:hint="eastAsia" w:ascii="新細明體" w:hAnsi="新細明體"/>
+          <w:spacing w:val="20"/>
+          <w:szCs w:val="20"/>
+        </w:rPr>
+        <w:tab/>
+      </w:r>
+      <w:r>
+        <w:rPr>
+          <w:rFonts w:ascii="新細明體" w:hAnsi="新細明體" w:cs="Courier New"/>
+          <w:spacing w:val="20"/>
+          <w:szCs w:val="20"/>
+        </w:rPr>
+        <w:t>3</w:t>
+      </w:r>
+      <w:r>
+        <w:rPr>
+          <w:rFonts w:ascii="新細明體" w:hAnsi="新細明體" w:cs="Courier New"/>
+          <w:spacing w:val="20"/>
+          <w:szCs w:val="20"/>
+        </w:rPr>
+        <w:t xml:space="preserve"> </w:t>
+      </w:r>
+      <w:r>
+        <w:rPr>
+          <w:rFonts w:ascii="新細明體" w:hAnsi="新細明體" w:cs="Courier New"/>
+          <w:spacing w:val="20"/>
+          <w:szCs w:val="20"/>
+        </w:rPr>
+        <w:t xml:space="preserve"> </w:t>
+      </w:r>
+      <w:r>
+        <w:rPr>
+          <w:rFonts w:ascii="新細明體" w:hAnsi="新細明體" w:cs="Courier New"/>
+          <w:spacing w:val="20"/>
+          <w:szCs w:val="20"/>
+        </w:rPr>
+        <w:t xml:space="preserve"> </w:t>
+      </w:r>
+      <w:r>
+        <w:rPr>
+          <w:rFonts w:hint="eastAsia" w:ascii="新細明體" w:hAnsi="新細明體"/>
+          <w:spacing w:val="20"/>
+          <w:szCs w:val="20"/>
+        </w:rPr>
+        <w:t xml:space="preserve"> </w:t>
+      </w:r>
+      <w:r>
+        <w:rPr>
+          <w:rFonts w:hint="eastAsia" w:ascii="新細明體" w:hAnsi="新細明體"/>
+          <w:spacing w:val="20"/>
+          <w:szCs w:val="20"/>
+        </w:rPr>
+        <w:t xml:space="preserve"> </w:t>
+      </w:r>
+      <w:r>
+        <w:rPr>
+          <w:rFonts w:hint="eastAsia" w:ascii="新細明體" w:hAnsi="新細明體"/>
+          <w:spacing w:val="20"/>
+          <w:szCs w:val="20"/>
+        </w:rPr>
+        <w:t xml:space="preserve"> </w:t>
+      </w:r>
+      <w:r>
+        <w:rPr>
+          <w:rFonts w:ascii="新細明體" w:hAnsi="新細明體" w:cs="Courier New"/>
+          <w:spacing w:val="20"/>
+          <w:szCs w:val="20"/>
+        </w:rPr>
+        <w:t xml:space="preserve"> </w:t>
+      </w:r>
+      <w:r>
+        <w:rPr>
+          <w:rFonts w:ascii="新細明體" w:hAnsi="新細明體" w:cs="Courier New"/>
+          <w:spacing w:val="20"/>
+          <w:szCs w:val="20"/>
+        </w:rPr>
+        <w:t xml:space="preserve"> </w:t>
+      </w:r>
+      <w:r>
+        <w:rPr>
+          <w:rFonts w:ascii="新細明體" w:hAnsi="新細明體" w:cs="Courier New"/>
+          <w:spacing w:val="20"/>
+          <w:szCs w:val="20"/>
+        </w:rPr>
+        <w:t xml:space="preserve"> </w:t>
+      </w:r>
+      <w:r>
+        <w:rPr>
+          <w:rFonts w:hint="eastAsia" w:ascii="新細明體" w:hAnsi="新細明體"/>
+          <w:spacing w:val="20"/>
+          <w:szCs w:val="20"/>
+        </w:rPr>
+        <w:t xml:space="preserve"> </w:t>
+      </w:r>
+      <w:r>
+        <w:rPr>
+          <w:rFonts w:hint="eastAsia" w:ascii="新細明體" w:hAnsi="新細明體"/>
+          <w:spacing w:val="20"/>
+          <w:szCs w:val="20"/>
+        </w:rPr>
+        <w:t xml:space="preserve"> </w:t>
+      </w:r>
+    </w:p>
+    <w:p>
+      <w:pPr>
+        <w:tabs>
+          <w:tab w:pos="567" w:val="left"/>
+          <w:tab w:pos="993" w:val="left"/>
+          <w:tab w:pos="1418" w:val="left"/>
+          <w:tab w:pos="1843" w:val="left"/>
+          <w:tab w:pos="2268" w:val="left"/>
+        </w:tabs>
+        <w:snapToGrid w:val="0"/>
+        <w:ind w:left="567" w:hanging="567"/>
+        <w:rPr>
+          <w:spacing w:val="20"/>
+          <w:szCs w:val="20"/>
+        </w:rPr>
+      </w:pPr>
+      <w:r>
+        <w:rPr>
+          <w:rFonts w:ascii="新細明體" w:hAnsi="新細明體"/>
+        </w:rPr>
+        <w:tab/>
+        <w:t>D.</w:t>
+        <w:tab/>
+        <w:t>1</w:t>
+      </w:r>
+    </w:p>
+    <w:p>
+      <w:pPr>
+        <w:pStyle w:val="af3"/>
+        <w:tabs>
+          <w:tab w:pos="567" w:val="left"/>
+          <w:tab w:pos="993" w:val="left"/>
+          <w:tab w:pos="1418" w:val="left"/>
+          <w:tab w:pos="1843" w:val="left"/>
+          <w:tab w:pos="2268" w:val="left"/>
+        </w:tabs>
+        <w:snapToGrid w:val="0"/>
+        <w:ind w:left="567" w:hanging="567"/>
+        <w:rPr>
+          <w:spacing w:val="20"/>
+          <w:szCs w:val="20"/>
+        </w:rPr>
+      </w:pPr>
+      <w:r>
+        <w:rPr>
+          <w:rFonts w:ascii="新細明體" w:hAnsi="新細明體"/>
+        </w:rPr>
+        <w:t>考慮以下偽代碼：</w:t>
+      </w:r>
+    </w:p>
+    <w:p>
+      <w:pPr>
+        <w:numPr>
+          <w:ilvl w:val="0"/>
+          <w:numId w:val="2"/>
+        </w:numPr>
+        <w:tabs>
+          <w:tab w:pos="567" w:val="left"/>
+          <w:tab w:pos="993" w:val="left"/>
+          <w:tab w:pos="1418" w:val="left"/>
+          <w:tab w:pos="1843" w:val="left"/>
+          <w:tab w:pos="2268" w:val="left"/>
+        </w:tabs>
+        <w:snapToGrid w:val="0"/>
+        <w:spacing w:before="120"/>
+        <w:ind w:leftChars="0" w:left="567" w:hanging="567"/>
+        <w:rPr>
+          <w:spacing w:val="20"/>
+          <w:szCs w:val="20"/>
+        </w:rPr>
+      </w:pPr>
+      <w:r>
+        <w:rPr>
+          <w:rFonts w:hint="eastAsia" w:ascii="Courier New" w:hAnsi="Courier New"/>
+          <w:spacing w:val="20"/>
+          <w:szCs w:val="20"/>
+        </w:rPr>
+        <w:tab/>
+        <w:t>x ← 2</w:t>
+      </w:r>
+    </w:p>
+    <w:p>
+      <w:pPr>
+        <w:tabs>
+          <w:tab w:pos="567" w:val="left"/>
+          <w:tab w:pos="993" w:val="left"/>
+          <w:tab w:pos="1418" w:val="left"/>
+          <w:tab w:pos="1843" w:val="left"/>
+          <w:tab w:pos="2268" w:val="left"/>
+        </w:tabs>
+        <w:snapToGrid w:val="0"/>
+        <w:ind w:left="567" w:hanging="567"/>
+        <w:rPr>
+          <w:spacing w:val="20"/>
+          <w:szCs w:val="20"/>
+        </w:rPr>
+      </w:pPr>
+      <w:r>
+        <w:rPr>
+          <w:rFonts w:ascii="Courier New" w:hAnsi="Courier New"/>
+        </w:rPr>
+        <w:tab/>
+        <w:t>y ← x + 3</w:t>
+      </w:r>
+    </w:p>
+    <w:p>
+      <w:pPr>
+        <w:tabs>
+          <w:tab w:pos="567" w:val="left"/>
+          <w:tab w:pos="993" w:val="left"/>
+          <w:tab w:pos="1418" w:val="left"/>
+          <w:tab w:pos="1843" w:val="left"/>
+          <w:tab w:pos="2268" w:val="left"/>
+        </w:tabs>
+        <w:snapToGrid w:val="0"/>
+        <w:ind w:left="567" w:hanging="567"/>
+        <w:rPr>
+          <w:rFonts w:ascii="Courier New" w:hAnsi="Courier New" w:cs="Courier New"/>
+          <w:spacing w:val="20"/>
+          <w:szCs w:val="20"/>
+        </w:rPr>
+      </w:pPr>
+      <w:r>
+        <w:rPr>
+          <w:rFonts w:ascii="Courier New" w:hAnsi="Courier New"/>
+        </w:rPr>
+        <w:tab/>
+        <w:t>x ← x + 1</w:t>
+      </w:r>
+    </w:p>
+    <w:p>
+      <w:pPr>
+        <w:tabs>
+          <w:tab w:pos="567" w:val="left"/>
+          <w:tab w:pos="993" w:val="left"/>
+          <w:tab w:pos="1418" w:val="left"/>
+          <w:tab w:pos="1843" w:val="left"/>
+          <w:tab w:pos="2268" w:val="left"/>
+        </w:tabs>
+        <w:snapToGrid w:val="0"/>
+        <w:spacing w:after="120"/>
+        <w:ind w:left="567" w:hanging="567"/>
+        <w:rPr>
+          <w:spacing w:val="20"/>
+          <w:szCs w:val="20"/>
+        </w:rPr>
+      </w:pPr>
+      <w:r>
+        <w:rPr>
+          <w:rFonts w:ascii="Courier New" w:hAnsi="Courier New"/>
+          <w:spacing w:val="20"/>
+          <w:szCs w:val="20"/>
+        </w:rPr>
+        <w:tab/>
+      </w:r>
+      <w:r>
+        <w:rPr>
+          <w:rFonts w:ascii="Courier New" w:hAnsi="Courier New"/>
+          <w:spacing w:val="20"/>
+          <w:szCs w:val="20"/>
+        </w:rPr>
         <w:t>輸</w:t>
       </w:r>
       <w:r>
         <w:rPr>
-          <w:rFonts w:ascii="新細明體" w:hAnsi="新細明體" w:cs="Courier New"/>
+          <w:rFonts w:hint="eastAsia" w:ascii="Courier New" w:hAnsi="Courier New"/>
           <w:spacing w:val="20"/>
           <w:szCs w:val="20"/>
         </w:rPr>
@@ -11164,15 +11827,16 @@
       </w:r>
       <w:r>
         <w:rPr>
-          <w:rFonts w:ascii="新細明體" w:hAnsi="新細明體" w:cs="Courier New"/>
-          <w:spacing w:val="20"/>
-          <w:szCs w:val="20"/>
-        </w:rPr>
-        <w:t>是？</w:t>
-      </w:r>
-    </w:p>
-    <w:p>
-      <w:pPr>
+          <w:rFonts w:hint="eastAsia" w:ascii="Courier New" w:hAnsi="Courier New"/>
+          <w:spacing w:val="20"/>
+          <w:szCs w:val="20"/>
+        </w:rPr>
+        <w:t xml:space="preserve"> y</w:t>
+      </w:r>
+    </w:p>
+    <w:p>
+      <w:pPr>
+        <w:pStyle w:val="af3"/>
         <w:tabs>
           <w:tab w:pos="567" w:val="left"/>
           <w:tab w:pos="993" w:val="left"/>
@@ -11183,34 +11847,41 @@
         <w:snapToGrid w:val="0"/>
         <w:ind w:left="567" w:hanging="567"/>
         <w:rPr>
-          <w:rFonts w:ascii="Courier New" w:hAnsi="Courier New" w:cs="Courier New"/>
-          <w:spacing w:val="20"/>
-          <w:szCs w:val="20"/>
-        </w:rPr>
-      </w:pPr>
-      <w:r>
-        <w:rPr>
-          <w:rFonts w:ascii="Courier New" w:hAnsi="Courier New" w:cs="Courier New"/>
-          <w:spacing w:val="20"/>
-          <w:szCs w:val="20"/>
-        </w:rPr>
-        <w:t xml:space="preserve"> </w:t>
-      </w:r>
-      <w:r>
-        <w:rPr>
-          <w:rFonts w:ascii="Courier New" w:hAnsi="Courier New" w:cs="Courier New"/>
-          <w:spacing w:val="20"/>
-          <w:szCs w:val="20"/>
-        </w:rPr>
-        <w:t xml:space="preserve"> </w:t>
-      </w:r>
-      <w:r>
-        <w:rPr>
-          <w:rFonts w:ascii="Courier New" w:hAnsi="Courier New" w:cs="Courier New"/>
-          <w:spacing w:val="20"/>
-          <w:szCs w:val="20"/>
-        </w:rPr>
-        <w:t xml:space="preserve"> </w:t>
+          <w:spacing w:val="20"/>
+          <w:szCs w:val="20"/>
+        </w:rPr>
+      </w:pPr>
+      <w:r>
+        <w:rPr>
+          <w:rFonts w:hint="eastAsia" w:ascii="新細明體" w:hAnsi="新細明體"/>
+          <w:spacing w:val="20"/>
+          <w:szCs w:val="20"/>
+        </w:rPr>
+        <w:t>輸</w:t>
+      </w:r>
+      <w:r>
+        <w:rPr>
+          <w:rFonts w:hint="eastAsia" w:ascii="新細明體" w:hAnsi="新細明體"/>
+          <w:spacing w:val="20"/>
+          <w:szCs w:val="20"/>
+        </w:rPr>
+        <w:t>出</w:t>
+      </w:r>
+      <w:r>
+        <w:rPr>
+          <w:rFonts w:hint="eastAsia" w:ascii="新細明體" w:hAnsi="新細明體"/>
+          <w:spacing w:val="20"/>
+          <w:szCs w:val="20"/>
+        </w:rPr>
+        <w:t>是</w:t>
+      </w:r>
+      <w:r>
+        <w:rPr>
+          <w:rFonts w:hint="eastAsia" w:ascii="新細明體" w:hAnsi="新細明體"/>
+          <w:spacing w:val="20"/>
+          <w:szCs w:val="20"/>
+        </w:rPr>
+        <w:t>？</w:t>
       </w:r>
     </w:p>
     <w:p>
@@ -11231,12 +11902,96 @@
       </w:pPr>
       <w:r>
         <w:rPr>
+          <w:rFonts w:hint="eastAsia"/>
+          <w:spacing w:val="20"/>
+          <w:szCs w:val="20"/>
+        </w:rPr>
+        <w:t xml:space="preserve"> </w:t>
+      </w:r>
+      <w:r>
+        <w:rPr>
+          <w:rFonts w:hint="eastAsia"/>
+          <w:spacing w:val="20"/>
+          <w:szCs w:val="20"/>
+        </w:rPr>
+        <w:t xml:space="preserve"> </w:t>
+      </w:r>
+      <w:r>
+        <w:rPr>
+          <w:rFonts w:hint="eastAsia"/>
+          <w:spacing w:val="20"/>
+          <w:szCs w:val="20"/>
+        </w:rPr>
+        <w:t xml:space="preserve"> </w:t>
+      </w:r>
+    </w:p>
+    <w:p>
+      <w:pPr>
+        <w:tabs>
+          <w:tab w:pos="567" w:val="left"/>
+          <w:tab w:pos="993" w:val="left"/>
+          <w:tab w:pos="1418" w:val="left"/>
+          <w:tab w:pos="1843" w:val="left"/>
+          <w:tab w:pos="2268" w:val="left"/>
+        </w:tabs>
+        <w:snapToGrid w:val="0"/>
+        <w:ind w:left="567" w:hanging="567"/>
+        <w:rPr>
+          <w:spacing w:val="20"/>
+          <w:szCs w:val="20"/>
+        </w:rPr>
+      </w:pPr>
+      <w:r>
+        <w:rPr>
+          <w:rFonts w:hint="eastAsia" w:ascii="新細明體" w:hAnsi="新細明體"/>
+          <w:spacing w:val="20"/>
+          <w:szCs w:val="20"/>
+        </w:rPr>
+        <w:tab/>
+      </w:r>
+      <w:r>
+        <w:rPr>
+          <w:rFonts w:hint="eastAsia" w:ascii="新細明體" w:hAnsi="新細明體"/>
+          <w:spacing w:val="20"/>
+          <w:szCs w:val="20"/>
+        </w:rPr>
+        <w:t>A</w:t>
+      </w:r>
+      <w:r>
+        <w:rPr>
+          <w:rFonts w:hint="eastAsia" w:ascii="新細明體" w:hAnsi="新細明體"/>
+          <w:spacing w:val="20"/>
+          <w:szCs w:val="20"/>
+        </w:rPr>
+        <w:t>.</w:t>
+        <w:tab/>
+        <w:t>6</w:t>
+      </w:r>
+    </w:p>
+    <w:p>
+      <w:pPr>
+        <w:tabs>
+          <w:tab w:pos="567" w:val="left"/>
+          <w:tab w:pos="993" w:val="left"/>
+          <w:tab w:pos="1418" w:val="left"/>
+          <w:tab w:pos="1843" w:val="left"/>
+          <w:tab w:pos="2268" w:val="left"/>
+        </w:tabs>
+        <w:snapToGrid w:val="0"/>
+        <w:ind w:left="567" w:hanging="567"/>
+        <w:rPr>
+          <w:spacing w:val="20"/>
+          <w:szCs w:val="20"/>
+        </w:rPr>
+      </w:pPr>
+      <w:r>
+        <w:rPr>
           <w:rFonts w:ascii="新細明體" w:hAnsi="新細明體"/>
         </w:rPr>
         <w:tab/>
-        <w:t>A.</w:t>
-        <w:tab/>
-        <w:t>0</w:t>
+        <w:t>B.</w:t>
+        <w:tab/>
+        <w:t>2</w:t>
       </w:r>
     </w:p>
     <w:p>
@@ -11257,19 +12012,49 @@
       </w:pPr>
       <w:r>
         <w:rPr>
-          <w:rFonts w:hint="eastAsia" w:ascii="新細明體" w:hAnsi="新細明體"/>
-          <w:spacing w:val="20"/>
-          <w:szCs w:val="20"/>
-        </w:rPr>
-        <w:tab/>
-      </w:r>
-      <w:r>
-        <w:rPr>
-          <w:rFonts w:hint="eastAsia" w:ascii="新細明體" w:hAnsi="新細明體"/>
-          <w:spacing w:val="20"/>
-          <w:szCs w:val="20"/>
-        </w:rPr>
-        <w:t>B</w:t>
+          <w:rFonts w:ascii="新細明體" w:hAnsi="新細明體"/>
+        </w:rPr>
+        <w:tab/>
+        <w:t>C.</w:t>
+        <w:tab/>
+        <w:t>5</w:t>
+      </w:r>
+    </w:p>
+    <w:p>
+      <w:pPr>
+        <w:numPr>
+          <w:ilvl w:val="0"/>
+          <w:numId w:val="2"/>
+        </w:numPr>
+        <w:tabs>
+          <w:tab w:pos="567" w:val="left"/>
+          <w:tab w:pos="993" w:val="left"/>
+          <w:tab w:pos="1418" w:val="left"/>
+          <w:tab w:pos="1843" w:val="left"/>
+          <w:tab w:pos="2268" w:val="left"/>
+        </w:tabs>
+        <w:snapToGrid w:val="0"/>
+        <w:ind w:leftChars="0" w:left="567" w:hanging="567"/>
+        <w:rPr>
+          <w:spacing w:val="20"/>
+          <w:szCs w:val="20"/>
+        </w:rPr>
+      </w:pPr>
+      <w:r>
+        <w:rPr>
+          <w:rFonts w:hint="eastAsia" w:ascii="新細明體" w:hAnsi="新細明體"/>
+          <w:spacing w:val="20"/>
+          <w:szCs w:val="20"/>
+        </w:rPr>
+        <w:tab/>
+      </w:r>
+      <w:r>
+        <w:rPr>
+          <w:rFonts w:hint="eastAsia" w:ascii="新細明體" w:hAnsi="新細明體"/>
+          <w:spacing w:val="20"/>
+          <w:szCs w:val="20"/>
+        </w:rPr>
+        <w:t>D</w:t>
       </w:r>
       <w:r>
         <w:rPr>
@@ -11278,58 +12063,13 @@
           <w:szCs w:val="20"/>
         </w:rPr>
         <w:t>.</w:t>
-      </w:r>
-      <w:r>
-        <w:rPr>
-          <w:rFonts w:hint="eastAsia" w:ascii="新細明體" w:hAnsi="新細明體"/>
-          <w:spacing w:val="20"/>
-          <w:szCs w:val="20"/>
-        </w:rPr>
-        <w:tab/>
-      </w:r>
-      <w:r>
-        <w:rPr>
-          <w:rFonts w:ascii="新細明體" w:hAnsi="新細明體" w:cs="Courier New"/>
-          <w:spacing w:val="20"/>
-          <w:szCs w:val="20"/>
-        </w:rPr>
-        <w:t>5</w:t>
-      </w:r>
-      <w:r>
-        <w:rPr>
-          <w:rFonts w:hint="eastAsia" w:ascii="新細明體" w:hAnsi="新細明體"/>
-          <w:spacing w:val="20"/>
-          <w:szCs w:val="20"/>
-        </w:rPr>
-        <w:t xml:space="preserve"> </w:t>
-      </w:r>
-      <w:r>
-        <w:rPr>
-          <w:rFonts w:hint="eastAsia" w:ascii="新細明體" w:hAnsi="新細明體"/>
-          <w:spacing w:val="20"/>
-          <w:szCs w:val="20"/>
-        </w:rPr>
-        <w:t xml:space="preserve"> </w:t>
-      </w:r>
-      <w:r>
-        <w:rPr>
-          <w:rFonts w:hint="eastAsia" w:ascii="新細明體" w:hAnsi="新細明體"/>
-          <w:spacing w:val="20"/>
-          <w:szCs w:val="20"/>
-        </w:rPr>
-        <w:t xml:space="preserve"> </w:t>
-      </w:r>
-      <w:r>
-        <w:rPr>
-          <w:rFonts w:ascii="新細明體" w:hAnsi="新細明體" w:cs="Courier New"/>
-          <w:spacing w:val="20"/>
-          <w:szCs w:val="20"/>
-        </w:rPr>
-        <w:t xml:space="preserve"> </w:t>
-      </w:r>
-    </w:p>
-    <w:p>
-      <w:pPr>
+        <w:tab/>
+        <w:t>3</w:t>
+      </w:r>
+    </w:p>
+    <w:p>
+      <w:pPr>
+        <w:pStyle w:val="af3"/>
         <w:tabs>
           <w:tab w:pos="567" w:val="left"/>
           <w:tab w:pos="993" w:val="left"/>
@@ -11346,19 +12086,167 @@
       </w:pPr>
       <w:r>
         <w:rPr>
-          <w:rFonts w:hint="eastAsia" w:ascii="新細明體" w:hAnsi="新細明體"/>
-          <w:spacing w:val="20"/>
-          <w:szCs w:val="20"/>
-        </w:rPr>
-        <w:tab/>
-      </w:r>
-      <w:r>
-        <w:rPr>
-          <w:rFonts w:hint="eastAsia" w:ascii="新細明體" w:hAnsi="新細明體"/>
-          <w:spacing w:val="20"/>
-          <w:szCs w:val="20"/>
-        </w:rPr>
-        <w:t>C</w:t>
+          <w:rFonts w:ascii="新細明體" w:hAnsi="新細明體"/>
+        </w:rPr>
+        <w:t>考慮以下偽代碼：</w:t>
+      </w:r>
+    </w:p>
+    <w:p>
+      <w:pPr>
+        <w:tabs>
+          <w:tab w:pos="567" w:val="left"/>
+          <w:tab w:pos="993" w:val="left"/>
+          <w:tab w:pos="1418" w:val="left"/>
+          <w:tab w:pos="1843" w:val="left"/>
+          <w:tab w:pos="2268" w:val="left"/>
+        </w:tabs>
+        <w:snapToGrid w:val="0"/>
+        <w:spacing w:before="120" w:after="120"/>
+        <w:ind w:left="567" w:hanging="567"/>
+        <w:rPr>
+          <w:spacing w:val="20"/>
+          <w:szCs w:val="20"/>
+        </w:rPr>
+      </w:pPr>
+      <w:r>
+        <w:rPr>
+          <w:rFonts w:hint="eastAsia" w:ascii="Courier New" w:hAnsi="Courier New"/>
+          <w:spacing w:val="20"/>
+          <w:szCs w:val="20"/>
+        </w:rPr>
+        <w:tab/>
+      </w:r>
+      <w:r>
+        <w:rPr>
+          <w:rFonts w:hint="eastAsia" w:ascii="Courier New" w:hAnsi="Courier New"/>
+          <w:spacing w:val="20"/>
+          <w:szCs w:val="20"/>
+        </w:rPr>
+        <w:t>若</w:t>
+      </w:r>
+      <w:r>
+        <w:rPr>
+          <w:rFonts w:hint="eastAsia" w:ascii="Courier New" w:hAnsi="Courier New"/>
+          <w:spacing w:val="20"/>
+          <w:szCs w:val="20"/>
+        </w:rPr>
+        <w:t xml:space="preserve"> (score ≥ 60) 且 (score ≤ 100) 則 grade ←「合格」，否則 grade ←「不合格」</w:t>
+      </w:r>
+    </w:p>
+    <w:p>
+      <w:pPr>
+        <w:pStyle w:val="af3"/>
+        <w:tabs>
+          <w:tab w:pos="567" w:val="left"/>
+          <w:tab w:pos="993" w:val="left"/>
+          <w:tab w:pos="1418" w:val="left"/>
+          <w:tab w:pos="1843" w:val="left"/>
+          <w:tab w:pos="2268" w:val="left"/>
+        </w:tabs>
+        <w:snapToGrid w:val="0"/>
+        <w:ind w:left="567" w:hanging="567"/>
+        <w:rPr>
+          <w:spacing w:val="20"/>
+          <w:szCs w:val="20"/>
+        </w:rPr>
+      </w:pPr>
+      <w:r>
+        <w:rPr>
+          <w:rFonts w:hint="eastAsia" w:ascii="新細明體" w:hAnsi="新細明體"/>
+          <w:spacing w:val="20"/>
+          <w:szCs w:val="20"/>
+        </w:rPr>
+        <w:t>若</w:t>
+      </w:r>
+      <w:r>
+        <w:rPr>
+          <w:rFonts w:hint="eastAsia" w:ascii="新細明體" w:hAnsi="新細明體"/>
+          <w:spacing w:val="20"/>
+          <w:szCs w:val="20"/>
+        </w:rPr>
+        <w:t xml:space="preserve"> </w:t>
+      </w:r>
+      <w:r>
+        <w:rPr>
+          <w:rFonts w:hint="eastAsia" w:ascii="新細明體" w:hAnsi="新細明體"/>
+          <w:spacing w:val="20"/>
+          <w:szCs w:val="20"/>
+        </w:rPr>
+        <w:t>score = 60，grade 是？</w:t>
+      </w:r>
+    </w:p>
+    <w:p>
+      <w:pPr>
+        <w:tabs>
+          <w:tab w:pos="567" w:val="left"/>
+          <w:tab w:pos="993" w:val="left"/>
+          <w:tab w:pos="1418" w:val="left"/>
+          <w:tab w:pos="1843" w:val="left"/>
+          <w:tab w:pos="2268" w:val="left"/>
+        </w:tabs>
+        <w:snapToGrid w:val="0"/>
+        <w:ind w:left="567" w:hanging="567"/>
+        <w:rPr>
+          <w:spacing w:val="20"/>
+          <w:szCs w:val="20"/>
+        </w:rPr>
+      </w:pPr>
+      <w:r>
+        <w:rPr>
+          <w:rFonts w:hint="eastAsia"/>
+          <w:spacing w:val="20"/>
+          <w:szCs w:val="20"/>
+        </w:rPr>
+        <w:t xml:space="preserve"> </w:t>
+      </w:r>
+      <w:r>
+        <w:rPr>
+          <w:rFonts w:hint="eastAsia"/>
+          <w:spacing w:val="20"/>
+          <w:szCs w:val="20"/>
+        </w:rPr>
+        <w:t xml:space="preserve"> </w:t>
+      </w:r>
+      <w:r>
+        <w:rPr>
+          <w:rFonts w:hint="eastAsia"/>
+          <w:spacing w:val="20"/>
+          <w:szCs w:val="20"/>
+        </w:rPr>
+        <w:t xml:space="preserve"> </w:t>
+      </w:r>
+    </w:p>
+    <w:p>
+      <w:pPr>
+        <w:tabs>
+          <w:tab w:pos="567" w:val="left"/>
+          <w:tab w:pos="993" w:val="left"/>
+          <w:tab w:pos="1418" w:val="left"/>
+          <w:tab w:pos="1843" w:val="left"/>
+          <w:tab w:pos="2268" w:val="left"/>
+        </w:tabs>
+        <w:snapToGrid w:val="0"/>
+        <w:ind w:left="567" w:hanging="567"/>
+        <w:rPr>
+          <w:spacing w:val="20"/>
+          <w:szCs w:val="20"/>
+        </w:rPr>
+      </w:pPr>
+      <w:r>
+        <w:rPr>
+          <w:rFonts w:hint="eastAsia" w:ascii="新細明體" w:hAnsi="新細明體"/>
+          <w:spacing w:val="20"/>
+          <w:szCs w:val="20"/>
+        </w:rPr>
+        <w:tab/>
+      </w:r>
+      <w:r>
+        <w:rPr>
+          <w:rFonts w:hint="eastAsia" w:ascii="新細明體" w:hAnsi="新細明體"/>
+          <w:spacing w:val="20"/>
+          <w:szCs w:val="20"/>
+        </w:rPr>
+        <w:t>A</w:t>
       </w:r>
       <w:r>
         <w:rPr>
@@ -11367,54 +12255,8 @@
           <w:szCs w:val="20"/>
         </w:rPr>
         <w:t>.</w:t>
-      </w:r>
-      <w:r>
-        <w:rPr>
-          <w:rFonts w:hint="eastAsia" w:ascii="新細明體" w:hAnsi="新細明體"/>
-          <w:spacing w:val="20"/>
-          <w:szCs w:val="20"/>
-        </w:rPr>
-        <w:tab/>
-      </w:r>
-      <w:r>
-        <w:rPr>
-          <w:rFonts w:ascii="新細明體" w:hAnsi="新細明體" w:cs="Courier New"/>
-          <w:spacing w:val="20"/>
-          <w:szCs w:val="20"/>
-        </w:rPr>
-        <w:t>3</w:t>
-      </w:r>
-      <w:r>
-        <w:rPr>
-          <w:rFonts w:hint="eastAsia" w:ascii="新細明體" w:hAnsi="新細明體"/>
-          <w:spacing w:val="20"/>
-          <w:szCs w:val="20"/>
-        </w:rPr>
-        <w:t xml:space="preserve"> </w:t>
-      </w:r>
-      <w:r>
-        <w:rPr>
-          <w:rFonts w:hint="eastAsia" w:ascii="新細明體" w:hAnsi="新細明體"/>
-          <w:spacing w:val="20"/>
-          <w:szCs w:val="20"/>
-        </w:rPr>
-        <w:t xml:space="preserve"> </w:t>
-      </w:r>
-      <w:r>
-        <w:rPr>
-          <w:rFonts w:hint="eastAsia" w:ascii="新細明體" w:hAnsi="新細明體"/>
-          <w:spacing w:val="20"/>
-          <w:szCs w:val="20"/>
-        </w:rPr>
-        <w:t xml:space="preserve"> </w:t>
-      </w:r>
-      <w:r>
-        <w:rPr>
-          <w:rFonts w:ascii="新細明體" w:hAnsi="新細明體" w:cs="Courier New"/>
-          <w:spacing w:val="20"/>
-          <w:szCs w:val="20"/>
-        </w:rPr>
-        <w:t xml:space="preserve"> </w:t>
+        <w:tab/>
+        <w:t>不合格</w:t>
       </w:r>
     </w:p>
     <w:p>
@@ -11435,104 +12277,24 @@
       </w:pPr>
       <w:r>
         <w:rPr>
-          <w:rFonts w:hint="eastAsia" w:ascii="新細明體" w:hAnsi="新細明體"/>
-          <w:spacing w:val="20"/>
-          <w:szCs w:val="20"/>
-        </w:rPr>
-        <w:tab/>
-      </w:r>
-      <w:r>
-        <w:rPr>
-          <w:rFonts w:hint="eastAsia" w:ascii="新細明體" w:hAnsi="新細明體"/>
-          <w:spacing w:val="20"/>
-          <w:szCs w:val="20"/>
-        </w:rPr>
-        <w:t>D</w:t>
-      </w:r>
-      <w:r>
-        <w:rPr>
-          <w:rFonts w:hint="eastAsia" w:ascii="新細明體" w:hAnsi="新細明體"/>
-          <w:spacing w:val="20"/>
-          <w:szCs w:val="20"/>
-        </w:rPr>
-        <w:t>.</w:t>
-      </w:r>
-      <w:r>
-        <w:rPr>
-          <w:rFonts w:hint="eastAsia" w:ascii="新細明體" w:hAnsi="新細明體"/>
-          <w:spacing w:val="20"/>
-          <w:szCs w:val="20"/>
-        </w:rPr>
-        <w:tab/>
-      </w:r>
-      <w:r>
-        <w:rPr>
-          <w:rFonts w:ascii="新細明體" w:hAnsi="新細明體" w:cs="Courier New"/>
-          <w:spacing w:val="20"/>
-          <w:szCs w:val="20"/>
-        </w:rPr>
-        <w:t>1</w:t>
-      </w:r>
-      <w:r>
-        <w:rPr>
-          <w:rFonts w:hint="eastAsia" w:ascii="新細明體" w:hAnsi="新細明體"/>
-          <w:spacing w:val="20"/>
-          <w:szCs w:val="20"/>
-        </w:rPr>
-        <w:t xml:space="preserve"> </w:t>
-      </w:r>
-      <w:r>
-        <w:rPr>
-          <w:rFonts w:hint="eastAsia" w:ascii="新細明體" w:hAnsi="新細明體"/>
-          <w:spacing w:val="20"/>
-          <w:szCs w:val="20"/>
-        </w:rPr>
-        <w:t xml:space="preserve"> </w:t>
-      </w:r>
-      <w:r>
-        <w:rPr>
-          <w:rFonts w:hint="eastAsia" w:ascii="新細明體" w:hAnsi="新細明體"/>
-          <w:spacing w:val="20"/>
-          <w:szCs w:val="20"/>
-        </w:rPr>
-        <w:t xml:space="preserve"> </w:t>
-      </w:r>
-      <w:r>
-        <w:rPr>
-          <w:rFonts w:ascii="新細明體" w:hAnsi="新細明體" w:cs="Courier New"/>
-          <w:spacing w:val="20"/>
-          <w:szCs w:val="20"/>
-        </w:rPr>
-        <w:t xml:space="preserve"> </w:t>
-      </w:r>
-      <w:r>
-        <w:rPr>
-          <w:rFonts w:hint="eastAsia" w:ascii="新細明體" w:hAnsi="新細明體"/>
-          <w:spacing w:val="20"/>
-          <w:szCs w:val="20"/>
-        </w:rPr>
-        <w:t xml:space="preserve"> </w:t>
-      </w:r>
-      <w:r>
-        <w:rPr>
-          <w:rFonts w:hint="eastAsia" w:ascii="新細明體" w:hAnsi="新細明體"/>
-          <w:spacing w:val="20"/>
-          <w:szCs w:val="20"/>
-        </w:rPr>
-        <w:t xml:space="preserve"> </w:t>
-      </w:r>
-    </w:p>
-    <w:p>
-      <w:pPr>
-        <w:tabs>
-          <w:tab w:pos="567" w:val="left"/>
-          <w:tab w:pos="993" w:val="left"/>
-          <w:tab w:pos="1418" w:val="left"/>
-          <w:tab w:pos="1843" w:val="left"/>
-          <w:tab w:pos="2268" w:val="left"/>
-        </w:tabs>
-        <w:snapToGrid w:val="0"/>
-        <w:spacing w:before="0" w:after="0" w:lineRule="exact" w:line="20"/>
+          <w:rFonts w:ascii="新細明體" w:hAnsi="新細明體"/>
+        </w:rPr>
+        <w:tab/>
+        <w:t>B.</w:t>
+        <w:tab/>
+        <w:t>合格</w:t>
+      </w:r>
+    </w:p>
+    <w:p>
+      <w:pPr>
+        <w:tabs>
+          <w:tab w:pos="567" w:val="left"/>
+          <w:tab w:pos="993" w:val="left"/>
+          <w:tab w:pos="1418" w:val="left"/>
+          <w:tab w:pos="1843" w:val="left"/>
+          <w:tab w:pos="2268" w:val="left"/>
+        </w:tabs>
+        <w:snapToGrid w:val="0"/>
         <w:ind w:left="567" w:hanging="567"/>
         <w:rPr>
           <w:spacing w:val="20"/>
@@ -11541,166 +12303,41 @@
       </w:pPr>
       <w:r>
         <w:rPr>
-          <w:rFonts w:hint="eastAsia"/>
-          <w:spacing w:val="20"/>
-          <w:szCs w:val="20"/>
-        </w:rPr>
-        <w:t xml:space="preserve"> </w:t>
-      </w:r>
-      <w:r>
-        <w:rPr>
-          <w:rFonts w:hint="eastAsia"/>
-          <w:spacing w:val="20"/>
-          <w:szCs w:val="20"/>
-        </w:rPr>
-        <w:t xml:space="preserve"> </w:t>
-      </w:r>
-      <w:r>
-        <w:rPr>
-          <w:rFonts w:hint="eastAsia"/>
-          <w:spacing w:val="20"/>
-          <w:szCs w:val="20"/>
-        </w:rPr>
-        <w:t xml:space="preserve"> </w:t>
-      </w:r>
-      <w:r>
-        <w:rPr>
-          <w:rFonts w:hint="eastAsia"/>
-          <w:spacing w:val="20"/>
-          <w:szCs w:val="20"/>
-        </w:rPr>
-        <w:t xml:space="preserve"> </w:t>
-      </w:r>
-      <w:r>
-        <w:rPr>
-          <w:rFonts w:ascii="Courier New" w:hAnsi="Courier New" w:cs="Courier New"/>
-          <w:spacing w:val="20"/>
-          <w:szCs w:val="20"/>
-        </w:rPr>
-        <w:t xml:space="preserve"> </w:t>
-      </w:r>
-      <w:r>
-        <w:rPr>
-          <w:rFonts w:ascii="Courier New" w:hAnsi="Courier New" w:cs="Courier New"/>
-          <w:spacing w:val="20"/>
-          <w:szCs w:val="20"/>
-        </w:rPr>
-        <w:t xml:space="preserve"> </w:t>
-      </w:r>
-      <w:r>
-        <w:rPr>
-          <w:rFonts w:ascii="Courier New" w:hAnsi="Courier New" w:cs="Courier New"/>
-          <w:spacing w:val="20"/>
-          <w:szCs w:val="20"/>
-        </w:rPr>
-        <w:t xml:space="preserve"> </w:t>
-      </w:r>
-      <w:r>
-        <w:rPr>
-          <w:rFonts w:ascii="Courier New" w:hAnsi="Courier New" w:cs="Courier New"/>
-          <w:spacing w:val="20"/>
-          <w:szCs w:val="20"/>
-        </w:rPr>
-        <w:t xml:space="preserve"> </w:t>
-      </w:r>
-      <w:r>
-        <w:rPr>
-          <w:rFonts w:hint="eastAsia"/>
-          <w:spacing w:val="20"/>
-          <w:szCs w:val="20"/>
-        </w:rPr>
-        <w:t xml:space="preserve"> </w:t>
-      </w:r>
-      <w:r>
-        <w:rPr>
-          <w:rFonts w:hint="eastAsia"/>
-          <w:spacing w:val="20"/>
-          <w:szCs w:val="20"/>
-        </w:rPr>
-        <w:t xml:space="preserve"> </w:t>
-      </w:r>
-      <w:r>
-        <w:rPr>
-          <w:rFonts w:hint="eastAsia"/>
-          <w:spacing w:val="20"/>
-          <w:szCs w:val="20"/>
-        </w:rPr>
-        <w:t xml:space="preserve"> </w:t>
-      </w:r>
-      <w:r>
-        <w:rPr>
-          <w:rFonts w:ascii="Courier New" w:hAnsi="Courier New" w:cs="Courier New"/>
-          <w:spacing w:val="20"/>
-          <w:szCs w:val="20"/>
-        </w:rPr>
-        <w:t xml:space="preserve"> </w:t>
-      </w:r>
-      <w:r>
-        <w:rPr>
-          <w:rFonts w:ascii="Courier New" w:hAnsi="Courier New" w:cs="Courier New"/>
-          <w:spacing w:val="20"/>
-          <w:szCs w:val="20"/>
-        </w:rPr>
-        <w:t xml:space="preserve"> </w:t>
-      </w:r>
-      <w:r>
-        <w:rPr>
-          <w:rFonts w:ascii="Courier New" w:hAnsi="Courier New" w:cs="Courier New"/>
-          <w:spacing w:val="20"/>
-          <w:szCs w:val="20"/>
-        </w:rPr>
-        <w:t xml:space="preserve"> </w:t>
-      </w:r>
-      <w:r>
-        <w:rPr>
-          <w:rFonts w:hint="eastAsia"/>
-          <w:spacing w:val="20"/>
-          <w:szCs w:val="20"/>
-        </w:rPr>
-        <w:t xml:space="preserve"> </w:t>
-      </w:r>
-      <w:r>
-        <w:rPr>
-          <w:rFonts w:hint="eastAsia"/>
-          <w:spacing w:val="20"/>
-          <w:szCs w:val="20"/>
-        </w:rPr>
-        <w:t xml:space="preserve"> </w:t>
-      </w:r>
-    </w:p>
-    <w:p>
-      <w:pPr>
-        <w:tabs>
-          <w:tab w:pos="567" w:val="left"/>
-          <w:tab w:pos="993" w:val="left"/>
-          <w:tab w:pos="1418" w:val="left"/>
-          <w:tab w:pos="1843" w:val="left"/>
-          <w:tab w:pos="2268" w:val="left"/>
-        </w:tabs>
-        <w:snapToGrid w:val="0"/>
+          <w:rFonts w:ascii="新細明體" w:hAnsi="新細明體"/>
+        </w:rPr>
+        <w:tab/>
+        <w:t>C.</w:t>
+        <w:tab/>
+        <w:t>60</w:t>
+      </w:r>
+    </w:p>
+    <w:p>
+      <w:pPr>
+        <w:widowControl/>
+        <w:tabs>
+          <w:tab w:pos="567" w:val="left"/>
+          <w:tab w:pos="993" w:val="left"/>
+          <w:tab w:pos="1418" w:val="left"/>
+          <w:tab w:pos="1843" w:val="left"/>
+          <w:tab w:pos="2268" w:val="left"/>
+        </w:tabs>
         <w:ind w:left="567" w:hanging="567"/>
         <w:rPr>
           <w:spacing w:val="20"/>
           <w:szCs w:val="20"/>
         </w:rPr>
       </w:pPr>
-    </w:p>
-    <w:p>
-      <w:pPr>
-        <w:tabs>
-          <w:tab w:pos="567" w:val="left"/>
-          <w:tab w:pos="993" w:val="left"/>
-          <w:tab w:pos="1418" w:val="left"/>
-          <w:tab w:pos="1843" w:val="left"/>
-          <w:tab w:pos="2268" w:val="left"/>
-        </w:tabs>
-        <w:snapToGrid w:val="0"/>
-        <w:ind w:left="567" w:hanging="567"/>
-        <w:rPr>
-          <w:spacing w:val="20"/>
-          <w:szCs w:val="20"/>
-        </w:rPr>
-      </w:pPr>
+      <w:r>
+        <w:rPr>
+          <w:rFonts w:ascii="新細明體" w:hAnsi="新細明體"/>
+          <w:spacing w:val="20"/>
+          <w:szCs w:val="20"/>
+        </w:rPr>
+        <w:tab/>
+        <w:t>D.</w:t>
+        <w:tab/>
+        <w:t>100</w:t>
+      </w:r>
     </w:p>
     <w:p>
       <w:pPr>
@@ -11725,11 +12362,121 @@
       </w:pPr>
       <w:r>
         <w:rPr>
-          <w:rFonts w:hint="eastAsia" w:ascii="Courier New" w:hAnsi="Courier New"/>
-          <w:spacing w:val="20"/>
-          <w:szCs w:val="20"/>
-        </w:rPr>
-        <w:t>考慮以下偽代碼：x ← 2；y ← x + 3；x ← x + 1；輸出 y</w:t>
+          <w:rFonts w:hint="eastAsia" w:ascii="新細明體" w:hAnsi="新細明體"/>
+          <w:spacing w:val="20"/>
+          <w:szCs w:val="20"/>
+        </w:rPr>
+        <w:t>考慮以下偽代碼，n 為非負整數：</w:t>
+      </w:r>
+    </w:p>
+    <w:p>
+      <w:pPr>
+        <w:tabs>
+          <w:tab w:pos="567" w:val="left"/>
+          <w:tab w:pos="993" w:val="left"/>
+          <w:tab w:pos="1418" w:val="left"/>
+          <w:tab w:pos="1843" w:val="left"/>
+          <w:tab w:pos="2268" w:val="left"/>
+        </w:tabs>
+        <w:snapToGrid w:val="0"/>
+        <w:spacing w:before="120"/>
+        <w:ind w:left="567" w:hanging="567"/>
+        <w:rPr>
+          <w:spacing w:val="20"/>
+          <w:szCs w:val="20"/>
+        </w:rPr>
+      </w:pPr>
+      <w:r>
+        <w:rPr>
+          <w:rFonts w:ascii="Courier New" w:hAnsi="Courier New"/>
+        </w:rPr>
+        <w:tab/>
+        <w:t>輸入 n</w:t>
+      </w:r>
+    </w:p>
+    <w:p>
+      <w:pPr>
+        <w:tabs>
+          <w:tab w:pos="567" w:val="left"/>
+          <w:tab w:pos="993" w:val="left"/>
+          <w:tab w:pos="1418" w:val="left"/>
+          <w:tab w:pos="1843" w:val="left"/>
+          <w:tab w:pos="2268" w:val="left"/>
+        </w:tabs>
+        <w:snapToGrid w:val="0"/>
+        <w:ind w:left="567" w:hanging="567"/>
+        <w:rPr>
+          <w:rFonts w:ascii="Courier New" w:hAnsi="Courier New" w:cs="Courier New"/>
+          <w:spacing w:val="20"/>
+          <w:szCs w:val="20"/>
+        </w:rPr>
+      </w:pPr>
+      <w:r>
+        <w:rPr>
+          <w:rFonts w:ascii="Courier New" w:hAnsi="Courier New" w:cs="Courier New"/>
+          <w:spacing w:val="20"/>
+          <w:szCs w:val="20"/>
+        </w:rPr>
+        <w:tab/>
+      </w:r>
+      <w:r>
+        <w:rPr>
+          <w:rFonts w:ascii="Courier New" w:hAnsi="Courier New" w:cs="Courier New"/>
+          <w:spacing w:val="20"/>
+          <w:szCs w:val="20"/>
+        </w:rPr>
+        <w:t>若</w:t>
+      </w:r>
+      <w:r>
+        <w:rPr>
+          <w:rFonts w:ascii="Courier New" w:hAnsi="Courier New" w:cs="Courier New"/>
+          <w:spacing w:val="20"/>
+          <w:szCs w:val="20"/>
+        </w:rPr>
+        <w:t xml:space="preserve"> n = 0 則</w:t>
+      </w:r>
+    </w:p>
+    <w:p>
+      <w:pPr>
+        <w:tabs>
+          <w:tab w:pos="567" w:val="left"/>
+          <w:tab w:pos="993" w:val="left"/>
+          <w:tab w:pos="1418" w:val="left"/>
+          <w:tab w:pos="1843" w:val="left"/>
+          <w:tab w:pos="2268" w:val="left"/>
+        </w:tabs>
+        <w:snapToGrid w:val="0"/>
+        <w:spacing w:after="120"/>
+        <w:ind w:left="567" w:hanging="567"/>
+        <w:rPr>
+          <w:rFonts w:ascii="Courier New" w:hAnsi="Courier New" w:cs="Courier New"/>
+          <w:spacing w:val="20"/>
+          <w:szCs w:val="20"/>
+        </w:rPr>
+      </w:pPr>
+      <w:r>
+        <w:rPr>
+          <w:rFonts w:ascii="Courier New" w:hAnsi="Courier New" w:cs="Courier New"/>
+          <w:spacing w:val="20"/>
+          <w:szCs w:val="20"/>
+        </w:rPr>
+        <w:tab/>
+      </w:r>
+      <w:r>
+        <w:rPr>
+          <w:rFonts w:ascii="Courier New" w:hAnsi="Courier New" w:cs="Courier New"/>
+          <w:spacing w:val="20"/>
+          <w:szCs w:val="20"/>
+        </w:rPr>
+        <w:tab/>
+      </w:r>
+      <w:r>
+        <w:rPr>
+          <w:rFonts w:ascii="Courier New" w:hAnsi="Courier New" w:cs="Courier New"/>
+          <w:spacing w:val="20"/>
+          <w:szCs w:val="20"/>
+        </w:rPr>
+        <w:t>輸出 「zero」</w:t>
       </w:r>
     </w:p>
     <w:p>
@@ -11745,6 +12492,243 @@
         <w:snapToGrid w:val="0"/>
         <w:ind w:left="567" w:hanging="567"/>
         <w:rPr>
+          <w:rFonts w:ascii="Courier New" w:hAnsi="Courier New" w:cs="Courier New"/>
+          <w:spacing w:val="20"/>
+          <w:szCs w:val="20"/>
+        </w:rPr>
+      </w:pPr>
+      <w:r>
+        <w:rPr>
+          <w:rFonts w:ascii="新細明體" w:hAnsi="新細明體" w:cs="Courier New"/>
+          <w:spacing w:val="20"/>
+          <w:szCs w:val="20"/>
+        </w:rPr>
+        <w:t>測</w:t>
+      </w:r>
+      <w:r>
+        <w:rPr>
+          <w:rFonts w:ascii="新細明體" w:hAnsi="新細明體" w:cs="Courier New"/>
+          <w:spacing w:val="20"/>
+          <w:szCs w:val="20"/>
+        </w:rPr>
+        <w:t>試</w:t>
+      </w:r>
+      <w:r>
+        <w:rPr>
+          <w:rFonts w:ascii="新細明體" w:hAnsi="新細明體" w:cs="Courier New"/>
+          <w:spacing w:val="20"/>
+          <w:szCs w:val="20"/>
+        </w:rPr>
+        <w:t>時</w:t>
+      </w:r>
+      <w:r>
+        <w:rPr>
+          <w:rFonts w:ascii="新細明體" w:hAnsi="新細明體" w:cs="Courier New"/>
+          <w:spacing w:val="20"/>
+          <w:szCs w:val="20"/>
+        </w:rPr>
+        <w:t>下列哪個是適當的邊界個案？</w:t>
+      </w:r>
+    </w:p>
+    <w:p>
+      <w:pPr>
+        <w:tabs>
+          <w:tab w:pos="567" w:val="left"/>
+          <w:tab w:pos="993" w:val="left"/>
+          <w:tab w:pos="1418" w:val="left"/>
+          <w:tab w:pos="1843" w:val="left"/>
+          <w:tab w:pos="2268" w:val="left"/>
+        </w:tabs>
+        <w:snapToGrid w:val="0"/>
+        <w:ind w:left="567" w:hanging="567"/>
+        <w:rPr>
+          <w:rFonts w:ascii="Courier New" w:hAnsi="Courier New" w:cs="Courier New"/>
+          <w:spacing w:val="20"/>
+          <w:szCs w:val="20"/>
+        </w:rPr>
+      </w:pPr>
+      <w:r>
+        <w:rPr>
+          <w:rFonts w:ascii="Courier New" w:hAnsi="Courier New" w:cs="Courier New"/>
+          <w:spacing w:val="20"/>
+          <w:szCs w:val="20"/>
+        </w:rPr>
+        <w:t xml:space="preserve"> </w:t>
+      </w:r>
+      <w:r>
+        <w:rPr>
+          <w:rFonts w:ascii="Courier New" w:hAnsi="Courier New" w:cs="Courier New"/>
+          <w:spacing w:val="20"/>
+          <w:szCs w:val="20"/>
+        </w:rPr>
+        <w:t xml:space="preserve"> </w:t>
+      </w:r>
+      <w:r>
+        <w:rPr>
+          <w:rFonts w:ascii="Courier New" w:hAnsi="Courier New" w:cs="Courier New"/>
+          <w:spacing w:val="20"/>
+          <w:szCs w:val="20"/>
+        </w:rPr>
+        <w:t xml:space="preserve"> </w:t>
+      </w:r>
+    </w:p>
+    <w:p>
+      <w:pPr>
+        <w:tabs>
+          <w:tab w:pos="567" w:val="left"/>
+          <w:tab w:pos="993" w:val="left"/>
+          <w:tab w:pos="1418" w:val="left"/>
+          <w:tab w:pos="1843" w:val="left"/>
+          <w:tab w:pos="2268" w:val="left"/>
+        </w:tabs>
+        <w:snapToGrid w:val="0"/>
+        <w:ind w:left="567" w:hanging="567"/>
+        <w:rPr>
+          <w:rFonts w:ascii="Courier New" w:hAnsi="Courier New" w:cs="Courier New"/>
+          <w:spacing w:val="20"/>
+          <w:szCs w:val="20"/>
+        </w:rPr>
+      </w:pPr>
+      <w:r>
+        <w:rPr>
+          <w:rFonts w:ascii="新細明體" w:hAnsi="新細明體" w:cs="Courier New"/>
+          <w:spacing w:val="20"/>
+          <w:szCs w:val="20"/>
+        </w:rPr>
+        <w:tab/>
+      </w:r>
+      <w:r>
+        <w:rPr>
+          <w:rFonts w:ascii="新細明體" w:hAnsi="新細明體" w:cs="Courier New"/>
+          <w:spacing w:val="20"/>
+          <w:szCs w:val="20"/>
+        </w:rPr>
+        <w:t>A</w:t>
+      </w:r>
+      <w:r>
+        <w:rPr>
+          <w:rFonts w:ascii="新細明體" w:hAnsi="新細明體" w:cs="Courier New"/>
+          <w:spacing w:val="20"/>
+          <w:szCs w:val="20"/>
+        </w:rPr>
+        <w:t>.</w:t>
+      </w:r>
+      <w:r>
+        <w:rPr>
+          <w:rFonts w:ascii="新細明體" w:hAnsi="新細明體" w:cs="Courier New"/>
+          <w:spacing w:val="20"/>
+          <w:szCs w:val="20"/>
+        </w:rPr>
+        <w:tab/>
+        <w:t>n = 0</w:t>
+      </w:r>
+    </w:p>
+    <w:p>
+      <w:pPr>
+        <w:tabs>
+          <w:tab w:pos="567" w:val="left"/>
+          <w:tab w:pos="993" w:val="left"/>
+          <w:tab w:pos="1418" w:val="left"/>
+          <w:tab w:pos="1843" w:val="left"/>
+          <w:tab w:pos="2268" w:val="left"/>
+        </w:tabs>
+        <w:snapToGrid w:val="0"/>
+        <w:ind w:left="567" w:hanging="567"/>
+        <w:rPr>
+          <w:rFonts w:ascii="Courier New" w:hAnsi="Courier New" w:cs="Courier New"/>
+          <w:spacing w:val="20"/>
+          <w:szCs w:val="20"/>
+        </w:rPr>
+      </w:pPr>
+      <w:r>
+        <w:rPr>
+          <w:rFonts w:ascii="新細明體" w:hAnsi="新細明體" w:cs="Courier New"/>
+          <w:spacing w:val="20"/>
+          <w:szCs w:val="20"/>
+        </w:rPr>
+        <w:tab/>
+      </w:r>
+      <w:r>
+        <w:rPr>
+          <w:rFonts w:ascii="新細明體" w:hAnsi="新細明體" w:cs="Courier New"/>
+          <w:spacing w:val="20"/>
+          <w:szCs w:val="20"/>
+        </w:rPr>
+        <w:t>B</w:t>
+      </w:r>
+      <w:r>
+        <w:rPr>
+          <w:rFonts w:ascii="新細明體" w:hAnsi="新細明體" w:cs="Courier New"/>
+          <w:spacing w:val="20"/>
+          <w:szCs w:val="20"/>
+        </w:rPr>
+        <w:t>.</w:t>
+        <w:tab/>
+        <w:t>只測試 n = 1</w:t>
+      </w:r>
+    </w:p>
+    <w:p>
+      <w:pPr>
+        <w:tabs>
+          <w:tab w:pos="567" w:val="left"/>
+          <w:tab w:pos="993" w:val="left"/>
+          <w:tab w:pos="1418" w:val="left"/>
+          <w:tab w:pos="1843" w:val="left"/>
+          <w:tab w:pos="2268" w:val="left"/>
+        </w:tabs>
+        <w:snapToGrid w:val="0"/>
+        <w:ind w:left="567" w:hanging="567"/>
+        <w:rPr>
+          <w:spacing w:val="20"/>
+          <w:szCs w:val="20"/>
+        </w:rPr>
+      </w:pPr>
+      <w:r>
+        <w:rPr>
+          <w:rFonts w:ascii="新細明體" w:hAnsi="新細明體" w:cs="Courier New"/>
+          <w:spacing w:val="20"/>
+          <w:szCs w:val="20"/>
+        </w:rPr>
+        <w:tab/>
+      </w:r>
+      <w:r>
+        <w:rPr>
+          <w:rFonts w:ascii="新細明體" w:hAnsi="新細明體" w:cs="Courier New"/>
+          <w:spacing w:val="20"/>
+          <w:szCs w:val="20"/>
+        </w:rPr>
+        <w:t>C</w:t>
+      </w:r>
+      <w:r>
+        <w:rPr>
+          <w:rFonts w:ascii="新細明體" w:hAnsi="新細明體" w:cs="Courier New"/>
+          <w:spacing w:val="20"/>
+          <w:szCs w:val="20"/>
+        </w:rPr>
+        <w:t>.</w:t>
+      </w:r>
+      <w:r>
+        <w:rPr>
+          <w:rFonts w:ascii="新細明體" w:hAnsi="新細明體" w:cs="Courier New"/>
+          <w:spacing w:val="20"/>
+          <w:szCs w:val="20"/>
+        </w:rPr>
+        <w:tab/>
+        <w:t>n = 5</w:t>
+      </w:r>
+    </w:p>
+    <w:p>
+      <w:pPr>
+        <w:tabs>
+          <w:tab w:pos="567" w:val="left"/>
+          <w:tab w:pos="993" w:val="left"/>
+          <w:tab w:pos="1418" w:val="left"/>
+          <w:tab w:pos="1843" w:val="left"/>
+          <w:tab w:pos="2268" w:val="left"/>
+        </w:tabs>
+        <w:snapToGrid w:val="0"/>
+        <w:ind w:left="567" w:hanging="567"/>
+        <w:rPr>
           <w:spacing w:val="20"/>
           <w:szCs w:val="20"/>
         </w:rPr>
@@ -11753,86 +12737,64 @@
         <w:rPr>
           <w:rFonts w:ascii="新細明體" w:hAnsi="新細明體"/>
         </w:rPr>
-        <w:t>輸出是？</w:t>
-      </w:r>
-    </w:p>
-    <w:p>
-      <w:pPr>
-        <w:tabs>
-          <w:tab w:pos="567" w:val="left"/>
-          <w:tab w:pos="993" w:val="left"/>
-          <w:tab w:pos="1418" w:val="left"/>
-          <w:tab w:pos="1843" w:val="left"/>
-          <w:tab w:pos="2268" w:val="left"/>
-        </w:tabs>
-        <w:snapToGrid w:val="0"/>
-        <w:rPr>
-          <w:rFonts w:ascii="Courier New" w:hAnsi="Courier New" w:cs="Courier New"/>
-          <w:spacing w:val="20"/>
-          <w:szCs w:val="20"/>
-        </w:rPr>
-      </w:pPr>
-    </w:p>
-    <w:p>
-      <w:pPr>
-        <w:tabs>
-          <w:tab w:pos="567" w:val="left"/>
-          <w:tab w:pos="993" w:val="left"/>
-          <w:tab w:pos="1418" w:val="left"/>
-          <w:tab w:pos="1843" w:val="left"/>
-          <w:tab w:pos="2268" w:val="left"/>
-        </w:tabs>
-        <w:snapToGrid w:val="0"/>
+        <w:tab/>
+        <w:t>D.</w:t>
+        <w:tab/>
+        <w:t>n = -1 且 n = 10</w:t>
+      </w:r>
+    </w:p>
+    <w:p>
+      <w:pPr>
+        <w:tabs>
+          <w:tab w:pos="567" w:val="left"/>
+          <w:tab w:pos="993" w:val="left"/>
+          <w:tab w:pos="1418" w:val="left"/>
+          <w:tab w:pos="1843" w:val="left"/>
+          <w:tab w:pos="2268" w:val="left"/>
+        </w:tabs>
+        <w:snapToGrid w:val="0"/>
+        <w:spacing w:before="0" w:after="0" w:lineRule="exact" w:line="20"/>
         <w:ind w:left="567" w:hanging="567"/>
         <w:rPr>
-          <w:spacing w:val="20"/>
-          <w:szCs w:val="20"/>
-        </w:rPr>
-      </w:pPr>
-      <w:r>
-        <w:rPr>
-          <w:rFonts w:ascii="新細明體" w:hAnsi="新細明體"/>
-          <w:spacing w:val="20"/>
-          <w:szCs w:val="20"/>
-        </w:rPr>
-        <w:tab/>
-      </w:r>
-      <w:r>
-        <w:rPr>
-          <w:rFonts w:ascii="新細明體" w:hAnsi="新細明體"/>
-          <w:spacing w:val="20"/>
-          <w:szCs w:val="20"/>
-        </w:rPr>
-        <w:t>A</w:t>
-      </w:r>
-      <w:r>
-        <w:rPr>
-          <w:rFonts w:hint="eastAsia" w:ascii="新細明體" w:hAnsi="新細明體"/>
-          <w:spacing w:val="20"/>
-          <w:szCs w:val="20"/>
-        </w:rPr>
-        <w:t>.</w:t>
-      </w:r>
-      <w:r>
-        <w:rPr>
-          <w:rFonts w:hint="eastAsia" w:ascii="新細明體" w:hAnsi="新細明體"/>
-          <w:spacing w:val="20"/>
-          <w:szCs w:val="20"/>
-        </w:rPr>
-        <w:tab/>
-        <w:t>6</w:t>
-      </w:r>
-    </w:p>
-    <w:p>
-      <w:pPr>
-        <w:tabs>
-          <w:tab w:pos="567" w:val="left"/>
-          <w:tab w:pos="993" w:val="left"/>
-          <w:tab w:pos="1418" w:val="left"/>
-          <w:tab w:pos="1843" w:val="left"/>
-          <w:tab w:pos="2268" w:val="left"/>
-        </w:tabs>
-        <w:snapToGrid w:val="0"/>
+          <w:rFonts w:ascii="Courier New" w:hAnsi="Courier New" w:cs="Courier New"/>
+          <w:spacing w:val="20"/>
+          <w:szCs w:val="20"/>
+        </w:rPr>
+      </w:pPr>
+      <w:r>
+        <w:rPr>
+          <w:spacing w:val="20"/>
+          <w:szCs w:val="20"/>
+        </w:rPr>
+        <w:t xml:space="preserve"> </w:t>
+      </w:r>
+      <w:r>
+        <w:rPr>
+          <w:spacing w:val="20"/>
+          <w:szCs w:val="20"/>
+        </w:rPr>
+        <w:t xml:space="preserve"> </w:t>
+      </w:r>
+      <w:r>
+        <w:rPr>
+          <w:rFonts w:ascii="Courier New" w:hAnsi="Courier New" w:cs="Courier New"/>
+          <w:spacing w:val="20"/>
+          <w:szCs w:val="20"/>
+        </w:rPr>
+        <w:t xml:space="preserve"> </w:t>
+      </w:r>
+    </w:p>
+    <w:p>
+      <w:pPr>
+        <w:tabs>
+          <w:tab w:pos="567" w:val="left"/>
+          <w:tab w:pos="993" w:val="left"/>
+          <w:tab w:pos="1418" w:val="left"/>
+          <w:tab w:pos="1843" w:val="left"/>
+          <w:tab w:pos="2268" w:val="left"/>
+        </w:tabs>
+        <w:snapToGrid w:val="0"/>
+        <w:spacing w:before="0" w:after="0" w:lineRule="exact" w:line="20"/>
         <w:ind w:left="567" w:hanging="567"/>
         <w:rPr>
           <w:spacing w:val="20"/>
@@ -11841,48 +12803,38 @@
       </w:pPr>
       <w:r>
         <w:rPr>
-          <w:rFonts w:hint="eastAsia" w:ascii="新細明體" w:hAnsi="新細明體"/>
-          <w:spacing w:val="20"/>
-          <w:szCs w:val="20"/>
-        </w:rPr>
-        <w:tab/>
-      </w:r>
-      <w:r>
-        <w:rPr>
-          <w:rFonts w:hint="eastAsia" w:ascii="新細明體" w:hAnsi="新細明體"/>
-          <w:spacing w:val="20"/>
-          <w:szCs w:val="20"/>
-        </w:rPr>
-        <w:t>B</w:t>
-      </w:r>
-      <w:r>
-        <w:rPr>
-          <w:rFonts w:hint="eastAsia" w:ascii="新細明體" w:hAnsi="新細明體"/>
-          <w:spacing w:val="20"/>
-          <w:szCs w:val="20"/>
-        </w:rPr>
-        <w:t>.</w:t>
-      </w:r>
-      <w:r>
-        <w:rPr>
-          <w:rFonts w:hint="eastAsia" w:ascii="新細明體" w:hAnsi="新細明體"/>
-          <w:spacing w:val="20"/>
-          <w:szCs w:val="20"/>
-        </w:rPr>
-        <w:tab/>
-        <w:t>2</w:t>
-      </w:r>
-    </w:p>
-    <w:p>
-      <w:pPr>
-        <w:tabs>
-          <w:tab w:pos="567" w:val="left"/>
-          <w:tab w:pos="993" w:val="left"/>
-          <w:tab w:pos="1418" w:val="left"/>
-          <w:tab w:pos="1843" w:val="left"/>
-          <w:tab w:pos="2268" w:val="left"/>
-        </w:tabs>
-        <w:snapToGrid w:val="0"/>
+          <w:spacing w:val="20"/>
+          <w:szCs w:val="20"/>
+        </w:rPr>
+        <w:t xml:space="preserve"> </w:t>
+      </w:r>
+      <w:r>
+        <w:rPr>
+          <w:spacing w:val="20"/>
+          <w:szCs w:val="20"/>
+        </w:rPr>
+        <w:t xml:space="preserve"> </w:t>
+      </w:r>
+      <w:r>
+        <w:rPr>
+          <w:rFonts w:ascii="Courier New" w:hAnsi="Courier New" w:cs="Courier New"/>
+          <w:spacing w:val="20"/>
+          <w:szCs w:val="20"/>
+        </w:rPr>
+        <w:t xml:space="preserve"> </w:t>
+      </w:r>
+    </w:p>
+    <w:p>
+      <w:pPr>
+        <w:tabs>
+          <w:tab w:pos="567" w:val="left"/>
+          <w:tab w:pos="993" w:val="left"/>
+          <w:tab w:pos="1418" w:val="left"/>
+          <w:tab w:pos="1843" w:val="left"/>
+          <w:tab w:pos="2268" w:val="left"/>
+        </w:tabs>
+        <w:snapToGrid w:val="0"/>
+        <w:spacing w:before="0" w:after="0" w:lineRule="exact" w:line="20"/>
         <w:ind w:left="567" w:hanging="567"/>
         <w:rPr>
           <w:spacing w:val="20"/>
@@ -11891,72 +12843,74 @@
       </w:pPr>
       <w:r>
         <w:rPr>
-          <w:rFonts w:hint="eastAsia" w:ascii="新細明體" w:hAnsi="新細明體"/>
-          <w:spacing w:val="20"/>
-          <w:szCs w:val="20"/>
-        </w:rPr>
-        <w:tab/>
-      </w:r>
-      <w:r>
-        <w:rPr>
-          <w:rFonts w:hint="eastAsia" w:ascii="新細明體" w:hAnsi="新細明體"/>
-          <w:spacing w:val="20"/>
-          <w:szCs w:val="20"/>
-        </w:rPr>
-        <w:t>C</w:t>
-      </w:r>
-      <w:r>
-        <w:rPr>
-          <w:rFonts w:hint="eastAsia" w:ascii="新細明體" w:hAnsi="新細明體"/>
-          <w:spacing w:val="20"/>
-          <w:szCs w:val="20"/>
-        </w:rPr>
-        <w:t>.</w:t>
-        <w:tab/>
-        <w:t>5</w:t>
-      </w:r>
-    </w:p>
-    <w:p>
-      <w:pPr>
-        <w:tabs>
-          <w:tab w:pos="567" w:val="left"/>
-          <w:tab w:pos="993" w:val="left"/>
-          <w:tab w:pos="1418" w:val="left"/>
-          <w:tab w:pos="1843" w:val="left"/>
-          <w:tab w:pos="2268" w:val="left"/>
-        </w:tabs>
-        <w:snapToGrid w:val="0"/>
+          <w:spacing w:val="20"/>
+          <w:szCs w:val="20"/>
+        </w:rPr>
+        <w:t xml:space="preserve"> </w:t>
+      </w:r>
+      <w:r>
+        <w:rPr>
+          <w:spacing w:val="20"/>
+          <w:szCs w:val="20"/>
+        </w:rPr>
+        <w:t xml:space="preserve"> </w:t>
+      </w:r>
+      <w:r>
+        <w:rPr>
+          <w:rFonts w:ascii="Courier New" w:hAnsi="Courier New" w:cs="Courier New"/>
+          <w:spacing w:val="20"/>
+          <w:szCs w:val="20"/>
+        </w:rPr>
+        <w:t xml:space="preserve"> </w:t>
+      </w:r>
+    </w:p>
+    <w:p>
+      <w:pPr>
+        <w:tabs>
+          <w:tab w:pos="567" w:val="left"/>
+          <w:tab w:pos="993" w:val="left"/>
+          <w:tab w:pos="1418" w:val="left"/>
+          <w:tab w:pos="1843" w:val="left"/>
+          <w:tab w:pos="2268" w:val="left"/>
+        </w:tabs>
+        <w:snapToGrid w:val="0"/>
+        <w:spacing w:before="0" w:after="0" w:lineRule="exact" w:line="20"/>
         <w:ind w:left="567" w:hanging="567"/>
         <w:rPr>
-          <w:spacing w:val="20"/>
-          <w:szCs w:val="20"/>
-        </w:rPr>
-      </w:pPr>
-      <w:r>
-        <w:rPr>
-          <w:rFonts w:hint="eastAsia" w:ascii="新細明體" w:hAnsi="新細明體"/>
-          <w:spacing w:val="20"/>
-          <w:szCs w:val="20"/>
-        </w:rPr>
-        <w:tab/>
-      </w:r>
-      <w:r>
-        <w:rPr>
-          <w:rFonts w:hint="eastAsia" w:ascii="新細明體" w:hAnsi="新細明體"/>
-          <w:spacing w:val="20"/>
-          <w:szCs w:val="20"/>
-        </w:rPr>
-        <w:t>D</w:t>
-      </w:r>
-      <w:r>
-        <w:rPr>
-          <w:rFonts w:hint="eastAsia" w:ascii="新細明體" w:hAnsi="新細明體"/>
-          <w:spacing w:val="20"/>
-          <w:szCs w:val="20"/>
-        </w:rPr>
-        <w:t>.</w:t>
-        <w:tab/>
-        <w:t>3</w:t>
+          <w:rFonts w:ascii="Courier New" w:hAnsi="Courier New" w:cs="Courier New"/>
+          <w:spacing w:val="20"/>
+          <w:szCs w:val="20"/>
+        </w:rPr>
+      </w:pPr>
+      <w:r>
+        <w:rPr>
+          <w:spacing w:val="20"/>
+          <w:szCs w:val="20"/>
+        </w:rPr>
+        <w:t xml:space="preserve"> </w:t>
+      </w:r>
+      <w:r>
+        <w:rPr>
+          <w:spacing w:val="20"/>
+          <w:szCs w:val="20"/>
+        </w:rPr>
+        <w:t xml:space="preserve"> </w:t>
+      </w:r>
+      <w:r>
+        <w:rPr>
+          <w:rFonts w:ascii="Courier New" w:hAnsi="Courier New" w:cs="Courier New"/>
+          <w:spacing w:val="20"/>
+          <w:szCs w:val="20"/>
+        </w:rPr>
+        <w:t xml:space="preserve"> </w:t>
+      </w:r>
+      <w:r>
+        <w:rPr>
+          <w:rFonts w:ascii="Courier New" w:hAnsi="Courier New" w:cs="Courier New"/>
+          <w:spacing w:val="20"/>
+          <w:szCs w:val="20"/>
+        </w:rPr>
+        <w:t xml:space="preserve"> </w:t>
       </w:r>
     </w:p>
     <w:p>
@@ -11978,15 +12932,15 @@
     </w:p>
     <w:p>
       <w:pPr>
-        <w:tabs>
-          <w:tab w:pos="567" w:val="left"/>
-          <w:tab w:pos="993" w:val="left"/>
-          <w:tab w:pos="1418" w:val="left"/>
-          <w:tab w:pos="1843" w:val="left"/>
-          <w:tab w:pos="2268" w:val="left"/>
-        </w:tabs>
-        <w:snapToGrid w:val="0"/>
-        <w:ind w:left="567" w:hanging="567"/>
+        <w:widowControl/>
+        <w:tabs>
+          <w:tab w:pos="567" w:val="left"/>
+          <w:tab w:pos="993" w:val="left"/>
+          <w:tab w:pos="1418" w:val="left"/>
+          <w:tab w:pos="1843" w:val="left"/>
+          <w:tab w:pos="2268" w:val="left"/>
+        </w:tabs>
+        <w:snapToGrid w:val="0"/>
         <w:rPr>
           <w:spacing w:val="20"/>
           <w:szCs w:val="20"/>
@@ -12016,11 +12970,52 @@
       </w:pPr>
       <w:r>
         <w:rPr>
+          <w:rFonts w:hint="eastAsia" w:ascii="新細明體" w:hAnsi="新細明體"/>
+          <w:spacing w:val="20"/>
+          <w:szCs w:val="20"/>
+        </w:rPr>
+        <w:t>下列哪一項是正確的賦值語句（偽代碼）？</w:t>
+      </w:r>
+    </w:p>
+    <w:p>
+      <w:pPr>
+        <w:tabs>
+          <w:tab w:pos="567" w:val="left"/>
+          <w:tab w:pos="993" w:val="left"/>
+          <w:tab w:pos="1418" w:val="left"/>
+          <w:tab w:pos="1843" w:val="left"/>
+          <w:tab w:pos="2268" w:val="left"/>
+        </w:tabs>
+        <w:snapToGrid w:val="0"/>
+        <w:rPr>
+          <w:spacing w:val="20"/>
+          <w:szCs w:val="20"/>
+        </w:rPr>
+      </w:pPr>
+    </w:p>
+    <w:p>
+      <w:pPr>
+        <w:tabs>
+          <w:tab w:pos="567" w:val="left"/>
+          <w:tab w:pos="993" w:val="left"/>
+          <w:tab w:pos="1418" w:val="left"/>
+          <w:tab w:pos="1843" w:val="left"/>
+          <w:tab w:pos="2268" w:val="left"/>
+        </w:tabs>
+        <w:snapToGrid w:val="0"/>
+        <w:ind w:left="567" w:hanging="567"/>
+        <w:rPr>
+          <w:spacing w:val="20"/>
+          <w:szCs w:val="20"/>
+        </w:rPr>
+      </w:pPr>
+      <w:r>
+        <w:rPr>
           <w:rFonts w:hint="eastAsia" w:ascii="Courier New" w:hAnsi="Courier New"/>
           <w:spacing w:val="20"/>
           <w:szCs w:val="20"/>
         </w:rPr>
-        <w:t>考</w:t>
+        <w:tab/>
       </w:r>
       <w:r>
         <w:rPr>
@@ -12028,7 +13023,7 @@
           <w:spacing w:val="20"/>
           <w:szCs w:val="20"/>
         </w:rPr>
-        <w:t>慮</w:t>
+        <w:t>A</w:t>
       </w:r>
       <w:r>
         <w:rPr>
@@ -12036,24 +13031,10 @@
           <w:spacing w:val="20"/>
           <w:szCs w:val="20"/>
         </w:rPr>
-        <w:t>以下偽代碼：若 (score ≥ 60) 且 (score ≤ 100) 則 grade ←「合格」，否則 grade ←「不合格」。若 score = 60，grade 是？</w:t>
-      </w:r>
-    </w:p>
-    <w:p>
-      <w:pPr>
-        <w:tabs>
-          <w:tab w:pos="567" w:val="left"/>
-          <w:tab w:pos="993" w:val="left"/>
-          <w:tab w:pos="1418" w:val="left"/>
-          <w:tab w:pos="1843" w:val="left"/>
-          <w:tab w:pos="2268" w:val="left"/>
-        </w:tabs>
-        <w:snapToGrid w:val="0"/>
-        <w:rPr>
-          <w:spacing w:val="20"/>
-          <w:szCs w:val="20"/>
-        </w:rPr>
-      </w:pPr>
+        <w:t>.</w:t>
+        <w:tab/>
+        <w:t>count ← count + 1</w:t>
+      </w:r>
     </w:p>
     <w:p>
       <w:pPr>
@@ -12073,29 +13054,29 @@
       </w:pPr>
       <w:r>
         <w:rPr>
-          <w:rFonts w:hint="eastAsia" w:ascii="新細明體" w:hAnsi="新細明體"/>
-          <w:spacing w:val="20"/>
-          <w:szCs w:val="20"/>
-        </w:rPr>
-        <w:tab/>
-      </w:r>
-      <w:r>
-        <w:rPr>
-          <w:rFonts w:hint="eastAsia" w:ascii="新細明體" w:hAnsi="新細明體"/>
-          <w:spacing w:val="20"/>
-          <w:szCs w:val="20"/>
-        </w:rPr>
-        <w:t>A</w:t>
-      </w:r>
-      <w:r>
-        <w:rPr>
-          <w:rFonts w:hint="eastAsia" w:ascii="新細明體" w:hAnsi="新細明體"/>
+          <w:rFonts w:hint="eastAsia" w:ascii="Courier New" w:hAnsi="Courier New"/>
+          <w:spacing w:val="20"/>
+          <w:szCs w:val="20"/>
+        </w:rPr>
+        <w:tab/>
+      </w:r>
+      <w:r>
+        <w:rPr>
+          <w:rFonts w:hint="eastAsia" w:ascii="Courier New" w:hAnsi="Courier New"/>
+          <w:spacing w:val="20"/>
+          <w:szCs w:val="20"/>
+        </w:rPr>
+        <w:t>B</w:t>
+      </w:r>
+      <w:r>
+        <w:rPr>
+          <w:rFonts w:hint="eastAsia" w:ascii="Courier New" w:hAnsi="Courier New"/>
           <w:spacing w:val="20"/>
           <w:szCs w:val="20"/>
         </w:rPr>
         <w:t>.</w:t>
         <w:tab/>
-        <w:t>不合格</w:t>
+        <w:t>count + 1 ← count</w:t>
       </w:r>
     </w:p>
     <w:p>
@@ -12116,29 +13097,29 @@
       </w:pPr>
       <w:r>
         <w:rPr>
-          <w:rFonts w:hint="eastAsia" w:ascii="新細明體" w:hAnsi="新細明體"/>
-          <w:spacing w:val="20"/>
-          <w:szCs w:val="20"/>
-        </w:rPr>
-        <w:tab/>
-      </w:r>
-      <w:r>
-        <w:rPr>
-          <w:rFonts w:hint="eastAsia" w:ascii="新細明體" w:hAnsi="新細明體"/>
-          <w:spacing w:val="20"/>
-          <w:szCs w:val="20"/>
-        </w:rPr>
-        <w:t>B</w:t>
-      </w:r>
-      <w:r>
-        <w:rPr>
-          <w:rFonts w:hint="eastAsia" w:ascii="新細明體" w:hAnsi="新細明體"/>
+          <w:rFonts w:hint="eastAsia" w:ascii="Courier New" w:hAnsi="Courier New"/>
+          <w:spacing w:val="20"/>
+          <w:szCs w:val="20"/>
+        </w:rPr>
+        <w:tab/>
+      </w:r>
+      <w:r>
+        <w:rPr>
+          <w:rFonts w:hint="eastAsia" w:ascii="Courier New" w:hAnsi="Courier New"/>
+          <w:spacing w:val="20"/>
+          <w:szCs w:val="20"/>
+        </w:rPr>
+        <w:t>C</w:t>
+      </w:r>
+      <w:r>
+        <w:rPr>
+          <w:rFonts w:hint="eastAsia" w:ascii="Courier New" w:hAnsi="Courier New"/>
           <w:spacing w:val="20"/>
           <w:szCs w:val="20"/>
         </w:rPr>
         <w:t>.</w:t>
         <w:tab/>
-        <w:t>合格</w:t>
+        <w:t>count ← ← 1</w:t>
       </w:r>
     </w:p>
     <w:p>
@@ -12171,7 +13152,7 @@
           <w:spacing w:val="20"/>
           <w:szCs w:val="20"/>
         </w:rPr>
-        <w:t>C</w:t>
+        <w:t>D</w:t>
       </w:r>
       <w:r>
         <w:rPr>
@@ -12181,7 +13162,7 @@
         </w:rPr>
         <w:t>.</w:t>
         <w:tab/>
-        <w:t>60</w:t>
+        <w:t>count == count + 1</w:t>
       </w:r>
     </w:p>
     <w:p>
@@ -12200,90 +13181,23 @@
           <w:szCs w:val="20"/>
         </w:rPr>
       </w:pPr>
-      <w:r>
-        <w:rPr>
-          <w:rFonts w:hint="eastAsia" w:ascii="新細明體" w:hAnsi="新細明體"/>
-          <w:spacing w:val="20"/>
-          <w:szCs w:val="20"/>
-        </w:rPr>
-        <w:tab/>
-      </w:r>
-      <w:r>
-        <w:rPr>
-          <w:rFonts w:hint="eastAsia" w:ascii="新細明體" w:hAnsi="新細明體"/>
-          <w:spacing w:val="20"/>
-          <w:szCs w:val="20"/>
-        </w:rPr>
-        <w:t>D</w:t>
-      </w:r>
-      <w:r>
-        <w:rPr>
-          <w:rFonts w:hint="eastAsia" w:ascii="新細明體" w:hAnsi="新細明體"/>
-          <w:spacing w:val="20"/>
-          <w:szCs w:val="20"/>
-        </w:rPr>
-        <w:t>.</w:t>
-        <w:tab/>
-        <w:t>100</w:t>
-      </w:r>
-    </w:p>
-    <w:p>
-      <w:pPr>
-        <w:tabs>
-          <w:tab w:pos="567" w:val="left"/>
-          <w:tab w:pos="993" w:val="left"/>
-          <w:tab w:pos="1418" w:val="left"/>
-          <w:tab w:pos="1843" w:val="left"/>
-          <w:tab w:pos="2268" w:val="left"/>
-        </w:tabs>
-        <w:snapToGrid w:val="0"/>
-        <w:spacing w:before="0" w:after="0" w:lineRule="exact" w:line="20"/>
+    </w:p>
+    <w:p>
+      <w:pPr>
+        <w:tabs>
+          <w:tab w:pos="567" w:val="left"/>
+          <w:tab w:pos="993" w:val="left"/>
+          <w:tab w:pos="1418" w:val="left"/>
+          <w:tab w:pos="1843" w:val="left"/>
+          <w:tab w:pos="2268" w:val="left"/>
+        </w:tabs>
+        <w:snapToGrid w:val="0"/>
         <w:ind w:left="567" w:hanging="567"/>
         <w:rPr>
           <w:spacing w:val="20"/>
           <w:szCs w:val="20"/>
         </w:rPr>
       </w:pPr>
-    </w:p>
-    <w:p>
-      <w:pPr>
-        <w:tabs>
-          <w:tab w:pos="567" w:val="left"/>
-          <w:tab w:pos="993" w:val="left"/>
-          <w:tab w:pos="1418" w:val="left"/>
-          <w:tab w:pos="1843" w:val="left"/>
-          <w:tab w:pos="2268" w:val="left"/>
-        </w:tabs>
-        <w:snapToGrid w:val="0"/>
-        <w:ind w:left="567" w:hanging="567"/>
-        <w:rPr>
-          <w:spacing w:val="20"/>
-          <w:szCs w:val="20"/>
-        </w:rPr>
-      </w:pPr>
-    </w:p>
-    <w:p>
-      <w:pPr>
-        <w:widowControl/>
-        <w:tabs>
-          <w:tab w:pos="567" w:val="left"/>
-          <w:tab w:pos="993" w:val="left"/>
-          <w:tab w:pos="1418" w:val="left"/>
-          <w:tab w:pos="1843" w:val="left"/>
-          <w:tab w:pos="2268" w:val="left"/>
-        </w:tabs>
-        <w:rPr>
-          <w:spacing w:val="20"/>
-          <w:szCs w:val="20"/>
-        </w:rPr>
-      </w:pPr>
-      <w:r>
-        <w:rPr>
-          <w:spacing w:val="20"/>
-          <w:szCs w:val="20"/>
-        </w:rPr>
-        <w:t xml:space="preserve"> </w:t>
-      </w:r>
     </w:p>
     <w:p>
       <w:pPr>
@@ -12312,19 +13226,20 @@
           <w:spacing w:val="20"/>
           <w:szCs w:val="20"/>
         </w:rPr>
-        <w:t>考慮以下偽代碼，n 為非負整數：</w:t>
-      </w:r>
-    </w:p>
-    <w:p>
-      <w:pPr>
-        <w:tabs>
-          <w:tab w:pos="567" w:val="left"/>
-          <w:tab w:pos="993" w:val="left"/>
-          <w:tab w:pos="1418" w:val="left"/>
-          <w:tab w:pos="1843" w:val="left"/>
-          <w:tab w:pos="2268" w:val="left"/>
-        </w:tabs>
-        <w:snapToGrid w:val="0"/>
+        <w:t>考慮以下偽代碼：</w:t>
+      </w:r>
+    </w:p>
+    <w:p>
+      <w:pPr>
+        <w:tabs>
+          <w:tab w:pos="567" w:val="left"/>
+          <w:tab w:pos="993" w:val="left"/>
+          <w:tab w:pos="1418" w:val="left"/>
+          <w:tab w:pos="1843" w:val="left"/>
+          <w:tab w:pos="2268" w:val="left"/>
+        </w:tabs>
+        <w:snapToGrid w:val="0"/>
+        <w:spacing w:before="120"/>
         <w:ind w:left="567" w:hanging="567"/>
         <w:rPr>
           <w:spacing w:val="20"/>
@@ -12336,8 +13251,7 @@
           <w:rFonts w:ascii="Courier New" w:hAnsi="Courier New"/>
         </w:rPr>
         <w:tab/>
-        <w:tab/>
-        <w:t>輸入 n</w:t>
+        <w:t>total ← 0</w:t>
       </w:r>
     </w:p>
     <w:p>
@@ -12352,34 +13266,33 @@
         <w:snapToGrid w:val="0"/>
         <w:ind w:left="567" w:hanging="567"/>
         <w:rPr>
-          <w:rFonts w:ascii="Courier New" w:hAnsi="Courier New" w:cs="Courier New"/>
-          <w:spacing w:val="20"/>
-          <w:szCs w:val="20"/>
-        </w:rPr>
-      </w:pPr>
-      <w:r>
-        <w:rPr>
-          <w:rFonts w:ascii="Courier New" w:hAnsi="Courier New" w:cs="Courier New"/>
-          <w:spacing w:val="20"/>
-          <w:szCs w:val="20"/>
-        </w:rPr>
-        <w:tab/>
-      </w:r>
-      <w:r>
-        <w:rPr>
-          <w:rFonts w:ascii="Courier New" w:hAnsi="Courier New" w:cs="Courier New"/>
-          <w:spacing w:val="20"/>
-          <w:szCs w:val="20"/>
-        </w:rPr>
-        <w:tab/>
-      </w:r>
-      <w:r>
-        <w:rPr>
-          <w:rFonts w:ascii="Courier New" w:hAnsi="Courier New" w:cs="Courier New"/>
-          <w:spacing w:val="20"/>
-          <w:szCs w:val="20"/>
-        </w:rPr>
-        <w:t>若 n = 0 則</w:t>
+          <w:spacing w:val="20"/>
+          <w:szCs w:val="20"/>
+        </w:rPr>
+      </w:pPr>
+      <w:r>
+        <w:rPr>
+          <w:rFonts w:ascii="Courier New" w:hAnsi="Courier New"/>
+          <w:spacing w:val="20"/>
+          <w:szCs w:val="20"/>
+        </w:rPr>
+        <w:tab/>
+      </w:r>
+      <w:r>
+        <w:rPr>
+          <w:rFonts w:ascii="Courier New" w:hAnsi="Courier New"/>
+          <w:spacing w:val="20"/>
+          <w:szCs w:val="20"/>
+        </w:rPr>
+        <w:t>重</w:t>
+      </w:r>
+      <w:r>
+        <w:rPr>
+          <w:rFonts w:ascii="Courier New" w:hAnsi="Courier New"/>
+          <w:spacing w:val="20"/>
+          <w:szCs w:val="20"/>
+        </w:rPr>
+        <w:t>複 i 由 1 至 5</w:t>
       </w:r>
     </w:p>
     <w:p>
@@ -12394,799 +13307,31 @@
         <w:snapToGrid w:val="0"/>
         <w:ind w:left="567" w:hanging="567"/>
         <w:rPr>
-          <w:rFonts w:ascii="Courier New" w:hAnsi="Courier New" w:cs="Courier New"/>
-          <w:spacing w:val="20"/>
-          <w:szCs w:val="20"/>
-        </w:rPr>
-      </w:pPr>
-      <w:r>
-        <w:rPr>
-          <w:rFonts w:ascii="Courier New" w:hAnsi="Courier New" w:cs="Courier New"/>
-          <w:spacing w:val="20"/>
-          <w:szCs w:val="20"/>
-        </w:rPr>
-        <w:tab/>
-      </w:r>
-      <w:r>
-        <w:rPr>
-          <w:rFonts w:ascii="Courier New" w:hAnsi="Courier New" w:cs="Courier New"/>
-          <w:spacing w:val="20"/>
-          <w:szCs w:val="20"/>
-        </w:rPr>
-        <w:tab/>
-      </w:r>
-      <w:r>
-        <w:rPr>
-          <w:rFonts w:ascii="Courier New" w:hAnsi="Courier New" w:cs="Courier New"/>
-          <w:spacing w:val="20"/>
-          <w:szCs w:val="20"/>
-        </w:rPr>
-        <w:tab/>
-        <w:t>輸出 「zero」</w:t>
-      </w:r>
-    </w:p>
-    <w:p>
-      <w:pPr>
-        <w:pStyle w:val="af3"/>
-        <w:tabs>
-          <w:tab w:pos="567" w:val="left"/>
-          <w:tab w:pos="993" w:val="left"/>
-          <w:tab w:pos="1418" w:val="left"/>
-          <w:tab w:pos="1843" w:val="left"/>
-          <w:tab w:pos="2268" w:val="left"/>
-        </w:tabs>
-        <w:snapToGrid w:val="0"/>
+          <w:spacing w:val="20"/>
+          <w:szCs w:val="20"/>
+        </w:rPr>
+      </w:pPr>
+      <w:r>
+        <w:rPr>
+          <w:rFonts w:ascii="Courier New" w:hAnsi="Courier New"/>
+        </w:rPr>
+        <w:tab/>
+        <w:t>total ← total + A[i]</w:t>
+      </w:r>
+    </w:p>
+    <w:p>
+      <w:pPr>
+        <w:tabs>
+          <w:tab w:pos="567" w:val="left"/>
+          <w:tab w:pos="993" w:val="left"/>
+          <w:tab w:pos="1418" w:val="left"/>
+          <w:tab w:pos="1843" w:val="left"/>
+          <w:tab w:pos="2268" w:val="left"/>
+        </w:tabs>
+        <w:snapToGrid w:val="0"/>
+        <w:spacing w:after="120"/>
         <w:ind w:left="567" w:hanging="567"/>
         <w:rPr>
-          <w:rFonts w:ascii="Courier New" w:hAnsi="Courier New" w:cs="Courier New"/>
-          <w:spacing w:val="20"/>
-          <w:szCs w:val="20"/>
-        </w:rPr>
-      </w:pPr>
-      <w:r>
-        <w:rPr>
-          <w:rFonts w:ascii="新細明體" w:hAnsi="新細明體" w:cs="Courier New"/>
-          <w:spacing w:val="20"/>
-          <w:szCs w:val="20"/>
-        </w:rPr>
-        <w:t>測</w:t>
-      </w:r>
-      <w:r>
-        <w:rPr>
-          <w:rFonts w:ascii="新細明體" w:hAnsi="新細明體" w:cs="Courier New"/>
-          <w:spacing w:val="20"/>
-          <w:szCs w:val="20"/>
-        </w:rPr>
-        <w:t>試</w:t>
-      </w:r>
-      <w:r>
-        <w:rPr>
-          <w:rFonts w:ascii="新細明體" w:hAnsi="新細明體" w:cs="Courier New"/>
-          <w:spacing w:val="20"/>
-          <w:szCs w:val="20"/>
-        </w:rPr>
-        <w:t>時</w:t>
-      </w:r>
-      <w:r>
-        <w:rPr>
-          <w:rFonts w:ascii="新細明體" w:hAnsi="新細明體" w:cs="Courier New"/>
-          <w:spacing w:val="20"/>
-          <w:szCs w:val="20"/>
-        </w:rPr>
-        <w:t>下列哪個是適當的邊界個案？</w:t>
-      </w:r>
-    </w:p>
-    <w:p>
-      <w:pPr>
-        <w:tabs>
-          <w:tab w:pos="567" w:val="left"/>
-          <w:tab w:pos="993" w:val="left"/>
-          <w:tab w:pos="1418" w:val="left"/>
-          <w:tab w:pos="1843" w:val="left"/>
-          <w:tab w:pos="2268" w:val="left"/>
-        </w:tabs>
-        <w:snapToGrid w:val="0"/>
-        <w:ind w:left="567" w:hanging="567"/>
-        <w:rPr>
-          <w:rFonts w:ascii="Courier New" w:hAnsi="Courier New" w:cs="Courier New"/>
-          <w:spacing w:val="20"/>
-          <w:szCs w:val="20"/>
-        </w:rPr>
-      </w:pPr>
-      <w:r>
-        <w:rPr>
-          <w:rFonts w:ascii="Courier New" w:hAnsi="Courier New" w:cs="Courier New"/>
-          <w:spacing w:val="20"/>
-          <w:szCs w:val="20"/>
-        </w:rPr>
-        <w:t xml:space="preserve"> </w:t>
-      </w:r>
-      <w:r>
-        <w:rPr>
-          <w:rFonts w:ascii="Courier New" w:hAnsi="Courier New" w:cs="Courier New"/>
-          <w:spacing w:val="20"/>
-          <w:szCs w:val="20"/>
-        </w:rPr>
-        <w:t xml:space="preserve"> </w:t>
-      </w:r>
-      <w:r>
-        <w:rPr>
-          <w:rFonts w:ascii="Courier New" w:hAnsi="Courier New" w:cs="Courier New"/>
-          <w:spacing w:val="20"/>
-          <w:szCs w:val="20"/>
-        </w:rPr>
-        <w:t xml:space="preserve"> </w:t>
-      </w:r>
-    </w:p>
-    <w:p>
-      <w:pPr>
-        <w:tabs>
-          <w:tab w:pos="567" w:val="left"/>
-          <w:tab w:pos="993" w:val="left"/>
-          <w:tab w:pos="1418" w:val="left"/>
-          <w:tab w:pos="1843" w:val="left"/>
-          <w:tab w:pos="2268" w:val="left"/>
-        </w:tabs>
-        <w:snapToGrid w:val="0"/>
-        <w:ind w:left="567" w:hanging="567"/>
-        <w:rPr>
-          <w:rFonts w:ascii="Courier New" w:hAnsi="Courier New" w:cs="Courier New"/>
-          <w:spacing w:val="20"/>
-          <w:szCs w:val="20"/>
-        </w:rPr>
-      </w:pPr>
-      <w:r>
-        <w:rPr>
-          <w:rFonts w:ascii="新細明體" w:hAnsi="新細明體" w:cs="Courier New"/>
-          <w:spacing w:val="20"/>
-          <w:szCs w:val="20"/>
-        </w:rPr>
-        <w:tab/>
-      </w:r>
-      <w:r>
-        <w:rPr>
-          <w:rFonts w:ascii="新細明體" w:hAnsi="新細明體" w:cs="Courier New"/>
-          <w:spacing w:val="20"/>
-          <w:szCs w:val="20"/>
-        </w:rPr>
-        <w:t>A</w:t>
-      </w:r>
-      <w:r>
-        <w:rPr>
-          <w:rFonts w:ascii="新細明體" w:hAnsi="新細明體" w:cs="Courier New"/>
-          <w:spacing w:val="20"/>
-          <w:szCs w:val="20"/>
-        </w:rPr>
-        <w:t>.</w:t>
-      </w:r>
-      <w:r>
-        <w:rPr>
-          <w:rFonts w:ascii="新細明體" w:hAnsi="新細明體" w:cs="Courier New"/>
-          <w:spacing w:val="20"/>
-          <w:szCs w:val="20"/>
-        </w:rPr>
-        <w:tab/>
-        <w:t>n = 0</w:t>
-      </w:r>
-    </w:p>
-    <w:p>
-      <w:pPr>
-        <w:tabs>
-          <w:tab w:pos="567" w:val="left"/>
-          <w:tab w:pos="993" w:val="left"/>
-          <w:tab w:pos="1418" w:val="left"/>
-          <w:tab w:pos="1843" w:val="left"/>
-          <w:tab w:pos="2268" w:val="left"/>
-        </w:tabs>
-        <w:snapToGrid w:val="0"/>
-        <w:ind w:left="567" w:hanging="567"/>
-        <w:rPr>
-          <w:rFonts w:ascii="Courier New" w:hAnsi="Courier New" w:cs="Courier New"/>
-          <w:spacing w:val="20"/>
-          <w:szCs w:val="20"/>
-        </w:rPr>
-      </w:pPr>
-      <w:r>
-        <w:rPr>
-          <w:rFonts w:ascii="新細明體" w:hAnsi="新細明體" w:cs="Courier New"/>
-          <w:spacing w:val="20"/>
-          <w:szCs w:val="20"/>
-        </w:rPr>
-        <w:tab/>
-      </w:r>
-      <w:r>
-        <w:rPr>
-          <w:rFonts w:ascii="新細明體" w:hAnsi="新細明體" w:cs="Courier New"/>
-          <w:spacing w:val="20"/>
-          <w:szCs w:val="20"/>
-        </w:rPr>
-        <w:t>B</w:t>
-      </w:r>
-      <w:r>
-        <w:rPr>
-          <w:rFonts w:ascii="新細明體" w:hAnsi="新細明體" w:cs="Courier New"/>
-          <w:spacing w:val="20"/>
-          <w:szCs w:val="20"/>
-        </w:rPr>
-        <w:t>.</w:t>
-        <w:tab/>
-        <w:t>只測試 n = 1</w:t>
-      </w:r>
-    </w:p>
-    <w:p>
-      <w:pPr>
-        <w:tabs>
-          <w:tab w:pos="567" w:val="left"/>
-          <w:tab w:pos="993" w:val="left"/>
-          <w:tab w:pos="1418" w:val="left"/>
-          <w:tab w:pos="1843" w:val="left"/>
-          <w:tab w:pos="2268" w:val="left"/>
-        </w:tabs>
-        <w:snapToGrid w:val="0"/>
-        <w:ind w:left="567" w:hanging="567"/>
-        <w:rPr>
-          <w:spacing w:val="20"/>
-          <w:szCs w:val="20"/>
-        </w:rPr>
-      </w:pPr>
-      <w:r>
-        <w:rPr>
-          <w:rFonts w:ascii="新細明體" w:hAnsi="新細明體" w:cs="Courier New"/>
-          <w:spacing w:val="20"/>
-          <w:szCs w:val="20"/>
-        </w:rPr>
-        <w:tab/>
-      </w:r>
-      <w:r>
-        <w:rPr>
-          <w:rFonts w:ascii="新細明體" w:hAnsi="新細明體" w:cs="Courier New"/>
-          <w:spacing w:val="20"/>
-          <w:szCs w:val="20"/>
-        </w:rPr>
-        <w:t>C</w:t>
-      </w:r>
-      <w:r>
-        <w:rPr>
-          <w:rFonts w:ascii="新細明體" w:hAnsi="新細明體" w:cs="Courier New"/>
-          <w:spacing w:val="20"/>
-          <w:szCs w:val="20"/>
-        </w:rPr>
-        <w:t>.</w:t>
-      </w:r>
-      <w:r>
-        <w:rPr>
-          <w:rFonts w:ascii="新細明體" w:hAnsi="新細明體" w:cs="Courier New"/>
-          <w:spacing w:val="20"/>
-          <w:szCs w:val="20"/>
-        </w:rPr>
-        <w:tab/>
-        <w:t>n = 5</w:t>
-      </w:r>
-    </w:p>
-    <w:p>
-      <w:pPr>
-        <w:tabs>
-          <w:tab w:pos="567" w:val="left"/>
-          <w:tab w:pos="993" w:val="left"/>
-          <w:tab w:pos="1418" w:val="left"/>
-          <w:tab w:pos="1843" w:val="left"/>
-          <w:tab w:pos="2268" w:val="left"/>
-        </w:tabs>
-        <w:snapToGrid w:val="0"/>
-        <w:ind w:left="567" w:hanging="567"/>
-        <w:rPr>
-          <w:spacing w:val="20"/>
-          <w:szCs w:val="20"/>
-        </w:rPr>
-      </w:pPr>
-      <w:r>
-        <w:rPr>
-          <w:rFonts w:ascii="新細明體" w:hAnsi="新細明體"/>
-        </w:rPr>
-        <w:tab/>
-        <w:t>D.</w:t>
-        <w:tab/>
-        <w:t>n = -1 且 n = 10</w:t>
-      </w:r>
-    </w:p>
-    <w:p>
-      <w:pPr>
-        <w:tabs>
-          <w:tab w:pos="567" w:val="left"/>
-          <w:tab w:pos="993" w:val="left"/>
-          <w:tab w:pos="1418" w:val="left"/>
-          <w:tab w:pos="1843" w:val="left"/>
-          <w:tab w:pos="2268" w:val="left"/>
-        </w:tabs>
-        <w:snapToGrid w:val="0"/>
-        <w:spacing w:before="0" w:after="0" w:lineRule="exact" w:line="20"/>
-        <w:ind w:left="567" w:hanging="567"/>
-        <w:rPr>
-          <w:rFonts w:ascii="Courier New" w:hAnsi="Courier New" w:cs="Courier New"/>
-          <w:spacing w:val="20"/>
-          <w:szCs w:val="20"/>
-        </w:rPr>
-      </w:pPr>
-      <w:r>
-        <w:rPr>
-          <w:spacing w:val="20"/>
-          <w:szCs w:val="20"/>
-        </w:rPr>
-        <w:t xml:space="preserve"> </w:t>
-      </w:r>
-      <w:r>
-        <w:rPr>
-          <w:spacing w:val="20"/>
-          <w:szCs w:val="20"/>
-        </w:rPr>
-        <w:t xml:space="preserve"> </w:t>
-      </w:r>
-      <w:r>
-        <w:rPr>
-          <w:rFonts w:ascii="Courier New" w:hAnsi="Courier New" w:cs="Courier New"/>
-          <w:spacing w:val="20"/>
-          <w:szCs w:val="20"/>
-        </w:rPr>
-        <w:t xml:space="preserve"> </w:t>
-      </w:r>
-    </w:p>
-    <w:p>
-      <w:pPr>
-        <w:tabs>
-          <w:tab w:pos="567" w:val="left"/>
-          <w:tab w:pos="993" w:val="left"/>
-          <w:tab w:pos="1418" w:val="left"/>
-          <w:tab w:pos="1843" w:val="left"/>
-          <w:tab w:pos="2268" w:val="left"/>
-        </w:tabs>
-        <w:snapToGrid w:val="0"/>
-        <w:spacing w:before="0" w:after="0" w:lineRule="exact" w:line="20"/>
-        <w:ind w:left="567" w:hanging="567"/>
-        <w:rPr>
-          <w:spacing w:val="20"/>
-          <w:szCs w:val="20"/>
-        </w:rPr>
-      </w:pPr>
-      <w:r>
-        <w:rPr>
-          <w:spacing w:val="20"/>
-          <w:szCs w:val="20"/>
-        </w:rPr>
-        <w:t xml:space="preserve"> </w:t>
-      </w:r>
-      <w:r>
-        <w:rPr>
-          <w:spacing w:val="20"/>
-          <w:szCs w:val="20"/>
-        </w:rPr>
-        <w:t xml:space="preserve"> </w:t>
-      </w:r>
-      <w:r>
-        <w:rPr>
-          <w:rFonts w:ascii="Courier New" w:hAnsi="Courier New" w:cs="Courier New"/>
-          <w:spacing w:val="20"/>
-          <w:szCs w:val="20"/>
-        </w:rPr>
-        <w:t xml:space="preserve"> </w:t>
-      </w:r>
-    </w:p>
-    <w:p>
-      <w:pPr>
-        <w:tabs>
-          <w:tab w:pos="567" w:val="left"/>
-          <w:tab w:pos="993" w:val="left"/>
-          <w:tab w:pos="1418" w:val="left"/>
-          <w:tab w:pos="1843" w:val="left"/>
-          <w:tab w:pos="2268" w:val="left"/>
-        </w:tabs>
-        <w:snapToGrid w:val="0"/>
-        <w:spacing w:before="0" w:after="0" w:lineRule="exact" w:line="20"/>
-        <w:ind w:left="567" w:hanging="567"/>
-        <w:rPr>
-          <w:spacing w:val="20"/>
-          <w:szCs w:val="20"/>
-        </w:rPr>
-      </w:pPr>
-      <w:r>
-        <w:rPr>
-          <w:spacing w:val="20"/>
-          <w:szCs w:val="20"/>
-        </w:rPr>
-        <w:t xml:space="preserve"> </w:t>
-      </w:r>
-      <w:r>
-        <w:rPr>
-          <w:spacing w:val="20"/>
-          <w:szCs w:val="20"/>
-        </w:rPr>
-        <w:t xml:space="preserve"> </w:t>
-      </w:r>
-      <w:r>
-        <w:rPr>
-          <w:rFonts w:ascii="Courier New" w:hAnsi="Courier New" w:cs="Courier New"/>
-          <w:spacing w:val="20"/>
-          <w:szCs w:val="20"/>
-        </w:rPr>
-        <w:t xml:space="preserve"> </w:t>
-      </w:r>
-    </w:p>
-    <w:p>
-      <w:pPr>
-        <w:tabs>
-          <w:tab w:pos="567" w:val="left"/>
-          <w:tab w:pos="993" w:val="left"/>
-          <w:tab w:pos="1418" w:val="left"/>
-          <w:tab w:pos="1843" w:val="left"/>
-          <w:tab w:pos="2268" w:val="left"/>
-        </w:tabs>
-        <w:snapToGrid w:val="0"/>
-        <w:spacing w:before="0" w:after="0" w:lineRule="exact" w:line="20"/>
-        <w:ind w:left="567" w:hanging="567"/>
-        <w:rPr>
-          <w:rFonts w:ascii="Courier New" w:hAnsi="Courier New" w:cs="Courier New"/>
-          <w:spacing w:val="20"/>
-          <w:szCs w:val="20"/>
-        </w:rPr>
-      </w:pPr>
-      <w:r>
-        <w:rPr>
-          <w:spacing w:val="20"/>
-          <w:szCs w:val="20"/>
-        </w:rPr>
-        <w:t xml:space="preserve"> </w:t>
-      </w:r>
-      <w:r>
-        <w:rPr>
-          <w:spacing w:val="20"/>
-          <w:szCs w:val="20"/>
-        </w:rPr>
-        <w:t xml:space="preserve"> </w:t>
-      </w:r>
-      <w:r>
-        <w:rPr>
-          <w:rFonts w:ascii="Courier New" w:hAnsi="Courier New" w:cs="Courier New"/>
-          <w:spacing w:val="20"/>
-          <w:szCs w:val="20"/>
-        </w:rPr>
-        <w:t xml:space="preserve"> </w:t>
-      </w:r>
-      <w:r>
-        <w:rPr>
-          <w:rFonts w:ascii="Courier New" w:hAnsi="Courier New" w:cs="Courier New"/>
-          <w:spacing w:val="20"/>
-          <w:szCs w:val="20"/>
-        </w:rPr>
-        <w:t xml:space="preserve"> </w:t>
-      </w:r>
-    </w:p>
-    <w:p>
-      <w:pPr>
-        <w:tabs>
-          <w:tab w:pos="567" w:val="left"/>
-          <w:tab w:pos="993" w:val="left"/>
-          <w:tab w:pos="1418" w:val="left"/>
-          <w:tab w:pos="1843" w:val="left"/>
-          <w:tab w:pos="2268" w:val="left"/>
-        </w:tabs>
-        <w:snapToGrid w:val="0"/>
-        <w:ind w:left="567" w:hanging="567"/>
-        <w:rPr>
-          <w:spacing w:val="20"/>
-          <w:szCs w:val="20"/>
-        </w:rPr>
-      </w:pPr>
-    </w:p>
-    <w:p>
-      <w:pPr>
-        <w:widowControl/>
-        <w:tabs>
-          <w:tab w:pos="567" w:val="left"/>
-          <w:tab w:pos="993" w:val="left"/>
-          <w:tab w:pos="1418" w:val="left"/>
-          <w:tab w:pos="1843" w:val="left"/>
-          <w:tab w:pos="2268" w:val="left"/>
-        </w:tabs>
-        <w:snapToGrid w:val="0"/>
-        <w:rPr>
-          <w:spacing w:val="20"/>
-          <w:szCs w:val="20"/>
-        </w:rPr>
-      </w:pPr>
-    </w:p>
-    <w:p>
-      <w:pPr>
-        <w:pStyle w:val="af3"/>
-        <w:numPr>
-          <w:ilvl w:val="0"/>
-          <w:numId w:val="2"/>
-        </w:numPr>
-        <w:tabs>
-          <w:tab w:pos="567" w:val="left"/>
-          <w:tab w:pos="993" w:val="left"/>
-          <w:tab w:pos="1418" w:val="left"/>
-          <w:tab w:pos="1843" w:val="left"/>
-          <w:tab w:pos="2268" w:val="left"/>
-        </w:tabs>
-        <w:snapToGrid w:val="0"/>
-        <w:ind w:leftChars="0" w:left="567" w:hanging="567"/>
-        <w:rPr>
-          <w:spacing w:val="20"/>
-          <w:szCs w:val="20"/>
-        </w:rPr>
-      </w:pPr>
-      <w:r>
-        <w:rPr>
-          <w:rFonts w:hint="eastAsia" w:ascii="新細明體" w:hAnsi="新細明體"/>
-          <w:spacing w:val="20"/>
-          <w:szCs w:val="20"/>
-        </w:rPr>
-        <w:t>下列哪一項是正確的賦值語句（偽代碼）？</w:t>
-      </w:r>
-    </w:p>
-    <w:p>
-      <w:pPr>
-        <w:tabs>
-          <w:tab w:pos="567" w:val="left"/>
-          <w:tab w:pos="993" w:val="left"/>
-          <w:tab w:pos="1418" w:val="left"/>
-          <w:tab w:pos="1843" w:val="left"/>
-          <w:tab w:pos="2268" w:val="left"/>
-        </w:tabs>
-        <w:snapToGrid w:val="0"/>
-        <w:rPr>
-          <w:spacing w:val="20"/>
-          <w:szCs w:val="20"/>
-        </w:rPr>
-      </w:pPr>
-    </w:p>
-    <w:p>
-      <w:pPr>
-        <w:tabs>
-          <w:tab w:pos="567" w:val="left"/>
-          <w:tab w:pos="993" w:val="left"/>
-          <w:tab w:pos="1418" w:val="left"/>
-          <w:tab w:pos="1843" w:val="left"/>
-          <w:tab w:pos="2268" w:val="left"/>
-        </w:tabs>
-        <w:snapToGrid w:val="0"/>
-        <w:ind w:left="567" w:hanging="567"/>
-        <w:rPr>
-          <w:spacing w:val="20"/>
-          <w:szCs w:val="20"/>
-        </w:rPr>
-      </w:pPr>
-      <w:r>
-        <w:rPr>
-          <w:rFonts w:hint="eastAsia" w:ascii="Courier New" w:hAnsi="Courier New"/>
-          <w:spacing w:val="20"/>
-          <w:szCs w:val="20"/>
-        </w:rPr>
-        <w:tab/>
-      </w:r>
-      <w:r>
-        <w:rPr>
-          <w:rFonts w:hint="eastAsia" w:ascii="Courier New" w:hAnsi="Courier New"/>
-          <w:spacing w:val="20"/>
-          <w:szCs w:val="20"/>
-        </w:rPr>
-        <w:t>A</w:t>
-      </w:r>
-      <w:r>
-        <w:rPr>
-          <w:rFonts w:hint="eastAsia" w:ascii="Courier New" w:hAnsi="Courier New"/>
-          <w:spacing w:val="20"/>
-          <w:szCs w:val="20"/>
-        </w:rPr>
-        <w:t>.</w:t>
-        <w:tab/>
-        <w:t>count ← count + 1</w:t>
-      </w:r>
-    </w:p>
-    <w:p>
-      <w:pPr>
-        <w:tabs>
-          <w:tab w:pos="567" w:val="left"/>
-          <w:tab w:pos="993" w:val="left"/>
-          <w:tab w:pos="1418" w:val="left"/>
-          <w:tab w:pos="1843" w:val="left"/>
-          <w:tab w:pos="2268" w:val="left"/>
-        </w:tabs>
-        <w:snapToGrid w:val="0"/>
-        <w:ind w:left="567" w:hanging="567"/>
-        <w:rPr>
-          <w:spacing w:val="20"/>
-          <w:szCs w:val="20"/>
-        </w:rPr>
-      </w:pPr>
-      <w:r>
-        <w:rPr>
-          <w:rFonts w:hint="eastAsia" w:ascii="Courier New" w:hAnsi="Courier New"/>
-          <w:spacing w:val="20"/>
-          <w:szCs w:val="20"/>
-        </w:rPr>
-        <w:tab/>
-      </w:r>
-      <w:r>
-        <w:rPr>
-          <w:rFonts w:hint="eastAsia" w:ascii="Courier New" w:hAnsi="Courier New"/>
-          <w:spacing w:val="20"/>
-          <w:szCs w:val="20"/>
-        </w:rPr>
-        <w:t>B</w:t>
-      </w:r>
-      <w:r>
-        <w:rPr>
-          <w:rFonts w:hint="eastAsia" w:ascii="Courier New" w:hAnsi="Courier New"/>
-          <w:spacing w:val="20"/>
-          <w:szCs w:val="20"/>
-        </w:rPr>
-        <w:t>.</w:t>
-        <w:tab/>
-        <w:t>count + 1 ← count</w:t>
-      </w:r>
-    </w:p>
-    <w:p>
-      <w:pPr>
-        <w:tabs>
-          <w:tab w:pos="567" w:val="left"/>
-          <w:tab w:pos="993" w:val="left"/>
-          <w:tab w:pos="1418" w:val="left"/>
-          <w:tab w:pos="1843" w:val="left"/>
-          <w:tab w:pos="2268" w:val="left"/>
-        </w:tabs>
-        <w:snapToGrid w:val="0"/>
-        <w:ind w:left="567" w:hanging="567"/>
-        <w:rPr>
-          <w:spacing w:val="20"/>
-          <w:szCs w:val="20"/>
-        </w:rPr>
-      </w:pPr>
-      <w:r>
-        <w:rPr>
-          <w:rFonts w:hint="eastAsia" w:ascii="Courier New" w:hAnsi="Courier New"/>
-          <w:spacing w:val="20"/>
-          <w:szCs w:val="20"/>
-        </w:rPr>
-        <w:tab/>
-      </w:r>
-      <w:r>
-        <w:rPr>
-          <w:rFonts w:hint="eastAsia" w:ascii="Courier New" w:hAnsi="Courier New"/>
-          <w:spacing w:val="20"/>
-          <w:szCs w:val="20"/>
-        </w:rPr>
-        <w:t>C</w:t>
-      </w:r>
-      <w:r>
-        <w:rPr>
-          <w:rFonts w:hint="eastAsia" w:ascii="Courier New" w:hAnsi="Courier New"/>
-          <w:spacing w:val="20"/>
-          <w:szCs w:val="20"/>
-        </w:rPr>
-        <w:t>.</w:t>
-        <w:tab/>
-        <w:t>count ← ← 1</w:t>
-      </w:r>
-    </w:p>
-    <w:p>
-      <w:pPr>
-        <w:tabs>
-          <w:tab w:pos="567" w:val="left"/>
-          <w:tab w:pos="993" w:val="left"/>
-          <w:tab w:pos="1418" w:val="left"/>
-          <w:tab w:pos="1843" w:val="left"/>
-          <w:tab w:pos="2268" w:val="left"/>
-        </w:tabs>
-        <w:snapToGrid w:val="0"/>
-        <w:ind w:left="567" w:hanging="567"/>
-        <w:rPr>
-          <w:spacing w:val="20"/>
-          <w:szCs w:val="20"/>
-        </w:rPr>
-      </w:pPr>
-      <w:r>
-        <w:rPr>
-          <w:rFonts w:hint="eastAsia" w:ascii="新細明體" w:hAnsi="新細明體"/>
-          <w:spacing w:val="20"/>
-          <w:szCs w:val="20"/>
-        </w:rPr>
-        <w:tab/>
-      </w:r>
-      <w:r>
-        <w:rPr>
-          <w:rFonts w:hint="eastAsia" w:ascii="新細明體" w:hAnsi="新細明體"/>
-          <w:spacing w:val="20"/>
-          <w:szCs w:val="20"/>
-        </w:rPr>
-        <w:t>D</w:t>
-      </w:r>
-      <w:r>
-        <w:rPr>
-          <w:rFonts w:hint="eastAsia" w:ascii="新細明體" w:hAnsi="新細明體"/>
-          <w:spacing w:val="20"/>
-          <w:szCs w:val="20"/>
-        </w:rPr>
-        <w:t>.</w:t>
-        <w:tab/>
-        <w:t>count == count + 1</w:t>
-      </w:r>
-    </w:p>
-    <w:p>
-      <w:pPr>
-        <w:tabs>
-          <w:tab w:pos="567" w:val="left"/>
-          <w:tab w:pos="993" w:val="left"/>
-          <w:tab w:pos="1418" w:val="left"/>
-          <w:tab w:pos="1843" w:val="left"/>
-          <w:tab w:pos="2268" w:val="left"/>
-        </w:tabs>
-        <w:snapToGrid w:val="0"/>
-        <w:ind w:left="567" w:hanging="567"/>
-        <w:rPr>
-          <w:spacing w:val="20"/>
-          <w:szCs w:val="20"/>
-        </w:rPr>
-      </w:pPr>
-    </w:p>
-    <w:p>
-      <w:pPr>
-        <w:tabs>
-          <w:tab w:pos="567" w:val="left"/>
-          <w:tab w:pos="993" w:val="left"/>
-          <w:tab w:pos="1418" w:val="left"/>
-          <w:tab w:pos="1843" w:val="left"/>
-          <w:tab w:pos="2268" w:val="left"/>
-        </w:tabs>
-        <w:snapToGrid w:val="0"/>
-        <w:ind w:left="567" w:hanging="567"/>
-        <w:rPr>
-          <w:spacing w:val="20"/>
-          <w:szCs w:val="20"/>
-        </w:rPr>
-      </w:pPr>
-    </w:p>
-    <w:p>
-      <w:pPr>
-        <w:pStyle w:val="af3"/>
-        <w:numPr>
-          <w:ilvl w:val="0"/>
-          <w:numId w:val="2"/>
-        </w:numPr>
-        <w:tabs>
-          <w:tab w:pos="567" w:val="left"/>
-          <w:tab w:pos="993" w:val="left"/>
-          <w:tab w:pos="1418" w:val="left"/>
-          <w:tab w:pos="1843" w:val="left"/>
-          <w:tab w:pos="2268" w:val="left"/>
-        </w:tabs>
-        <w:snapToGrid w:val="0"/>
-        <w:ind w:leftChars="0" w:left="567" w:hanging="567"/>
-        <w:rPr>
-          <w:spacing w:val="20"/>
-          <w:szCs w:val="20"/>
-        </w:rPr>
-      </w:pPr>
-      <w:r>
-        <w:rPr>
-          <w:rFonts w:hint="eastAsia" w:ascii="新細明體" w:hAnsi="新細明體"/>
-          <w:spacing w:val="20"/>
-          <w:szCs w:val="20"/>
-        </w:rPr>
-        <w:t>考慮以下偽代碼：</w:t>
-      </w:r>
-    </w:p>
-    <w:p>
-      <w:pPr>
-        <w:tabs>
-          <w:tab w:pos="567" w:val="left"/>
-          <w:tab w:pos="993" w:val="left"/>
-          <w:tab w:pos="1418" w:val="left"/>
-          <w:tab w:pos="1843" w:val="left"/>
-          <w:tab w:pos="2268" w:val="left"/>
-        </w:tabs>
-        <w:snapToGrid w:val="0"/>
-        <w:ind w:left="567" w:hanging="567"/>
-        <w:rPr>
           <w:spacing w:val="20"/>
           <w:szCs w:val="20"/>
         </w:rPr>
@@ -13194,35 +13339,18 @@
       <w:r>
         <w:rPr>
           <w:rFonts w:ascii="Courier New" w:hAnsi="Courier New"/>
-        </w:rPr>
-        <w:tab/>
-        <w:tab/>
-        <w:t>total ← 0</w:t>
-      </w:r>
-    </w:p>
-    <w:p>
-      <w:pPr>
-        <w:tabs>
-          <w:tab w:pos="567" w:val="left"/>
-          <w:tab w:pos="993" w:val="left"/>
-          <w:tab w:pos="1418" w:val="left"/>
-          <w:tab w:pos="1843" w:val="left"/>
-          <w:tab w:pos="2268" w:val="left"/>
-        </w:tabs>
-        <w:snapToGrid w:val="0"/>
-        <w:ind w:left="567" w:hanging="567"/>
-        <w:rPr>
-          <w:spacing w:val="20"/>
-          <w:szCs w:val="20"/>
-        </w:rPr>
-      </w:pPr>
+          <w:spacing w:val="20"/>
+          <w:szCs w:val="20"/>
+        </w:rPr>
+        <w:tab/>
+      </w:r>
       <w:r>
         <w:rPr>
           <w:rFonts w:ascii="Courier New" w:hAnsi="Courier New"/>
           <w:spacing w:val="20"/>
           <w:szCs w:val="20"/>
         </w:rPr>
-        <w:tab/>
+        <w:t>輸</w:t>
       </w:r>
       <w:r>
         <w:rPr>
@@ -13230,81 +13358,7 @@
           <w:spacing w:val="20"/>
           <w:szCs w:val="20"/>
         </w:rPr>
-        <w:tab/>
-      </w:r>
-      <w:r>
-        <w:rPr>
-          <w:rFonts w:ascii="Courier New" w:hAnsi="Courier New"/>
-          <w:spacing w:val="20"/>
-          <w:szCs w:val="20"/>
-        </w:rPr>
-        <w:t>重複 i 由 1 至 5</w:t>
-      </w:r>
-    </w:p>
-    <w:p>
-      <w:pPr>
-        <w:tabs>
-          <w:tab w:pos="567" w:val="left"/>
-          <w:tab w:pos="993" w:val="left"/>
-          <w:tab w:pos="1418" w:val="left"/>
-          <w:tab w:pos="1843" w:val="left"/>
-          <w:tab w:pos="2268" w:val="left"/>
-        </w:tabs>
-        <w:snapToGrid w:val="0"/>
-        <w:ind w:left="567" w:hanging="567"/>
-        <w:rPr>
-          <w:spacing w:val="20"/>
-          <w:szCs w:val="20"/>
-        </w:rPr>
-      </w:pPr>
-      <w:r>
-        <w:rPr>
-          <w:rFonts w:ascii="Courier New" w:hAnsi="Courier New"/>
-        </w:rPr>
-        <w:tab/>
-        <w:tab/>
-        <w:t>total ← total + A[i]</w:t>
-      </w:r>
-    </w:p>
-    <w:p>
-      <w:pPr>
-        <w:tabs>
-          <w:tab w:pos="567" w:val="left"/>
-          <w:tab w:pos="993" w:val="left"/>
-          <w:tab w:pos="1418" w:val="left"/>
-          <w:tab w:pos="1843" w:val="left"/>
-          <w:tab w:pos="2268" w:val="left"/>
-        </w:tabs>
-        <w:snapToGrid w:val="0"/>
-        <w:ind w:left="567" w:hanging="567"/>
-        <w:rPr>
-          <w:spacing w:val="20"/>
-          <w:szCs w:val="20"/>
-        </w:rPr>
-      </w:pPr>
-      <w:r>
-        <w:rPr>
-          <w:rFonts w:ascii="Courier New" w:hAnsi="Courier New"/>
-          <w:spacing w:val="20"/>
-          <w:szCs w:val="20"/>
-        </w:rPr>
-        <w:tab/>
-      </w:r>
-      <w:r>
-        <w:rPr>
-          <w:rFonts w:ascii="Courier New" w:hAnsi="Courier New"/>
-          <w:spacing w:val="20"/>
-          <w:szCs w:val="20"/>
-        </w:rPr>
-        <w:tab/>
-      </w:r>
-      <w:r>
-        <w:rPr>
-          <w:rFonts w:ascii="Courier New" w:hAnsi="Courier New"/>
-          <w:spacing w:val="20"/>
-          <w:szCs w:val="20"/>
-        </w:rPr>
-        <w:t>輸出 total</w:t>
+        <w:t>出 total</w:t>
       </w:r>
     </w:p>
     <w:p>

</xml_diff>

<commit_message>
Refresh 25/26 S5 ICT Exam02 MCQs and Section B stems, and add intra-exam MCQ duplicate checks.
Replace generic MCQ slots with DSE-style items, revise b-01/b-02 written wording and model answers, and extend quality-check to flag near-duplicate MCQ stems and narrow concept overlap.

Co-authored-by: Cursor <cursoragent@cursor.com>
</commit_message>
<xml_diff>
--- a/Subjects/S5-ICT/past-papers/2025-2026/Term 02/WrittenExam/25_26_S5_ICT_Exam02.docx
+++ b/Subjects/S5-ICT/past-papers/2025-2026/Term 02/WrittenExam/25_26_S5_ICT_Exam02.docx
@@ -2406,39 +2406,39 @@
           <w:spacing w:val="20"/>
           <w:szCs w:val="20"/>
         </w:rPr>
-        <w:t>圖</w:t>
-      </w:r>
-      <w:r>
-        <w:rPr>
-          <w:rFonts w:hint="eastAsia" w:ascii="新細明體" w:hAnsi="新細明體"/>
-          <w:spacing w:val="20"/>
-          <w:szCs w:val="20"/>
-        </w:rPr>
-        <w:t>書</w:t>
-      </w:r>
-      <w:r>
-        <w:rPr>
-          <w:rFonts w:hint="eastAsia" w:ascii="新細明體" w:hAnsi="新細明體"/>
-          <w:spacing w:val="20"/>
-          <w:szCs w:val="20"/>
-        </w:rPr>
-        <w:t>館</w:t>
-      </w:r>
-      <w:r>
-        <w:rPr>
-          <w:rFonts w:hint="eastAsia" w:ascii="新細明體" w:hAnsi="新細明體"/>
-          <w:spacing w:val="20"/>
-          <w:szCs w:val="20"/>
-        </w:rPr>
-        <w:t>資</w:t>
-      </w:r>
-      <w:r>
-        <w:rPr>
-          <w:rFonts w:hint="eastAsia" w:ascii="新細明體" w:hAnsi="新細明體"/>
-          <w:spacing w:val="20"/>
-          <w:szCs w:val="20"/>
-        </w:rPr>
-        <w:t>料表 MEMBER(MID, Name) 與 LOAN(MID, BookID)。下列哪項正確？</w:t>
+        <w:t>下</w:t>
+      </w:r>
+      <w:r>
+        <w:rPr>
+          <w:rFonts w:hint="eastAsia" w:ascii="新細明體" w:hAnsi="新細明體"/>
+          <w:spacing w:val="20"/>
+          <w:szCs w:val="20"/>
+        </w:rPr>
+        <w:t>列</w:t>
+      </w:r>
+      <w:r>
+        <w:rPr>
+          <w:rFonts w:hint="eastAsia" w:ascii="新細明體" w:hAnsi="新細明體"/>
+          <w:spacing w:val="20"/>
+          <w:szCs w:val="20"/>
+        </w:rPr>
+        <w:t>哪</w:t>
+      </w:r>
+      <w:r>
+        <w:rPr>
+          <w:rFonts w:hint="eastAsia" w:ascii="新細明體" w:hAnsi="新細明體"/>
+          <w:spacing w:val="20"/>
+          <w:szCs w:val="20"/>
+        </w:rPr>
+        <w:t>一</w:t>
+      </w:r>
+      <w:r>
+        <w:rPr>
+          <w:rFonts w:hint="eastAsia" w:ascii="新細明體" w:hAnsi="新細明體"/>
+          <w:spacing w:val="20"/>
+          <w:szCs w:val="20"/>
+        </w:rPr>
+        <w:t>項正確描述資料表內的「記錄」？</w:t>
       </w:r>
     </w:p>
     <w:p>
@@ -2497,7 +2497,7 @@
         </w:rPr>
         <w:t>.</w:t>
         <w:tab/>
-        <w:t>LOAN.MID 是外鍵，對應 MEMBER.MID</w:t>
+        <w:t>記錄是資料表內的一列，代表一個實體的完整資料</w:t>
       </w:r>
     </w:p>
     <w:p>
@@ -2540,7 +2540,7 @@
         </w:rPr>
         <w:t>.</w:t>
         <w:tab/>
-        <w:t>Name 是主鍵</w:t>
+        <w:t>記錄是資料表內的一欄，用以儲存同一類型的數據</w:t>
       </w:r>
     </w:p>
     <w:p>
@@ -2590,7 +2590,7 @@
           <w:szCs w:val="20"/>
         </w:rPr>
         <w:tab/>
-        <w:t>MID 可重複出現於 MEMBER</w:t>
+        <w:t>記錄只能儲存數字，不能儲存文字</w:t>
       </w:r>
     </w:p>
     <w:p>
@@ -2633,7 +2633,7 @@
         </w:rPr>
         <w:t>.</w:t>
         <w:tab/>
-        <w:t>BookID 是外鍵</w:t>
+        <w:t>記錄與欄位是同義詞</w:t>
       </w:r>
     </w:p>
     <w:p>
@@ -3029,7 +3029,7 @@
           <w:spacing w:val="20"/>
           <w:szCs w:val="20"/>
         </w:rPr>
-        <w:t>下列哪一項關於數據控制的敘述是正確的？</w:t>
+        <w:t>傳輸數據時，數據會被進行奇偶檢測。以下哪項所接收到的代碼是錯誤的？</w:t>
       </w:r>
     </w:p>
     <w:p>
@@ -3088,7 +3088,7 @@
         </w:rPr>
         <w:t>.</w:t>
         <w:tab/>
-        <w:t>數據控制不能應用於軟件</w:t>
+        <w:t>1001 0100</w:t>
       </w:r>
     </w:p>
     <w:p>
@@ -3131,7 +3131,7 @@
         </w:rPr>
         <w:t>.</w:t>
         <w:tab/>
-        <w:t>數據控制只適用於硬件</w:t>
+        <w:t>0011 1101</w:t>
       </w:r>
     </w:p>
     <w:p>
@@ -3174,7 +3174,7 @@
         </w:rPr>
         <w:t>.</w:t>
         <w:tab/>
-        <w:t>數據控制是有效的資訊處理概念</w:t>
+        <w:t>1111 0101</w:t>
       </w:r>
     </w:p>
     <w:p>
@@ -3217,7 +3217,7 @@
         </w:rPr>
         <w:t>.</w:t>
         <w:tab/>
-        <w:t>數據控制與數據無關</w:t>
+        <w:t>1010 0010</w:t>
       </w:r>
     </w:p>
     <w:p>
@@ -3280,31 +3280,31 @@
           <w:spacing w:val="20"/>
           <w:szCs w:val="20"/>
         </w:rPr>
-        <w:t>某</w:t>
-      </w:r>
-      <w:r>
-        <w:rPr>
-          <w:rFonts w:hint="eastAsia" w:ascii="新細明體" w:hAnsi="新細明體"/>
-          <w:spacing w:val="20"/>
-          <w:szCs w:val="20"/>
-        </w:rPr>
-        <w:t>校</w:t>
-      </w:r>
-      <w:r>
-        <w:rPr>
-          <w:rFonts w:hint="eastAsia" w:ascii="新細明體" w:hAnsi="新細明體"/>
-          <w:spacing w:val="20"/>
-          <w:szCs w:val="20"/>
-        </w:rPr>
-        <w:t>學</w:t>
-      </w:r>
-      <w:r>
-        <w:rPr>
-          <w:rFonts w:hint="eastAsia" w:ascii="新細明體" w:hAnsi="新細明體"/>
-          <w:spacing w:val="20"/>
-          <w:szCs w:val="20"/>
-        </w:rPr>
-        <w:t>會以系統管理會員及活動報名。試算表「Sale」部分資料見下表。以下哪項（些）關於試算表的敘述是正確的？</w:t>
+        <w:t>以</w:t>
+      </w:r>
+      <w:r>
+        <w:rPr>
+          <w:rFonts w:hint="eastAsia" w:ascii="新細明體" w:hAnsi="新細明體"/>
+          <w:spacing w:val="20"/>
+          <w:szCs w:val="20"/>
+        </w:rPr>
+        <w:t>下</w:t>
+      </w:r>
+      <w:r>
+        <w:rPr>
+          <w:rFonts w:hint="eastAsia" w:ascii="新細明體" w:hAnsi="新細明體"/>
+          <w:spacing w:val="20"/>
+          <w:szCs w:val="20"/>
+        </w:rPr>
+        <w:t>哪</w:t>
+      </w:r>
+      <w:r>
+        <w:rPr>
+          <w:rFonts w:hint="eastAsia" w:ascii="新細明體" w:hAnsi="新細明體"/>
+          <w:spacing w:val="20"/>
+          <w:szCs w:val="20"/>
+        </w:rPr>
+        <w:t>個 8 位元數字的二進制補碼數字之值是最大的？</w:t>
       </w:r>
     </w:p>
     <w:p>
@@ -3752,38 +3752,36 @@
       </w:pPr>
       <w:r>
         <w:rPr>
-          <w:rFonts w:hint="eastAsia" w:ascii="Courier New" w:hAnsi="Courier New"/>
-          <w:spacing w:val="20"/>
-          <w:szCs w:val="20"/>
-        </w:rPr>
-        <w:tab/>
-      </w:r>
-      <w:r>
-        <w:rPr>
-          <w:rFonts w:hint="eastAsia" w:ascii="Courier New" w:hAnsi="Courier New"/>
-          <w:spacing w:val="20"/>
-          <w:szCs w:val="20"/>
-        </w:rPr>
-        <w:tab/>
-      </w:r>
-      <w:r>
-        <w:rPr>
-          <w:rFonts w:hint="eastAsia" w:ascii="Courier New" w:hAnsi="Courier New"/>
-          <w:spacing w:val="20"/>
-          <w:szCs w:val="20"/>
-        </w:rPr>
-        <w:t>(</w:t>
-      </w:r>
-      <w:r>
-        <w:rPr>
-          <w:rFonts w:hint="eastAsia" w:ascii="Courier New" w:hAnsi="Courier New"/>
-          <w:spacing w:val="20"/>
-          <w:szCs w:val="20"/>
-        </w:rPr>
-        <w:t>1)</w:t>
-        <w:tab/>
-        <w:t>COUNTIF 可統計符合條件的儲存格個數</w:t>
-        <w:tab/>
+          <w:rFonts w:hint="eastAsia" w:ascii="新細明體" w:hAnsi="新細明體"/>
+          <w:spacing w:val="20"/>
+          <w:szCs w:val="20"/>
+        </w:rPr>
+        <w:tab/>
+      </w:r>
+      <w:r>
+        <w:rPr>
+          <w:rFonts w:hint="eastAsia" w:ascii="新細明體" w:hAnsi="新細明體"/>
+          <w:spacing w:val="20"/>
+          <w:szCs w:val="20"/>
+        </w:rPr>
+        <w:t>A</w:t>
+      </w:r>
+      <w:r>
+        <w:rPr>
+          <w:rFonts w:hint="eastAsia" w:ascii="新細明體" w:hAnsi="新細明體"/>
+          <w:spacing w:val="20"/>
+          <w:szCs w:val="20"/>
+        </w:rPr>
+        <w:t>.</w:t>
+      </w:r>
+      <w:r>
+        <w:rPr>
+          <w:rFonts w:hint="eastAsia" w:ascii="新細明體" w:hAnsi="新細明體"/>
+          <w:spacing w:val="20"/>
+          <w:szCs w:val="20"/>
+        </w:rPr>
+        <w:tab/>
+        <w:t>1000 0001</w:t>
       </w:r>
     </w:p>
     <w:p>
@@ -3804,38 +3802,36 @@
       </w:pPr>
       <w:r>
         <w:rPr>
-          <w:rFonts w:hint="eastAsia" w:ascii="Courier New" w:hAnsi="Courier New"/>
-          <w:spacing w:val="20"/>
-          <w:szCs w:val="20"/>
-        </w:rPr>
-        <w:tab/>
-      </w:r>
-      <w:r>
-        <w:rPr>
-          <w:rFonts w:hint="eastAsia" w:ascii="Courier New" w:hAnsi="Courier New"/>
-          <w:spacing w:val="20"/>
-          <w:szCs w:val="20"/>
-        </w:rPr>
-        <w:tab/>
-      </w:r>
-      <w:r>
-        <w:rPr>
-          <w:rFonts w:hint="eastAsia" w:ascii="Courier New" w:hAnsi="Courier New"/>
-          <w:spacing w:val="20"/>
-          <w:szCs w:val="20"/>
-        </w:rPr>
-        <w:t>(</w:t>
-      </w:r>
-      <w:r>
-        <w:rPr>
-          <w:rFonts w:hint="eastAsia" w:ascii="Courier New" w:hAnsi="Courier New"/>
-          <w:spacing w:val="20"/>
-          <w:szCs w:val="20"/>
-        </w:rPr>
-        <w:t>2)</w:t>
-        <w:tab/>
-        <w:t>SUMIF 加總時毋須指定條件範圍</w:t>
-        <w:tab/>
+          <w:rFonts w:hint="eastAsia" w:ascii="新細明體" w:hAnsi="新細明體"/>
+          <w:spacing w:val="20"/>
+          <w:szCs w:val="20"/>
+        </w:rPr>
+        <w:tab/>
+      </w:r>
+      <w:r>
+        <w:rPr>
+          <w:rFonts w:hint="eastAsia" w:ascii="新細明體" w:hAnsi="新細明體"/>
+          <w:spacing w:val="20"/>
+          <w:szCs w:val="20"/>
+        </w:rPr>
+        <w:t>B</w:t>
+      </w:r>
+      <w:r>
+        <w:rPr>
+          <w:rFonts w:hint="eastAsia" w:ascii="新細明體" w:hAnsi="新細明體"/>
+          <w:spacing w:val="20"/>
+          <w:szCs w:val="20"/>
+        </w:rPr>
+        <w:t>.</w:t>
+      </w:r>
+      <w:r>
+        <w:rPr>
+          <w:rFonts w:hint="eastAsia" w:ascii="新細明體" w:hAnsi="新細明體"/>
+          <w:spacing w:val="20"/>
+          <w:szCs w:val="20"/>
+        </w:rPr>
+        <w:tab/>
+        <w:t>1111 0000</w:t>
       </w:r>
     </w:p>
     <w:p>
@@ -3856,63 +3852,44 @@
       </w:pPr>
       <w:r>
         <w:rPr>
-          <w:rFonts w:hint="eastAsia" w:ascii="Courier New" w:hAnsi="Courier New"/>
-          <w:spacing w:val="20"/>
-          <w:szCs w:val="20"/>
-        </w:rPr>
-        <w:tab/>
-      </w:r>
-      <w:r>
-        <w:rPr>
-          <w:rFonts w:hint="eastAsia" w:ascii="Courier New" w:hAnsi="Courier New"/>
-          <w:spacing w:val="20"/>
-          <w:szCs w:val="20"/>
-        </w:rPr>
-        <w:tab/>
-      </w:r>
-      <w:r>
-        <w:rPr>
-          <w:rFonts w:hint="eastAsia" w:ascii="Courier New" w:hAnsi="Courier New"/>
-          <w:spacing w:val="20"/>
-          <w:szCs w:val="20"/>
-        </w:rPr>
-        <w:t>(</w:t>
-      </w:r>
-      <w:r>
-        <w:rPr>
-          <w:rFonts w:hint="eastAsia" w:ascii="Courier New" w:hAnsi="Courier New"/>
-          <w:spacing w:val="20"/>
-          <w:szCs w:val="20"/>
-        </w:rPr>
-        <w:t>3</w:t>
-      </w:r>
-      <w:r>
-        <w:rPr>
-          <w:rFonts w:hint="eastAsia" w:ascii="Courier New" w:hAnsi="Courier New"/>
-          <w:spacing w:val="20"/>
-          <w:szCs w:val="20"/>
-        </w:rPr>
-        <w:t>)</w:t>
-        <w:tab/>
-        <w:t>XLOOKUP 只能查找同一欄內的數字</w:t>
-        <w:tab/>
-      </w:r>
-    </w:p>
-    <w:p>
-      <w:pPr>
-        <w:tabs>
-          <w:tab w:pos="567" w:val="left"/>
-          <w:tab w:pos="993" w:val="left"/>
-          <w:tab w:pos="1418" w:val="left"/>
-          <w:tab w:pos="1843" w:val="left"/>
-          <w:tab w:pos="2268" w:val="left"/>
-        </w:tabs>
-        <w:snapToGrid w:val="0"/>
-        <w:rPr>
-          <w:spacing w:val="20"/>
-          <w:szCs w:val="20"/>
-        </w:rPr>
-      </w:pPr>
+          <w:rFonts w:hint="eastAsia" w:ascii="新細明體" w:hAnsi="新細明體"/>
+          <w:spacing w:val="20"/>
+          <w:szCs w:val="20"/>
+        </w:rPr>
+        <w:tab/>
+      </w:r>
+      <w:r>
+        <w:rPr>
+          <w:rFonts w:hint="eastAsia" w:ascii="新細明體" w:hAnsi="新細明體"/>
+          <w:spacing w:val="20"/>
+          <w:szCs w:val="20"/>
+        </w:rPr>
+        <w:t>C</w:t>
+      </w:r>
+      <w:r>
+        <w:rPr>
+          <w:rFonts w:hint="eastAsia" w:ascii="新細明體" w:hAnsi="新細明體"/>
+          <w:spacing w:val="20"/>
+          <w:szCs w:val="20"/>
+        </w:rPr>
+        <w:t>.</w:t>
+      </w:r>
+      <w:r>
+        <w:rPr>
+          <w:rFonts w:hint="eastAsia" w:ascii="新細明體" w:hAnsi="新細明體"/>
+          <w:spacing w:val="20"/>
+          <w:szCs w:val="20"/>
+        </w:rPr>
+        <w:tab/>
+      </w:r>
+      <w:r>
+        <w:rPr>
+          <w:rFonts w:hint="eastAsia" w:ascii="新細明體" w:hAnsi="新細明體"/>
+          <w:spacing w:val="20"/>
+          <w:szCs w:val="20"/>
+        </w:rPr>
+        <w:t>1100 0001</w:t>
+      </w:r>
     </w:p>
     <w:p>
       <w:pPr>
@@ -3933,62 +3910,24 @@
       <w:r>
         <w:rPr>
           <w:rFonts w:ascii="新細明體" w:hAnsi="新細明體"/>
-          <w:spacing w:val="20"/>
-          <w:szCs w:val="20"/>
-        </w:rPr>
-        <w:tab/>
-      </w:r>
-      <w:r>
-        <w:rPr>
-          <w:rFonts w:ascii="新細明體" w:hAnsi="新細明體"/>
-          <w:spacing w:val="20"/>
-          <w:szCs w:val="20"/>
-        </w:rPr>
-        <w:t>A</w:t>
-      </w:r>
-      <w:r>
-        <w:rPr>
-          <w:rFonts w:hint="eastAsia" w:ascii="新細明體" w:hAnsi="新細明體"/>
-          <w:spacing w:val="20"/>
-          <w:szCs w:val="20"/>
-        </w:rPr>
-        <w:t>.</w:t>
-      </w:r>
-      <w:r>
-        <w:rPr>
-          <w:rFonts w:hint="eastAsia" w:ascii="新細明體" w:hAnsi="新細明體"/>
-          <w:spacing w:val="20"/>
-          <w:szCs w:val="20"/>
-        </w:rPr>
-        <w:tab/>
-      </w:r>
-      <w:r>
-        <w:rPr>
-          <w:rFonts w:hint="eastAsia" w:ascii="新細明體" w:hAnsi="新細明體"/>
-          <w:spacing w:val="20"/>
-          <w:szCs w:val="20"/>
-        </w:rPr>
-        <w:t>只</w:t>
-      </w:r>
-      <w:r>
-        <w:rPr>
-          <w:rFonts w:hint="eastAsia" w:ascii="新細明體" w:hAnsi="新細明體"/>
-          <w:spacing w:val="20"/>
-          <w:szCs w:val="20"/>
-        </w:rPr>
-        <w:t>有 (1)</w:t>
-      </w:r>
-    </w:p>
-    <w:p>
-      <w:pPr>
-        <w:tabs>
-          <w:tab w:pos="567" w:val="left"/>
-          <w:tab w:pos="993" w:val="left"/>
-          <w:tab w:pos="1418" w:val="left"/>
-          <w:tab w:pos="1843" w:val="left"/>
-          <w:tab w:pos="2268" w:val="left"/>
-        </w:tabs>
-        <w:snapToGrid w:val="0"/>
+        </w:rPr>
+        <w:tab/>
+        <w:t>D.</w:t>
+        <w:tab/>
+        <w:t>1111 1111</w:t>
+      </w:r>
+    </w:p>
+    <w:p>
+      <w:pPr>
+        <w:tabs>
+          <w:tab w:pos="567" w:val="left"/>
+          <w:tab w:pos="993" w:val="left"/>
+          <w:tab w:pos="1418" w:val="left"/>
+          <w:tab w:pos="1843" w:val="left"/>
+          <w:tab w:pos="2268" w:val="left"/>
+        </w:tabs>
+        <w:snapToGrid w:val="0"/>
+        <w:spacing w:before="0" w:after="0" w:lineRule="exact" w:line="20"/>
         <w:ind w:left="567" w:hanging="567"/>
         <w:rPr>
           <w:spacing w:val="20"/>
@@ -3997,63 +3936,62 @@
       </w:pPr>
       <w:r>
         <w:rPr>
-          <w:rFonts w:hint="eastAsia" w:ascii="新細明體" w:hAnsi="新細明體"/>
-          <w:spacing w:val="20"/>
-          <w:szCs w:val="20"/>
-        </w:rPr>
-        <w:tab/>
-      </w:r>
-      <w:r>
-        <w:rPr>
-          <w:rFonts w:hint="eastAsia" w:ascii="新細明體" w:hAnsi="新細明體"/>
-          <w:spacing w:val="20"/>
-          <w:szCs w:val="20"/>
-        </w:rPr>
-        <w:t>B</w:t>
-      </w:r>
-      <w:r>
-        <w:rPr>
-          <w:rFonts w:hint="eastAsia" w:ascii="新細明體" w:hAnsi="新細明體"/>
-          <w:spacing w:val="20"/>
-          <w:szCs w:val="20"/>
-        </w:rPr>
-        <w:t>.</w:t>
-      </w:r>
-      <w:r>
-        <w:rPr>
-          <w:rFonts w:hint="eastAsia" w:ascii="新細明體" w:hAnsi="新細明體"/>
-          <w:spacing w:val="20"/>
-          <w:szCs w:val="20"/>
-        </w:rPr>
-        <w:tab/>
-      </w:r>
-      <w:r>
-        <w:rPr>
-          <w:rFonts w:hint="eastAsia" w:ascii="新細明體" w:hAnsi="新細明體"/>
-          <w:spacing w:val="20"/>
-          <w:szCs w:val="20"/>
-        </w:rPr>
-        <w:t>只</w:t>
-      </w:r>
-      <w:r>
-        <w:rPr>
-          <w:rFonts w:hint="eastAsia" w:ascii="新細明體" w:hAnsi="新細明體"/>
-          <w:spacing w:val="20"/>
-          <w:szCs w:val="20"/>
-        </w:rPr>
-        <w:t>有 (2)</w:t>
-      </w:r>
-    </w:p>
-    <w:p>
-      <w:pPr>
-        <w:tabs>
-          <w:tab w:pos="567" w:val="left"/>
-          <w:tab w:pos="993" w:val="left"/>
-          <w:tab w:pos="1418" w:val="left"/>
-          <w:tab w:pos="1843" w:val="left"/>
-          <w:tab w:pos="2268" w:val="left"/>
-        </w:tabs>
-        <w:snapToGrid w:val="0"/>
+          <w:spacing w:val="20"/>
+          <w:szCs w:val="20"/>
+        </w:rPr>
+        <w:t xml:space="preserve"> </w:t>
+      </w:r>
+      <w:r>
+        <w:rPr>
+          <w:spacing w:val="20"/>
+          <w:szCs w:val="20"/>
+        </w:rPr>
+        <w:t xml:space="preserve"> </w:t>
+      </w:r>
+      <w:r>
+        <w:rPr>
+          <w:rFonts w:hint="eastAsia"/>
+          <w:spacing w:val="20"/>
+          <w:szCs w:val="20"/>
+        </w:rPr>
+        <w:t xml:space="preserve"> </w:t>
+      </w:r>
+      <w:r>
+        <w:rPr>
+          <w:rFonts w:hint="eastAsia"/>
+          <w:spacing w:val="20"/>
+          <w:szCs w:val="20"/>
+        </w:rPr>
+        <w:t xml:space="preserve"> </w:t>
+      </w:r>
+      <w:r>
+        <w:rPr>
+          <w:rFonts w:hint="eastAsia"/>
+          <w:spacing w:val="20"/>
+          <w:szCs w:val="20"/>
+        </w:rPr>
+        <w:t xml:space="preserve"> </w:t>
+      </w:r>
+      <w:r>
+        <w:rPr>
+          <w:rFonts w:hint="eastAsia"/>
+          <w:spacing w:val="20"/>
+          <w:szCs w:val="20"/>
+        </w:rPr>
+        <w:t xml:space="preserve"> </w:t>
+      </w:r>
+    </w:p>
+    <w:p>
+      <w:pPr>
+        <w:tabs>
+          <w:tab w:pos="567" w:val="left"/>
+          <w:tab w:pos="993" w:val="left"/>
+          <w:tab w:pos="1418" w:val="left"/>
+          <w:tab w:pos="1843" w:val="left"/>
+          <w:tab w:pos="2268" w:val="left"/>
+        </w:tabs>
+        <w:snapToGrid w:val="0"/>
+        <w:spacing w:before="0" w:after="0" w:lineRule="exact" w:line="20"/>
         <w:ind w:left="567" w:hanging="567"/>
         <w:rPr>
           <w:spacing w:val="20"/>
@@ -4062,63 +4000,64 @@
       </w:pPr>
       <w:r>
         <w:rPr>
-          <w:rFonts w:hint="eastAsia" w:ascii="新細明體" w:hAnsi="新細明體"/>
-          <w:spacing w:val="20"/>
-          <w:szCs w:val="20"/>
-        </w:rPr>
-        <w:tab/>
-      </w:r>
-      <w:r>
-        <w:rPr>
-          <w:rFonts w:hint="eastAsia" w:ascii="新細明體" w:hAnsi="新細明體"/>
-          <w:spacing w:val="20"/>
-          <w:szCs w:val="20"/>
-        </w:rPr>
-        <w:t>C</w:t>
-      </w:r>
-      <w:r>
-        <w:rPr>
-          <w:rFonts w:hint="eastAsia" w:ascii="新細明體" w:hAnsi="新細明體"/>
-          <w:spacing w:val="20"/>
-          <w:szCs w:val="20"/>
-        </w:rPr>
-        <w:t>.</w:t>
-      </w:r>
-      <w:r>
-        <w:rPr>
-          <w:rFonts w:hint="eastAsia" w:ascii="新細明體" w:hAnsi="新細明體"/>
-          <w:spacing w:val="20"/>
-          <w:szCs w:val="20"/>
-        </w:rPr>
-        <w:tab/>
-      </w:r>
-      <w:r>
-        <w:rPr>
-          <w:rFonts w:hint="eastAsia" w:ascii="新細明體" w:hAnsi="新細明體"/>
-          <w:spacing w:val="20"/>
-          <w:szCs w:val="20"/>
-        </w:rPr>
-        <w:t>只</w:t>
-      </w:r>
-      <w:r>
-        <w:rPr>
-          <w:rFonts w:hint="eastAsia" w:ascii="新細明體" w:hAnsi="新細明體"/>
-          <w:spacing w:val="20"/>
-          <w:szCs w:val="20"/>
-        </w:rPr>
-        <w:t>有 (1) 和 (3)</w:t>
-      </w:r>
-    </w:p>
-    <w:p>
-      <w:pPr>
-        <w:tabs>
-          <w:tab w:pos="567" w:val="left"/>
-          <w:tab w:pos="993" w:val="left"/>
-          <w:tab w:pos="1418" w:val="left"/>
-          <w:tab w:pos="1843" w:val="left"/>
-          <w:tab w:pos="2268" w:val="left"/>
-        </w:tabs>
-        <w:snapToGrid w:val="0"/>
+          <w:rFonts w:hint="eastAsia"/>
+          <w:spacing w:val="20"/>
+          <w:szCs w:val="20"/>
+        </w:rPr>
+        <w:t xml:space="preserve"> </w:t>
+      </w:r>
+      <w:r>
+        <w:rPr>
+          <w:rFonts w:hint="eastAsia"/>
+          <w:spacing w:val="20"/>
+          <w:szCs w:val="20"/>
+        </w:rPr>
+        <w:t xml:space="preserve"> </w:t>
+      </w:r>
+      <w:r>
+        <w:rPr>
+          <w:rFonts w:hint="eastAsia"/>
+          <w:spacing w:val="20"/>
+          <w:szCs w:val="20"/>
+        </w:rPr>
+        <w:t xml:space="preserve"> </w:t>
+      </w:r>
+      <w:r>
+        <w:rPr>
+          <w:rFonts w:hint="eastAsia"/>
+          <w:spacing w:val="20"/>
+          <w:szCs w:val="20"/>
+        </w:rPr>
+        <w:t xml:space="preserve"> </w:t>
+      </w:r>
+      <w:r>
+        <w:rPr>
+          <w:rFonts w:hint="eastAsia"/>
+          <w:spacing w:val="20"/>
+          <w:szCs w:val="20"/>
+        </w:rPr>
+        <w:t xml:space="preserve"> </w:t>
+      </w:r>
+      <w:r>
+        <w:rPr>
+          <w:rFonts w:hint="eastAsia"/>
+          <w:spacing w:val="20"/>
+          <w:szCs w:val="20"/>
+        </w:rPr>
+        <w:t xml:space="preserve"> </w:t>
+      </w:r>
+    </w:p>
+    <w:p>
+      <w:pPr>
+        <w:tabs>
+          <w:tab w:pos="567" w:val="left"/>
+          <w:tab w:pos="993" w:val="left"/>
+          <w:tab w:pos="1418" w:val="left"/>
+          <w:tab w:pos="1843" w:val="left"/>
+          <w:tab w:pos="2268" w:val="left"/>
+        </w:tabs>
+        <w:snapToGrid w:val="0"/>
+        <w:spacing w:before="0" w:after="0" w:lineRule="exact" w:line="20"/>
         <w:ind w:left="567" w:hanging="567"/>
         <w:rPr>
           <w:spacing w:val="20"/>
@@ -4127,59 +4066,125 @@
       </w:pPr>
       <w:r>
         <w:rPr>
-          <w:rFonts w:hint="eastAsia" w:ascii="新細明體" w:hAnsi="新細明體"/>
-          <w:spacing w:val="20"/>
-          <w:szCs w:val="20"/>
-        </w:rPr>
-        <w:tab/>
-      </w:r>
-      <w:r>
-        <w:rPr>
-          <w:rFonts w:hint="eastAsia" w:ascii="新細明體" w:hAnsi="新細明體"/>
-          <w:spacing w:val="20"/>
-          <w:szCs w:val="20"/>
-        </w:rPr>
-        <w:t>D</w:t>
-      </w:r>
-      <w:r>
-        <w:rPr>
-          <w:rFonts w:hint="eastAsia" w:ascii="新細明體" w:hAnsi="新細明體"/>
-          <w:spacing w:val="20"/>
-          <w:szCs w:val="20"/>
-        </w:rPr>
-        <w:t>.</w:t>
-      </w:r>
-      <w:r>
-        <w:rPr>
-          <w:rFonts w:hint="eastAsia" w:ascii="新細明體" w:hAnsi="新細明體"/>
-          <w:spacing w:val="20"/>
-          <w:szCs w:val="20"/>
-        </w:rPr>
-        <w:tab/>
-      </w:r>
-      <w:r>
-        <w:rPr>
-          <w:rFonts w:hint="eastAsia" w:ascii="新細明體" w:hAnsi="新細明體"/>
-          <w:spacing w:val="20"/>
-          <w:szCs w:val="20"/>
-        </w:rPr>
-        <w:t>只</w:t>
-      </w:r>
-      <w:r>
-        <w:rPr>
-          <w:rFonts w:hint="eastAsia" w:ascii="新細明體" w:hAnsi="新細明體"/>
-          <w:spacing w:val="20"/>
-          <w:szCs w:val="20"/>
-        </w:rPr>
-        <w:t>有</w:t>
-      </w:r>
-      <w:r>
-        <w:rPr>
-          <w:rFonts w:hint="eastAsia" w:ascii="新細明體" w:hAnsi="新細明體"/>
-          <w:spacing w:val="20"/>
-          <w:szCs w:val="20"/>
-        </w:rPr>
-        <w:t xml:space="preserve"> (2) 和 (3)</w:t>
+          <w:rFonts w:hint="eastAsia"/>
+          <w:spacing w:val="20"/>
+          <w:szCs w:val="20"/>
+        </w:rPr>
+        <w:t xml:space="preserve"> </w:t>
+      </w:r>
+      <w:r>
+        <w:rPr>
+          <w:rFonts w:hint="eastAsia"/>
+          <w:spacing w:val="20"/>
+          <w:szCs w:val="20"/>
+        </w:rPr>
+        <w:t xml:space="preserve"> </w:t>
+      </w:r>
+      <w:r>
+        <w:rPr>
+          <w:rFonts w:hint="eastAsia"/>
+          <w:spacing w:val="20"/>
+          <w:szCs w:val="20"/>
+        </w:rPr>
+        <w:t xml:space="preserve"> </w:t>
+      </w:r>
+      <w:r>
+        <w:rPr>
+          <w:rFonts w:hint="eastAsia"/>
+          <w:spacing w:val="20"/>
+          <w:szCs w:val="20"/>
+        </w:rPr>
+        <w:t xml:space="preserve"> </w:t>
+      </w:r>
+      <w:r>
+        <w:rPr>
+          <w:rFonts w:hint="eastAsia"/>
+          <w:spacing w:val="20"/>
+          <w:szCs w:val="20"/>
+        </w:rPr>
+        <w:t xml:space="preserve"> </w:t>
+      </w:r>
+      <w:r>
+        <w:rPr>
+          <w:rFonts w:hint="eastAsia"/>
+          <w:spacing w:val="20"/>
+          <w:szCs w:val="20"/>
+        </w:rPr>
+        <w:t xml:space="preserve"> </w:t>
+      </w:r>
+    </w:p>
+    <w:p>
+      <w:pPr>
+        <w:tabs>
+          <w:tab w:pos="567" w:val="left"/>
+          <w:tab w:pos="993" w:val="left"/>
+          <w:tab w:pos="1418" w:val="left"/>
+          <w:tab w:pos="1843" w:val="left"/>
+          <w:tab w:pos="2268" w:val="left"/>
+        </w:tabs>
+        <w:snapToGrid w:val="0"/>
+        <w:spacing w:before="0" w:after="0" w:lineRule="exact" w:line="20"/>
+        <w:ind w:left="567" w:hanging="567"/>
+        <w:rPr>
+          <w:spacing w:val="20"/>
+          <w:szCs w:val="20"/>
+        </w:rPr>
+      </w:pPr>
+      <w:r>
+        <w:rPr>
+          <w:rFonts w:hint="eastAsia"/>
+          <w:spacing w:val="20"/>
+          <w:szCs w:val="20"/>
+        </w:rPr>
+        <w:t xml:space="preserve"> </w:t>
+      </w:r>
+      <w:r>
+        <w:rPr>
+          <w:rFonts w:hint="eastAsia"/>
+          <w:spacing w:val="20"/>
+          <w:szCs w:val="20"/>
+        </w:rPr>
+        <w:t xml:space="preserve"> </w:t>
+      </w:r>
+      <w:r>
+        <w:rPr>
+          <w:rFonts w:hint="eastAsia"/>
+          <w:spacing w:val="20"/>
+          <w:szCs w:val="20"/>
+        </w:rPr>
+        <w:t xml:space="preserve"> </w:t>
+      </w:r>
+      <w:r>
+        <w:rPr>
+          <w:rFonts w:hint="eastAsia"/>
+          <w:spacing w:val="20"/>
+          <w:szCs w:val="20"/>
+        </w:rPr>
+        <w:t xml:space="preserve"> </w:t>
+      </w:r>
+      <w:r>
+        <w:rPr>
+          <w:rFonts w:hint="eastAsia"/>
+          <w:spacing w:val="20"/>
+          <w:szCs w:val="20"/>
+        </w:rPr>
+        <w:t xml:space="preserve"> </w:t>
+      </w:r>
+      <w:r>
+        <w:rPr>
+          <w:rFonts w:hint="eastAsia"/>
+          <w:spacing w:val="20"/>
+          <w:szCs w:val="20"/>
+        </w:rPr>
+        <w:t xml:space="preserve"> </w:t>
+      </w:r>
+      <w:r>
+        <w:rPr>
+          <w:rFonts w:hint="eastAsia"/>
+          <w:spacing w:val="20"/>
+          <w:szCs w:val="20"/>
+        </w:rPr>
+        <w:t xml:space="preserve"> </w:t>
       </w:r>
     </w:p>
     <w:p>
@@ -4267,23 +4272,23 @@
           <w:spacing w:val="20"/>
           <w:szCs w:val="20"/>
         </w:rPr>
-        <w:t>下</w:t>
-      </w:r>
-      <w:r>
-        <w:rPr>
-          <w:rFonts w:hint="eastAsia" w:ascii="新細明體" w:hAnsi="新細明體"/>
-          <w:spacing w:val="20"/>
-          <w:szCs w:val="20"/>
-        </w:rPr>
-        <w:t>列</w:t>
-      </w:r>
-      <w:r>
-        <w:rPr>
-          <w:rFonts w:hint="eastAsia" w:ascii="新細明體" w:hAnsi="新細明體"/>
-          <w:spacing w:val="20"/>
-          <w:szCs w:val="20"/>
-        </w:rPr>
-        <w:t>哪一項關於字元編碼的敘述是正確的？</w:t>
+        <w:t>某</w:t>
+      </w:r>
+      <w:r>
+        <w:rPr>
+          <w:rFonts w:hint="eastAsia" w:ascii="新細明體" w:hAnsi="新細明體"/>
+          <w:spacing w:val="20"/>
+          <w:szCs w:val="20"/>
+        </w:rPr>
+        <w:t>網</w:t>
+      </w:r>
+      <w:r>
+        <w:rPr>
+          <w:rFonts w:hint="eastAsia" w:ascii="新細明體" w:hAnsi="新細明體"/>
+          <w:spacing w:val="20"/>
+          <w:szCs w:val="20"/>
+        </w:rPr>
+        <w:t>站使用 UTF-8 儲存繁體中文內容。下列哪項描述是正確的？</w:t>
       </w:r>
     </w:p>
     <w:p>
@@ -4358,6 +4363,38 @@
           <w:spacing w:val="20"/>
           <w:szCs w:val="20"/>
         </w:rPr>
+        <w:t>每</w:t>
+      </w:r>
+      <w:r>
+        <w:rPr>
+          <w:rFonts w:ascii="新細明體" w:hAnsi="新細明體" w:cs="Courier New"/>
+          <w:spacing w:val="20"/>
+          <w:szCs w:val="20"/>
+        </w:rPr>
+        <w:t>個</w:t>
+      </w:r>
+      <w:r>
+        <w:rPr>
+          <w:rFonts w:ascii="新細明體" w:hAnsi="新細明體" w:cs="Courier New"/>
+          <w:spacing w:val="20"/>
+          <w:szCs w:val="20"/>
+        </w:rPr>
+        <w:t>中</w:t>
+      </w:r>
+      <w:r>
+        <w:rPr>
+          <w:rFonts w:ascii="新細明體" w:hAnsi="新細明體" w:cs="Courier New" w:hint="eastAsia"/>
+          <w:spacing w:val="20"/>
+          <w:szCs w:val="20"/>
+        </w:rPr>
+        <w:t>文</w:t>
+      </w:r>
+      <w:r>
+        <w:rPr>
+          <w:rFonts w:ascii="新細明體" w:hAnsi="新細明體" w:cs="Courier New"/>
+          <w:spacing w:val="20"/>
+          <w:szCs w:val="20"/>
+        </w:rPr>
         <w:t>字</w:t>
       </w:r>
       <w:r>
@@ -4366,39 +4403,7 @@
           <w:spacing w:val="20"/>
           <w:szCs w:val="20"/>
         </w:rPr>
-        <w:t>元</w:t>
-      </w:r>
-      <w:r>
-        <w:rPr>
-          <w:rFonts w:ascii="新細明體" w:hAnsi="新細明體" w:cs="Courier New"/>
-          <w:spacing w:val="20"/>
-          <w:szCs w:val="20"/>
-        </w:rPr>
-        <w:t>編</w:t>
-      </w:r>
-      <w:r>
-        <w:rPr>
-          <w:rFonts w:ascii="新細明體" w:hAnsi="新細明體" w:cs="Courier New" w:hint="eastAsia"/>
-          <w:spacing w:val="20"/>
-          <w:szCs w:val="20"/>
-        </w:rPr>
-        <w:t>碼</w:t>
-      </w:r>
-      <w:r>
-        <w:rPr>
-          <w:rFonts w:ascii="新細明體" w:hAnsi="新細明體" w:cs="Courier New"/>
-          <w:spacing w:val="20"/>
-          <w:szCs w:val="20"/>
-        </w:rPr>
-        <w:t>不</w:t>
-      </w:r>
-      <w:r>
-        <w:rPr>
-          <w:rFonts w:ascii="新細明體" w:hAnsi="新細明體" w:cs="Courier New"/>
-          <w:spacing w:val="20"/>
-          <w:szCs w:val="20"/>
-        </w:rPr>
-        <w:t>能應用於軟件</w:t>
+        <w:t>必定只佔 1 字節</w:t>
       </w:r>
     </w:p>
     <w:p>
@@ -4424,7 +4429,7 @@
         <w:tab/>
         <w:t>B.</w:t>
         <w:tab/>
-        <w:t>字元編碼只適用於硬件</w:t>
+        <w:t>UTF-8 與 ASCII 完全相容，所有字符均佔 1 字節</w:t>
       </w:r>
     </w:p>
     <w:p>
@@ -4467,7 +4472,7 @@
         </w:rPr>
         <w:t>.</w:t>
         <w:tab/>
-        <w:t>字元編碼與數據無關</w:t>
+        <w:t>UTF-8 可用不同數目的字節表示不同字符</w:t>
       </w:r>
     </w:p>
     <w:p>
@@ -4510,7 +4515,7 @@
         </w:rPr>
         <w:t>.</w:t>
         <w:tab/>
-        <w:t>字元編碼是有效的資訊處理概念</w:t>
+        <w:t>UTF-8 不能表示英文字母</w:t>
       </w:r>
     </w:p>
     <w:p>
@@ -5528,7 +5533,7 @@
           <w:spacing w:val="20"/>
           <w:szCs w:val="20"/>
         </w:rPr>
-        <w:t>捐款工作表：A 欄班別、C 欄金額。要在 D2 依 A2 從 $H$2:$I$10 查找目標金額，應使用？</w:t>
+        <w:t>學會募捐工作表：B 欄為班別，D 欄為捐款金額。要在 E2 統計「4A」班的捐款總額，應在 E2 輸入下列哪一個函數？</w:t>
       </w:r>
     </w:p>
     <w:p>
@@ -5587,7 +5592,7 @@
         </w:rPr>
         <w:t>.</w:t>
         <w:tab/>
-        <w:t>COUNTIF</w:t>
+        <w:t>=COUNTIF(B:B,"4A")</w:t>
       </w:r>
     </w:p>
     <w:p>
@@ -5630,7 +5635,7 @@
         </w:rPr>
         <w:t>.</w:t>
         <w:tab/>
-        <w:t>XLOOKUP</w:t>
+        <w:t>=SUMIF(B:B,"4A",D:D)</w:t>
       </w:r>
     </w:p>
     <w:p>
@@ -5673,7 +5678,7 @@
         </w:rPr>
         <w:t>.</w:t>
         <w:tab/>
-        <w:t>RANK</w:t>
+        <w:t>=XLOOKUP("4A",B:B,D:D)</w:t>
       </w:r>
     </w:p>
     <w:p>
@@ -5716,7 +5721,7 @@
         </w:rPr>
         <w:t>.</w:t>
         <w:tab/>
-        <w:t>SUMIF</w:t>
+        <w:t>=AVERAGEIF(B:B,"4A",D:D)</w:t>
       </w:r>
     </w:p>
     <w:p>
@@ -5779,7 +5784,7 @@
           <w:spacing w:val="20"/>
           <w:szCs w:val="20"/>
         </w:rPr>
-        <w:t>下列哪一項正確描述 RAM 與快取記憶體？</w:t>
+        <w:t>以下哪項關於快取記憶體的句子是正確的？</w:t>
       </w:r>
     </w:p>
     <w:p>
@@ -5838,7 +5843,7 @@
         </w:rPr>
         <w:t>.</w:t>
         <w:tab/>
-        <w:t>RAM 在斷電後資料會消失</w:t>
+        <w:t>它是 ROM 的一種</w:t>
       </w:r>
     </w:p>
     <w:p>
@@ -5881,7 +5886,7 @@
         </w:rPr>
         <w:t>.</w:t>
         <w:tab/>
-        <w:t>快取不能加快 CPU 存取</w:t>
+        <w:t>它只在 CPU 內找到</w:t>
       </w:r>
     </w:p>
     <w:p>
@@ -5924,7 +5929,7 @@
         </w:rPr>
         <w:t>.</w:t>
         <w:tab/>
-        <w:t>快取比硬碟慢</w:t>
+        <w:t>它儲存經常使用的數據和指令</w:t>
       </w:r>
     </w:p>
     <w:p>
@@ -5967,7 +5972,7 @@
         </w:rPr>
         <w:t>.</w:t>
         <w:tab/>
-        <w:t>RAM 容量通常小於快取</w:t>
+        <w:t>快取記憶體的數據存取速度比 RAM 的為低</w:t>
       </w:r>
     </w:p>
     <w:p>
@@ -6337,22 +6342,22 @@
           <w:spacing w:val="20"/>
           <w:szCs w:val="20"/>
         </w:rPr>
-        <w:t>某</w:t>
-      </w:r>
-      <w:r>
-        <w:rPr>
-          <w:rFonts w:hint="eastAsia" w:ascii="新細明體" w:hAnsi="新細明體"/>
-          <w:spacing w:val="20"/>
-          <w:szCs w:val="20"/>
-        </w:rPr>
-        <w:t>校學會以系統管理會員及活動報名。試算表「Donate」及「Target」部分資料見下表。以下哪項（些）關於試算表的敘述是正確的？</w:t>
-      </w:r>
-    </w:p>
-    <w:p>
-      <w:r>
-        <w:tab/>
-        <w:tab/>
-        <w:t>Donate</w:t>
+        <w:t>細</w:t>
+      </w:r>
+      <w:r>
+        <w:rPr>
+          <w:rFonts w:hint="eastAsia" w:ascii="新細明體" w:hAnsi="新細明體"/>
+          <w:spacing w:val="20"/>
+          <w:szCs w:val="20"/>
+        </w:rPr>
+        <w:t>看下表所列裝置。以下哪項／些屬於輸入裝置？</w:t>
+      </w:r>
+    </w:p>
+    <w:p>
+      <w:r>
+        <w:tab/>
+        <w:tab/>
+        <w:t>Device</w:t>
         <w:tab/>
       </w:r>
     </w:p>
@@ -6364,24 +6369,13 @@
         <w:tblInd w:w="562" w:type="dxa"/>
       </w:tblPr>
       <w:tblGrid>
-        <w:gridCol w:w="3489"/>
-        <w:gridCol w:w="3489"/>
-        <w:gridCol w:w="3489"/>
+        <w:gridCol w:w="5233"/>
+        <w:gridCol w:w="5233"/>
       </w:tblGrid>
       <w:tr>
         <w:tc>
           <w:tcPr>
-            <w:tcW w:type="dxa" w:w="3489"/>
-            <w:vAlign w:val="center"/>
-            <w:shd w:val="clear" w:color="auto" w:fill="D9D9D9"/>
-          </w:tcPr>
-          <w:p>
-            <w:pPr/>
-          </w:p>
-        </w:tc>
-        <w:tc>
-          <w:tcPr>
-            <w:tcW w:type="dxa" w:w="3489"/>
+            <w:tcW w:type="dxa" w:w="5233"/>
             <w:vAlign w:val="center"/>
             <w:shd w:val="clear" w:color="auto" w:fill="D9D9D9"/>
           </w:tcPr>
@@ -6391,13 +6385,13 @@
               <w:rPr>
                 <w:rFonts w:ascii="新細明體" w:hAnsi="新細明體"/>
               </w:rPr>
-              <w:t>A</w:t>
+              <w:t>裝置</w:t>
             </w:r>
           </w:p>
         </w:tc>
         <w:tc>
           <w:tcPr>
-            <w:tcW w:type="dxa" w:w="3489"/>
+            <w:tcW w:type="dxa" w:w="5233"/>
             <w:vAlign w:val="center"/>
             <w:shd w:val="clear" w:color="auto" w:fill="D9D9D9"/>
           </w:tcPr>
@@ -6407,7 +6401,7 @@
               <w:rPr>
                 <w:rFonts w:ascii="新細明體" w:hAnsi="新細明體"/>
               </w:rPr>
-              <w:t>C</w:t>
+              <w:t>用途</w:t>
             </w:r>
           </w:p>
         </w:tc>
@@ -6415,7 +6409,7 @@
       <w:tr>
         <w:tc>
           <w:tcPr>
-            <w:tcW w:type="dxa" w:w="3489"/>
+            <w:tcW w:type="dxa" w:w="5233"/>
             <w:vAlign w:val="center"/>
             <w:shd w:val="clear" w:color="auto" w:fill="D9D9D9"/>
           </w:tcPr>
@@ -6425,13 +6419,13 @@
               <w:rPr>
                 <w:rFonts w:ascii="新細明體" w:hAnsi="新細明體"/>
               </w:rPr>
-              <w:t>1</w:t>
+              <w:t>加速度計</w:t>
             </w:r>
           </w:p>
         </w:tc>
         <w:tc>
           <w:tcPr>
-            <w:tcW w:type="dxa" w:w="3489"/>
+            <w:tcW w:type="dxa" w:w="5233"/>
             <w:vAlign w:val="center"/>
           </w:tcPr>
           <w:p>
@@ -6440,22 +6434,7 @@
               <w:rPr>
                 <w:rFonts w:ascii="新細明體" w:hAnsi="新細明體"/>
               </w:rPr>
-              <w:t>班別</w:t>
-            </w:r>
-          </w:p>
-        </w:tc>
-        <w:tc>
-          <w:tcPr>
-            <w:tcW w:type="dxa" w:w="3489"/>
-            <w:vAlign w:val="center"/>
-          </w:tcPr>
-          <w:p>
-            <w:pPr/>
-            <w:r>
-              <w:rPr>
-                <w:rFonts w:ascii="新細明體" w:hAnsi="新細明體"/>
-              </w:rPr>
-              <w:t>已捐金額</w:t>
+              <w:t>偵測手機傾斜與動作</w:t>
             </w:r>
           </w:p>
         </w:tc>
@@ -6463,7 +6442,7 @@
       <w:tr>
         <w:tc>
           <w:tcPr>
-            <w:tcW w:type="dxa" w:w="3489"/>
+            <w:tcW w:type="dxa" w:w="5233"/>
             <w:vAlign w:val="center"/>
             <w:shd w:val="clear" w:color="auto" w:fill="D9D9D9"/>
           </w:tcPr>
@@ -6473,13 +6452,13 @@
               <w:rPr>
                 <w:rFonts w:ascii="新細明體" w:hAnsi="新細明體"/>
               </w:rPr>
-              <w:t>2</w:t>
+              <w:t>觸控屏幕</w:t>
             </w:r>
           </w:p>
         </w:tc>
         <w:tc>
           <w:tcPr>
-            <w:tcW w:type="dxa" w:w="3489"/>
+            <w:tcW w:type="dxa" w:w="5233"/>
             <w:vAlign w:val="center"/>
           </w:tcPr>
           <w:p>
@@ -6488,22 +6467,7 @@
               <w:rPr>
                 <w:rFonts w:ascii="新細明體" w:hAnsi="新細明體"/>
               </w:rPr>
-              <w:t>5A</w:t>
-            </w:r>
-          </w:p>
-        </w:tc>
-        <w:tc>
-          <w:tcPr>
-            <w:tcW w:type="dxa" w:w="3489"/>
-            <w:vAlign w:val="center"/>
-          </w:tcPr>
-          <w:p>
-            <w:pPr/>
-            <w:r>
-              <w:rPr>
-                <w:rFonts w:ascii="新細明體" w:hAnsi="新細明體"/>
-              </w:rPr>
-              <w:t>1200</w:t>
+              <w:t>觸控輸入</w:t>
             </w:r>
           </w:p>
         </w:tc>
@@ -6511,7 +6475,7 @@
       <w:tr>
         <w:tc>
           <w:tcPr>
-            <w:tcW w:type="dxa" w:w="3489"/>
+            <w:tcW w:type="dxa" w:w="5233"/>
             <w:vAlign w:val="center"/>
             <w:shd w:val="clear" w:color="auto" w:fill="D9D9D9"/>
           </w:tcPr>
@@ -6521,13 +6485,13 @@
               <w:rPr>
                 <w:rFonts w:ascii="新細明體" w:hAnsi="新細明體"/>
               </w:rPr>
-              <w:t>3</w:t>
+              <w:t>激光打印機</w:t>
             </w:r>
           </w:p>
         </w:tc>
         <w:tc>
           <w:tcPr>
-            <w:tcW w:type="dxa" w:w="3489"/>
+            <w:tcW w:type="dxa" w:w="5233"/>
             <w:vAlign w:val="center"/>
           </w:tcPr>
           <w:p>
@@ -6536,70 +6500,7 @@
               <w:rPr>
                 <w:rFonts w:ascii="新細明體" w:hAnsi="新細明體"/>
               </w:rPr>
-              <w:t>5B</w:t>
-            </w:r>
-          </w:p>
-        </w:tc>
-        <w:tc>
-          <w:tcPr>
-            <w:tcW w:type="dxa" w:w="3489"/>
-            <w:vAlign w:val="center"/>
-          </w:tcPr>
-          <w:p>
-            <w:pPr/>
-            <w:r>
-              <w:rPr>
-                <w:rFonts w:ascii="新細明體" w:hAnsi="新細明體"/>
-              </w:rPr>
-              <w:t>800</w:t>
-            </w:r>
-          </w:p>
-        </w:tc>
-      </w:tr>
-      <w:tr>
-        <w:tc>
-          <w:tcPr>
-            <w:tcW w:type="dxa" w:w="3489"/>
-            <w:vAlign w:val="center"/>
-            <w:shd w:val="clear" w:color="auto" w:fill="D9D9D9"/>
-          </w:tcPr>
-          <w:p>
-            <w:pPr/>
-            <w:r>
-              <w:rPr>
-                <w:rFonts w:ascii="新細明體" w:hAnsi="新細明體"/>
-              </w:rPr>
-              <w:t>4</w:t>
-            </w:r>
-          </w:p>
-        </w:tc>
-        <w:tc>
-          <w:tcPr>
-            <w:tcW w:type="dxa" w:w="3489"/>
-            <w:vAlign w:val="center"/>
-          </w:tcPr>
-          <w:p>
-            <w:pPr/>
-            <w:r>
-              <w:rPr>
-                <w:rFonts w:ascii="新細明體" w:hAnsi="新細明體"/>
-              </w:rPr>
-              <w:t>5C</w:t>
-            </w:r>
-          </w:p>
-        </w:tc>
-        <w:tc>
-          <w:tcPr>
-            <w:tcW w:type="dxa" w:w="3489"/>
-            <w:vAlign w:val="center"/>
-          </w:tcPr>
-          <w:p>
-            <w:pPr/>
-            <w:r>
-              <w:rPr>
-                <w:rFonts w:ascii="新細明體" w:hAnsi="新細明體"/>
-              </w:rPr>
-              <w:t>950</w:t>
+              <w:t>列印文件</w:t>
             </w:r>
           </w:p>
         </w:tc>
@@ -6622,263 +6523,6 @@
       </w:pPr>
     </w:p>
     <w:p>
-      <w:r>
-        <w:tab/>
-        <w:tab/>
-        <w:t>Target</w:t>
-        <w:tab/>
-      </w:r>
-    </w:p>
-    <w:tbl>
-      <w:tblPr>
-        <w:tblStyle w:val="af0"/>
-        <w:tblW w:type="dxa" w:w="9904"/>
-        <w:tblLook w:firstColumn="1" w:firstRow="1" w:lastColumn="0" w:lastRow="0" w:noHBand="0" w:noVBand="1" w:val="04A0"/>
-        <w:tblInd w:w="562" w:type="dxa"/>
-      </w:tblPr>
-      <w:tblGrid>
-        <w:gridCol w:w="3489"/>
-        <w:gridCol w:w="3489"/>
-        <w:gridCol w:w="3489"/>
-      </w:tblGrid>
-      <w:tr>
-        <w:tc>
-          <w:tcPr>
-            <w:tcW w:type="dxa" w:w="3489"/>
-            <w:vAlign w:val="center"/>
-            <w:shd w:val="clear" w:color="auto" w:fill="D9D9D9"/>
-          </w:tcPr>
-          <w:p>
-            <w:pPr/>
-          </w:p>
-        </w:tc>
-        <w:tc>
-          <w:tcPr>
-            <w:tcW w:type="dxa" w:w="3489"/>
-            <w:vAlign w:val="center"/>
-            <w:shd w:val="clear" w:color="auto" w:fill="D9D9D9"/>
-          </w:tcPr>
-          <w:p>
-            <w:pPr/>
-            <w:r>
-              <w:rPr>
-                <w:rFonts w:ascii="新細明體" w:hAnsi="新細明體"/>
-              </w:rPr>
-              <w:t>H</w:t>
-            </w:r>
-          </w:p>
-        </w:tc>
-        <w:tc>
-          <w:tcPr>
-            <w:tcW w:type="dxa" w:w="3489"/>
-            <w:vAlign w:val="center"/>
-            <w:shd w:val="clear" w:color="auto" w:fill="D9D9D9"/>
-          </w:tcPr>
-          <w:p>
-            <w:pPr/>
-            <w:r>
-              <w:rPr>
-                <w:rFonts w:ascii="新細明體" w:hAnsi="新細明體"/>
-              </w:rPr>
-              <w:t>I</w:t>
-            </w:r>
-          </w:p>
-        </w:tc>
-      </w:tr>
-      <w:tr>
-        <w:tc>
-          <w:tcPr>
-            <w:tcW w:type="dxa" w:w="3489"/>
-            <w:vAlign w:val="center"/>
-            <w:shd w:val="clear" w:color="auto" w:fill="D9D9D9"/>
-          </w:tcPr>
-          <w:p>
-            <w:pPr/>
-            <w:r>
-              <w:rPr>
-                <w:rFonts w:ascii="新細明體" w:hAnsi="新細明體"/>
-              </w:rPr>
-              <w:t>1</w:t>
-            </w:r>
-          </w:p>
-        </w:tc>
-        <w:tc>
-          <w:tcPr>
-            <w:tcW w:type="dxa" w:w="3489"/>
-            <w:vAlign w:val="center"/>
-          </w:tcPr>
-          <w:p>
-            <w:pPr/>
-            <w:r>
-              <w:rPr>
-                <w:rFonts w:ascii="新細明體" w:hAnsi="新細明體"/>
-              </w:rPr>
-              <w:t>班別</w:t>
-            </w:r>
-          </w:p>
-        </w:tc>
-        <w:tc>
-          <w:tcPr>
-            <w:tcW w:type="dxa" w:w="3489"/>
-            <w:vAlign w:val="center"/>
-          </w:tcPr>
-          <w:p>
-            <w:pPr/>
-            <w:r>
-              <w:rPr>
-                <w:rFonts w:ascii="新細明體" w:hAnsi="新細明體"/>
-              </w:rPr>
-              <w:t>目標金額</w:t>
-            </w:r>
-          </w:p>
-        </w:tc>
-      </w:tr>
-      <w:tr>
-        <w:tc>
-          <w:tcPr>
-            <w:tcW w:type="dxa" w:w="3489"/>
-            <w:vAlign w:val="center"/>
-            <w:shd w:val="clear" w:color="auto" w:fill="D9D9D9"/>
-          </w:tcPr>
-          <w:p>
-            <w:pPr/>
-            <w:r>
-              <w:rPr>
-                <w:rFonts w:ascii="新細明體" w:hAnsi="新細明體"/>
-              </w:rPr>
-              <w:t>2</w:t>
-            </w:r>
-          </w:p>
-        </w:tc>
-        <w:tc>
-          <w:tcPr>
-            <w:tcW w:type="dxa" w:w="3489"/>
-            <w:vAlign w:val="center"/>
-          </w:tcPr>
-          <w:p>
-            <w:pPr/>
-            <w:r>
-              <w:rPr>
-                <w:rFonts w:ascii="新細明體" w:hAnsi="新細明體"/>
-              </w:rPr>
-              <w:t>5A</w:t>
-            </w:r>
-          </w:p>
-        </w:tc>
-        <w:tc>
-          <w:tcPr>
-            <w:tcW w:type="dxa" w:w="3489"/>
-            <w:vAlign w:val="center"/>
-          </w:tcPr>
-          <w:p>
-            <w:pPr/>
-            <w:r>
-              <w:rPr>
-                <w:rFonts w:ascii="新細明體" w:hAnsi="新細明體"/>
-              </w:rPr>
-              <w:t>1500</w:t>
-            </w:r>
-          </w:p>
-        </w:tc>
-      </w:tr>
-      <w:tr>
-        <w:tc>
-          <w:tcPr>
-            <w:tcW w:type="dxa" w:w="3489"/>
-            <w:vAlign w:val="center"/>
-            <w:shd w:val="clear" w:color="auto" w:fill="D9D9D9"/>
-          </w:tcPr>
-          <w:p>
-            <w:pPr/>
-            <w:r>
-              <w:rPr>
-                <w:rFonts w:ascii="新細明體" w:hAnsi="新細明體"/>
-              </w:rPr>
-              <w:t>3</w:t>
-            </w:r>
-          </w:p>
-        </w:tc>
-        <w:tc>
-          <w:tcPr>
-            <w:tcW w:type="dxa" w:w="3489"/>
-            <w:vAlign w:val="center"/>
-          </w:tcPr>
-          <w:p>
-            <w:pPr/>
-            <w:r>
-              <w:rPr>
-                <w:rFonts w:ascii="新細明體" w:hAnsi="新細明體"/>
-              </w:rPr>
-              <w:t>5B</w:t>
-            </w:r>
-          </w:p>
-        </w:tc>
-        <w:tc>
-          <w:tcPr>
-            <w:tcW w:type="dxa" w:w="3489"/>
-            <w:vAlign w:val="center"/>
-          </w:tcPr>
-          <w:p>
-            <w:pPr/>
-            <w:r>
-              <w:rPr>
-                <w:rFonts w:ascii="新細明體" w:hAnsi="新細明體"/>
-              </w:rPr>
-              <w:t>1000</w:t>
-            </w:r>
-          </w:p>
-        </w:tc>
-      </w:tr>
-      <w:tr>
-        <w:tc>
-          <w:tcPr>
-            <w:tcW w:type="dxa" w:w="3489"/>
-            <w:vAlign w:val="center"/>
-            <w:shd w:val="clear" w:color="auto" w:fill="D9D9D9"/>
-          </w:tcPr>
-          <w:p>
-            <w:pPr/>
-            <w:r>
-              <w:rPr>
-                <w:rFonts w:ascii="新細明體" w:hAnsi="新細明體"/>
-              </w:rPr>
-              <w:t>4</w:t>
-            </w:r>
-          </w:p>
-        </w:tc>
-        <w:tc>
-          <w:tcPr>
-            <w:tcW w:type="dxa" w:w="3489"/>
-            <w:vAlign w:val="center"/>
-          </w:tcPr>
-          <w:p>
-            <w:pPr/>
-            <w:r>
-              <w:rPr>
-                <w:rFonts w:ascii="新細明體" w:hAnsi="新細明體"/>
-              </w:rPr>
-              <w:t>5C</w:t>
-            </w:r>
-          </w:p>
-        </w:tc>
-        <w:tc>
-          <w:tcPr>
-            <w:tcW w:type="dxa" w:w="3489"/>
-            <w:vAlign w:val="center"/>
-          </w:tcPr>
-          <w:p>
-            <w:pPr/>
-            <w:r>
-              <w:rPr>
-                <w:rFonts w:ascii="新細明體" w:hAnsi="新細明體"/>
-              </w:rPr>
-              <w:t>1200</w:t>
-            </w:r>
-          </w:p>
-        </w:tc>
-      </w:tr>
-    </w:tbl>
-    <w:p>
       <w:pPr>
         <w:tabs>
           <w:tab w:pos="567" w:val="left"/>
@@ -6934,7 +6578,7 @@
         </w:rPr>
         <w:t>)</w:t>
         <w:tab/>
-        <w:t>XLOOKUP 可依關鍵值在對照範圍查找並傳回結果</w:t>
+        <w:t>加速度計</w:t>
         <w:tab/>
       </w:r>
     </w:p>
@@ -6986,7 +6630,7 @@
         </w:rPr>
         <w:t>2)</w:t>
         <w:tab/>
-        <w:t>COUNTIF 用於加總兩欄的乘積</w:t>
+        <w:t>觸控屏幕</w:t>
         <w:tab/>
       </w:r>
     </w:p>
@@ -7038,7 +6682,7 @@
         </w:rPr>
         <w:t>3)</w:t>
         <w:tab/>
-        <w:t>SUMIF 只能統計儲存格個數</w:t>
+        <w:t>激光打印機</w:t>
         <w:tab/>
       </w:r>
     </w:p>
@@ -7226,7 +6870,7 @@
           <w:spacing w:val="20"/>
           <w:szCs w:val="20"/>
         </w:rPr>
-        <w:t>只有 (1) 和 (3)</w:t>
+        <w:t>只有 (1) 和 (2)</w:t>
       </w:r>
     </w:p>
     <w:p>
@@ -7283,23 +6927,23 @@
           <w:spacing w:val="20"/>
           <w:szCs w:val="20"/>
         </w:rPr>
-        <w:t>只</w:t>
-      </w:r>
-      <w:r>
-        <w:rPr>
-          <w:rFonts w:hint="eastAsia" w:ascii="新細明體" w:hAnsi="新細明體"/>
-          <w:spacing w:val="20"/>
-          <w:szCs w:val="20"/>
-        </w:rPr>
-        <w:t>有</w:t>
-      </w:r>
-      <w:r>
-        <w:rPr>
-          <w:rFonts w:hint="eastAsia" w:ascii="新細明體" w:hAnsi="新細明體"/>
-          <w:spacing w:val="20"/>
-          <w:szCs w:val="20"/>
-        </w:rPr>
-        <w:t xml:space="preserve"> (2) 和 (3)</w:t>
+        <w:t>(</w:t>
+      </w:r>
+      <w:r>
+        <w:rPr>
+          <w:rFonts w:hint="eastAsia" w:ascii="新細明體" w:hAnsi="新細明體"/>
+          <w:spacing w:val="20"/>
+          <w:szCs w:val="20"/>
+        </w:rPr>
+        <w:t>1</w:t>
+      </w:r>
+      <w:r>
+        <w:rPr>
+          <w:rFonts w:hint="eastAsia" w:ascii="新細明體" w:hAnsi="新細明體"/>
+          <w:spacing w:val="20"/>
+          <w:szCs w:val="20"/>
+        </w:rPr>
+        <w:t>)、(2) 和 (3)</w:t>
       </w:r>
     </w:p>
     <w:p>
@@ -7363,7 +7007,7 @@
           <w:spacing w:val="20"/>
           <w:szCs w:val="20"/>
         </w:rPr>
-        <w:t>下列哪一項正確描述 RAM 與快取記憶體？</w:t>
+        <w:t>除了數據傳輸率和儲存容量，下列哪一項正確描述 RAM 與固態硬碟（SSD）的一個功能上的分別？</w:t>
       </w:r>
     </w:p>
     <w:p>
@@ -7429,7 +7073,7 @@
           <w:szCs w:val="20"/>
         </w:rPr>
         <w:tab/>
-        <w:t>RAM 在斷電後資料會消失</w:t>
+        <w:t>RAM 屬於主記憶體，斷電後資料會消失</w:t>
       </w:r>
     </w:p>
     <w:p>
@@ -7472,7 +7116,7 @@
         </w:rPr>
         <w:t>.</w:t>
         <w:tab/>
-        <w:t>快取比硬碟慢</w:t>
+        <w:t>SSD 的數據存取速度必定比快取記憶體快</w:t>
       </w:r>
     </w:p>
     <w:p>
@@ -7529,7 +7173,7 @@
           <w:spacing w:val="20"/>
           <w:szCs w:val="20"/>
         </w:rPr>
-        <w:t>RAM 容量通常小於快取</w:t>
+        <w:t>RAM 只用作長期儲存檔案</w:t>
       </w:r>
     </w:p>
     <w:p>
@@ -7579,7 +7223,7 @@
           <w:szCs w:val="20"/>
         </w:rPr>
         <w:tab/>
-        <w:t>快取不能加快 CPU 存取</w:t>
+        <w:t>SSD 不能永久儲存資料</w:t>
       </w:r>
     </w:p>
     <w:p>
@@ -9531,7 +9175,7 @@
           <w:spacing w:val="20"/>
           <w:szCs w:val="20"/>
         </w:rPr>
-        <w:t>哪一項屬於專用軟件（application software）？</w:t>
+        <w:t>哪一項屬於應用軟件？</w:t>
       </w:r>
     </w:p>
     <w:p>
@@ -9863,7 +9507,7 @@
           <w:spacing w:val="20"/>
           <w:szCs w:val="20"/>
         </w:rPr>
-        <w:t>下列哪一項屬於實用程式（utility）？</w:t>
+        <w:t>下列哪一項最能描述作業系統的功能？</w:t>
       </w:r>
     </w:p>
     <w:p>
@@ -9936,7 +9580,7 @@
           <w:spacing w:val="20"/>
           <w:szCs w:val="20"/>
         </w:rPr>
-        <w:t>文書處理軟件</w:t>
+        <w:t>管理硬件及軟件資源</w:t>
       </w:r>
     </w:p>
     <w:p>
@@ -9993,7 +9637,7 @@
           <w:spacing w:val="20"/>
           <w:szCs w:val="20"/>
         </w:rPr>
-        <w:t>試算表</w:t>
+        <w:t>設計網頁版面</w:t>
       </w:r>
     </w:p>
     <w:p>
@@ -10036,7 +9680,7 @@
         </w:rPr>
         <w:t>.</w:t>
         <w:tab/>
-        <w:t>磁碟重組工具</w:t>
+        <w:t>編寫 Python 程式</w:t>
       </w:r>
     </w:p>
     <w:p>
@@ -10079,7 +9723,7 @@
         </w:rPr>
         <w:t>.</w:t>
         <w:tab/>
-        <w:t>網頁瀏覽器</w:t>
+        <w:t>壓縮圖像檔案</w:t>
       </w:r>
     </w:p>
     <w:p>
@@ -10143,7 +9787,7 @@
           <w:spacing w:val="20"/>
           <w:szCs w:val="20"/>
         </w:rPr>
-        <w:t>下列哪一項屬於輸入裝置？</w:t>
+        <w:t>下列哪一項屬於輸出裝置？</w:t>
       </w:r>
     </w:p>
     <w:p>
@@ -10202,6 +9846,92 @@
         </w:rPr>
         <w:t>.</w:t>
         <w:tab/>
+        <w:t>鍵盤</w:t>
+      </w:r>
+    </w:p>
+    <w:p>
+      <w:pPr>
+        <w:tabs>
+          <w:tab w:pos="567" w:val="left"/>
+          <w:tab w:pos="993" w:val="left"/>
+          <w:tab w:pos="1418" w:val="left"/>
+          <w:tab w:pos="1843" w:val="left"/>
+          <w:tab w:pos="2268" w:val="left"/>
+        </w:tabs>
+        <w:snapToGrid w:val="0"/>
+        <w:ind w:left="567" w:hanging="567"/>
+        <w:rPr>
+          <w:spacing w:val="20"/>
+          <w:szCs w:val="20"/>
+        </w:rPr>
+      </w:pPr>
+      <w:r>
+        <w:rPr>
+          <w:rFonts w:hint="eastAsia" w:ascii="新細明體" w:hAnsi="新細明體"/>
+          <w:spacing w:val="20"/>
+          <w:szCs w:val="20"/>
+        </w:rPr>
+        <w:tab/>
+      </w:r>
+      <w:r>
+        <w:rPr>
+          <w:rFonts w:hint="eastAsia" w:ascii="新細明體" w:hAnsi="新細明體"/>
+          <w:spacing w:val="20"/>
+          <w:szCs w:val="20"/>
+        </w:rPr>
+        <w:t>B</w:t>
+      </w:r>
+      <w:r>
+        <w:rPr>
+          <w:rFonts w:hint="eastAsia" w:ascii="新細明體" w:hAnsi="新細明體"/>
+          <w:spacing w:val="20"/>
+          <w:szCs w:val="20"/>
+        </w:rPr>
+        <w:t>.</w:t>
+        <w:tab/>
+        <w:t>條碼掃描器</w:t>
+      </w:r>
+    </w:p>
+    <w:p>
+      <w:pPr>
+        <w:tabs>
+          <w:tab w:pos="567" w:val="left"/>
+          <w:tab w:pos="993" w:val="left"/>
+          <w:tab w:pos="1418" w:val="left"/>
+          <w:tab w:pos="1843" w:val="left"/>
+          <w:tab w:pos="2268" w:val="left"/>
+        </w:tabs>
+        <w:snapToGrid w:val="0"/>
+        <w:ind w:left="567" w:hanging="567"/>
+        <w:rPr>
+          <w:spacing w:val="20"/>
+          <w:szCs w:val="20"/>
+        </w:rPr>
+      </w:pPr>
+      <w:r>
+        <w:rPr>
+          <w:rFonts w:hint="eastAsia" w:ascii="新細明體" w:hAnsi="新細明體"/>
+          <w:spacing w:val="20"/>
+          <w:szCs w:val="20"/>
+        </w:rPr>
+        <w:tab/>
+      </w:r>
+      <w:r>
+        <w:rPr>
+          <w:rFonts w:hint="eastAsia" w:ascii="新細明體" w:hAnsi="新細明體"/>
+          <w:spacing w:val="20"/>
+          <w:szCs w:val="20"/>
+        </w:rPr>
+        <w:t>C</w:t>
+      </w:r>
+      <w:r>
+        <w:rPr>
+          <w:rFonts w:hint="eastAsia" w:ascii="新細明體" w:hAnsi="新細明體"/>
+          <w:spacing w:val="20"/>
+          <w:szCs w:val="20"/>
+        </w:rPr>
+        <w:t>.</w:t>
+        <w:tab/>
         <w:t>投影機</w:t>
       </w:r>
     </w:p>
@@ -10235,7 +9965,7 @@
           <w:spacing w:val="20"/>
           <w:szCs w:val="20"/>
         </w:rPr>
-        <w:t>B</w:t>
+        <w:t>D</w:t>
       </w:r>
       <w:r>
         <w:rPr>
@@ -10245,93 +9975,7 @@
         </w:rPr>
         <w:t>.</w:t>
         <w:tab/>
-        <w:t>喇叭</w:t>
-      </w:r>
-    </w:p>
-    <w:p>
-      <w:pPr>
-        <w:tabs>
-          <w:tab w:pos="567" w:val="left"/>
-          <w:tab w:pos="993" w:val="left"/>
-          <w:tab w:pos="1418" w:val="left"/>
-          <w:tab w:pos="1843" w:val="left"/>
-          <w:tab w:pos="2268" w:val="left"/>
-        </w:tabs>
-        <w:snapToGrid w:val="0"/>
-        <w:ind w:left="567" w:hanging="567"/>
-        <w:rPr>
-          <w:spacing w:val="20"/>
-          <w:szCs w:val="20"/>
-        </w:rPr>
-      </w:pPr>
-      <w:r>
-        <w:rPr>
-          <w:rFonts w:hint="eastAsia" w:ascii="新細明體" w:hAnsi="新細明體"/>
-          <w:spacing w:val="20"/>
-          <w:szCs w:val="20"/>
-        </w:rPr>
-        <w:tab/>
-      </w:r>
-      <w:r>
-        <w:rPr>
-          <w:rFonts w:hint="eastAsia" w:ascii="新細明體" w:hAnsi="新細明體"/>
-          <w:spacing w:val="20"/>
-          <w:szCs w:val="20"/>
-        </w:rPr>
-        <w:t>C</w:t>
-      </w:r>
-      <w:r>
-        <w:rPr>
-          <w:rFonts w:hint="eastAsia" w:ascii="新細明體" w:hAnsi="新細明體"/>
-          <w:spacing w:val="20"/>
-          <w:szCs w:val="20"/>
-        </w:rPr>
-        <w:t>.</w:t>
-        <w:tab/>
-        <w:t>繪圖儀</w:t>
-      </w:r>
-    </w:p>
-    <w:p>
-      <w:pPr>
-        <w:tabs>
-          <w:tab w:pos="567" w:val="left"/>
-          <w:tab w:pos="993" w:val="left"/>
-          <w:tab w:pos="1418" w:val="left"/>
-          <w:tab w:pos="1843" w:val="left"/>
-          <w:tab w:pos="2268" w:val="left"/>
-        </w:tabs>
-        <w:snapToGrid w:val="0"/>
-        <w:ind w:left="567" w:hanging="567"/>
-        <w:rPr>
-          <w:spacing w:val="20"/>
-          <w:szCs w:val="20"/>
-        </w:rPr>
-      </w:pPr>
-      <w:r>
-        <w:rPr>
-          <w:rFonts w:hint="eastAsia" w:ascii="新細明體" w:hAnsi="新細明體"/>
-          <w:spacing w:val="20"/>
-          <w:szCs w:val="20"/>
-        </w:rPr>
-        <w:tab/>
-      </w:r>
-      <w:r>
-        <w:rPr>
-          <w:rFonts w:hint="eastAsia" w:ascii="新細明體" w:hAnsi="新細明體"/>
-          <w:spacing w:val="20"/>
-          <w:szCs w:val="20"/>
-        </w:rPr>
-        <w:t>D</w:t>
-      </w:r>
-      <w:r>
-        <w:rPr>
-          <w:rFonts w:hint="eastAsia" w:ascii="新細明體" w:hAnsi="新細明體"/>
-          <w:spacing w:val="20"/>
-          <w:szCs w:val="20"/>
-        </w:rPr>
-        <w:t>.</w:t>
-        <w:tab/>
-        <w:t>條碼掃描器</w:t>
+        <w:t>麥克風</w:t>
       </w:r>
     </w:p>
     <w:p>
@@ -11533,15 +11177,23 @@
           <w:spacing w:val="20"/>
           <w:szCs w:val="20"/>
         </w:rPr>
-        <w:t>執</w:t>
-      </w:r>
-      <w:r>
-        <w:rPr>
-          <w:rFonts w:hint="eastAsia" w:ascii="新細明體" w:hAnsi="新細明體"/>
-          <w:spacing w:val="20"/>
-          <w:szCs w:val="20"/>
-        </w:rPr>
-        <w:t>行</w:t>
+        <w:t>考</w:t>
+      </w:r>
+      <w:r>
+        <w:rPr>
+          <w:rFonts w:hint="eastAsia" w:ascii="新細明體" w:hAnsi="新細明體"/>
+          <w:spacing w:val="20"/>
+          <w:szCs w:val="20"/>
+        </w:rPr>
+        <w:t>慮</w:t>
+      </w:r>
+      <w:r>
+        <w:rPr>
+          <w:rFonts w:hint="eastAsia" w:ascii="新細明體" w:hAnsi="新細明體"/>
+          <w:spacing w:val="20"/>
+          <w:szCs w:val="20"/>
+        </w:rPr>
+        <w:t>以</w:t>
       </w:r>
       <w:r>
         <w:rPr>
@@ -11557,15 +11209,7 @@
           <w:spacing w:val="20"/>
           <w:szCs w:val="20"/>
         </w:rPr>
-        <w:t>列</w:t>
-      </w:r>
-      <w:r>
-        <w:rPr>
-          <w:rFonts w:hint="eastAsia" w:ascii="新細明體" w:hAnsi="新細明體"/>
-          <w:spacing w:val="20"/>
-          <w:szCs w:val="20"/>
-        </w:rPr>
-        <w:t xml:space="preserve"> Python 程式後，變數 i 的最終值是多少？</w:t>
+        <w:t>偽代碼：</w:t>
       </w:r>
     </w:p>
     <w:p>
@@ -11592,31 +11236,7 @@
           <w:szCs w:val="20"/>
         </w:rPr>
         <w:tab/>
-        <w:t>i = 1</w:t>
-      </w:r>
-    </w:p>
-    <w:p>
-      <w:pPr>
-        <w:tabs>
-          <w:tab w:pos="567" w:val="left"/>
-          <w:tab w:pos="993" w:val="left"/>
-          <w:tab w:pos="1418" w:val="left"/>
-          <w:tab w:pos="1843" w:val="left"/>
-          <w:tab w:pos="2268" w:val="left"/>
-        </w:tabs>
-        <w:snapToGrid w:val="0"/>
-        <w:ind w:left="567" w:hanging="567"/>
-        <w:rPr>
-          <w:spacing w:val="20"/>
-          <w:szCs w:val="20"/>
-        </w:rPr>
-      </w:pPr>
-      <w:r>
-        <w:rPr>
-          <w:rFonts w:ascii="Courier New" w:hAnsi="Courier New"/>
-        </w:rPr>
-        <w:tab/>
-        <w:t>while i &lt;= 8:</w:t>
+        <w:t>s ← 0，i ← 1</w:t>
       </w:r>
     </w:p>
     <w:p>
@@ -11639,23 +11259,14 @@
       <w:r>
         <w:rPr>
           <w:rFonts w:ascii="Courier New" w:hAnsi="Courier New"/>
-          <w:spacing w:val="20"/>
-          <w:szCs w:val="20"/>
-        </w:rPr>
-        <w:tab/>
-      </w:r>
-      <w:r>
-        <w:rPr>
-          <w:rFonts w:hint="eastAsia" w:ascii="Courier New" w:hAnsi="Courier New"/>
-          <w:spacing w:val="20"/>
-          <w:szCs w:val="20"/>
-        </w:rPr>
-        <w:tab/>
-        <w:t>i = i * 2</w:t>
-      </w:r>
-    </w:p>
-    <w:p>
-      <w:pPr>
+        </w:rPr>
+        <w:tab/>
+        <w:t>當 i ≤ 3 時重複執行 s ← s + i 及 i ← i + 1，然後輸出 s</w:t>
+      </w:r>
+    </w:p>
+    <w:p>
+      <w:pPr>
+        <w:pStyle w:val="af3"/>
         <w:tabs>
           <w:tab w:pos="567" w:val="left"/>
           <w:tab w:pos="993" w:val="left"/>
@@ -11670,6 +11281,22 @@
           <w:szCs w:val="20"/>
         </w:rPr>
       </w:pPr>
+      <w:r>
+        <w:rPr>
+          <w:rFonts w:ascii="新細明體" w:hAnsi="新細明體"/>
+          <w:spacing w:val="20"/>
+          <w:szCs w:val="20"/>
+        </w:rPr>
+        <w:t>輸</w:t>
+      </w:r>
+      <w:r>
+        <w:rPr>
+          <w:rFonts w:hint="eastAsia" w:ascii="新細明體" w:hAnsi="新細明體"/>
+          <w:spacing w:val="20"/>
+          <w:szCs w:val="20"/>
+        </w:rPr>
+        <w:t>出是？</w:t>
+      </w:r>
     </w:p>
     <w:p>
       <w:pPr>
@@ -11683,6 +11310,23 @@
         <w:snapToGrid w:val="0"/>
         <w:ind w:left="567" w:hanging="567"/>
         <w:rPr>
+          <w:spacing w:val="20"/>
+          <w:szCs w:val="20"/>
+        </w:rPr>
+      </w:pPr>
+    </w:p>
+    <w:p>
+      <w:pPr>
+        <w:tabs>
+          <w:tab w:pos="567" w:val="left"/>
+          <w:tab w:pos="993" w:val="left"/>
+          <w:tab w:pos="1418" w:val="left"/>
+          <w:tab w:pos="1843" w:val="left"/>
+          <w:tab w:pos="2268" w:val="left"/>
+        </w:tabs>
+        <w:snapToGrid w:val="0"/>
+        <w:ind w:left="567" w:hanging="567"/>
+        <w:rPr>
           <w:rFonts w:ascii="Courier New" w:hAnsi="Courier New" w:cs="Courier New"/>
           <w:spacing w:val="20"/>
           <w:szCs w:val="20"/>
@@ -11712,7 +11356,7 @@
         </w:rPr>
         <w:t>.</w:t>
         <w:tab/>
-        <w:t>16</w:t>
+        <w:t>6</w:t>
       </w:r>
     </w:p>
     <w:p>
@@ -11756,7 +11400,7 @@
         </w:rPr>
         <w:t>.</w:t>
         <w:tab/>
-        <w:t>4</w:t>
+        <w:t>3</w:t>
       </w:r>
     </w:p>
     <w:p>
@@ -11800,7 +11444,7 @@
         </w:rPr>
         <w:t>.</w:t>
         <w:tab/>
-        <w:t>8</w:t>
+        <w:t>10</w:t>
       </w:r>
     </w:p>
     <w:p>
@@ -11844,7 +11488,7 @@
         </w:rPr>
         <w:t>.</w:t>
         <w:tab/>
-        <w:t>2</w:t>
+        <w:t>1</w:t>
       </w:r>
     </w:p>
     <w:p>
@@ -13555,20 +13199,19 @@
         <w:rPr>
           <w:rFonts w:ascii="新細明體" w:hAnsi="新細明體"/>
         </w:rPr>
-        <w:t>考慮以下偽代碼：</w:t>
-      </w:r>
-    </w:p>
-    <w:p>
-      <w:pPr>
-        <w:tabs>
-          <w:tab w:pos="567" w:val="left"/>
-          <w:tab w:pos="993" w:val="left"/>
-          <w:tab w:pos="1418" w:val="left"/>
-          <w:tab w:pos="1843" w:val="left"/>
-          <w:tab w:pos="2268" w:val="left"/>
-        </w:tabs>
-        <w:snapToGrid w:val="0"/>
-        <w:spacing w:before="120" w:after="120"/>
+        <w:t>設 A = 1，B = 0，C = 1。下列哪項布林運算的結果為假？</w:t>
+      </w:r>
+    </w:p>
+    <w:p>
+      <w:pPr>
+        <w:tabs>
+          <w:tab w:pos="567" w:val="left"/>
+          <w:tab w:pos="993" w:val="left"/>
+          <w:tab w:pos="1418" w:val="left"/>
+          <w:tab w:pos="1843" w:val="left"/>
+          <w:tab w:pos="2268" w:val="left"/>
+        </w:tabs>
+        <w:snapToGrid w:val="0"/>
         <w:ind w:left="567" w:hanging="567"/>
         <w:rPr>
           <w:spacing w:val="20"/>
@@ -13577,32 +13220,31 @@
       </w:pPr>
       <w:r>
         <w:rPr>
-          <w:rFonts w:hint="eastAsia" w:ascii="Courier New" w:hAnsi="Courier New"/>
-          <w:spacing w:val="20"/>
-          <w:szCs w:val="20"/>
-        </w:rPr>
-        <w:tab/>
-      </w:r>
-      <w:r>
-        <w:rPr>
-          <w:rFonts w:hint="eastAsia" w:ascii="Courier New" w:hAnsi="Courier New"/>
-          <w:spacing w:val="20"/>
-          <w:szCs w:val="20"/>
-        </w:rPr>
-        <w:t>若</w:t>
-      </w:r>
-      <w:r>
-        <w:rPr>
-          <w:rFonts w:hint="eastAsia" w:ascii="Courier New" w:hAnsi="Courier New"/>
-          <w:spacing w:val="20"/>
-          <w:szCs w:val="20"/>
-        </w:rPr>
-        <w:t xml:space="preserve"> (score ≥ 60) 且 (score ≤ 100) 則 grade ←「合格」，否則 grade ←「不合格」</w:t>
-      </w:r>
-    </w:p>
-    <w:p>
-      <w:pPr>
-        <w:pStyle w:val="af3"/>
+          <w:rFonts w:hint="eastAsia"/>
+          <w:spacing w:val="20"/>
+          <w:szCs w:val="20"/>
+        </w:rPr>
+        <w:t xml:space="preserve"> </w:t>
+      </w:r>
+      <w:r>
+        <w:rPr>
+          <w:rFonts w:hint="eastAsia"/>
+          <w:spacing w:val="20"/>
+          <w:szCs w:val="20"/>
+        </w:rPr>
+        <w:t xml:space="preserve"> </w:t>
+      </w:r>
+      <w:r>
+        <w:rPr>
+          <w:rFonts w:hint="eastAsia"/>
+          <w:spacing w:val="20"/>
+          <w:szCs w:val="20"/>
+        </w:rPr>
+        <w:t xml:space="preserve"> </w:t>
+      </w:r>
+    </w:p>
+    <w:p>
+      <w:pPr>
         <w:tabs>
           <w:tab w:pos="567" w:val="left"/>
           <w:tab w:pos="993" w:val="left"/>
@@ -13623,23 +13265,25 @@
           <w:spacing w:val="20"/>
           <w:szCs w:val="20"/>
         </w:rPr>
-        <w:t>若</w:t>
-      </w:r>
-      <w:r>
-        <w:rPr>
-          <w:rFonts w:hint="eastAsia" w:ascii="新細明體" w:hAnsi="新細明體"/>
-          <w:spacing w:val="20"/>
-          <w:szCs w:val="20"/>
-        </w:rPr>
-        <w:t xml:space="preserve"> </w:t>
-      </w:r>
-      <w:r>
-        <w:rPr>
-          <w:rFonts w:hint="eastAsia" w:ascii="新細明體" w:hAnsi="新細明體"/>
-          <w:spacing w:val="20"/>
-          <w:szCs w:val="20"/>
-        </w:rPr>
-        <w:t>score = 60，grade 是？</w:t>
+        <w:tab/>
+      </w:r>
+      <w:r>
+        <w:rPr>
+          <w:rFonts w:hint="eastAsia" w:ascii="新細明體" w:hAnsi="新細明體"/>
+          <w:spacing w:val="20"/>
+          <w:szCs w:val="20"/>
+        </w:rPr>
+        <w:t>A</w:t>
+      </w:r>
+      <w:r>
+        <w:rPr>
+          <w:rFonts w:hint="eastAsia" w:ascii="新細明體" w:hAnsi="新細明體"/>
+          <w:spacing w:val="20"/>
+          <w:szCs w:val="20"/>
+        </w:rPr>
+        <w:t>.</w:t>
+        <w:tab/>
+        <w:t>(A AND B) OR C</w:t>
       </w:r>
     </w:p>
     <w:p>
@@ -13660,27 +13304,29 @@
       </w:pPr>
       <w:r>
         <w:rPr>
-          <w:rFonts w:hint="eastAsia"/>
-          <w:spacing w:val="20"/>
-          <w:szCs w:val="20"/>
-        </w:rPr>
-        <w:t xml:space="preserve"> </w:t>
-      </w:r>
-      <w:r>
-        <w:rPr>
-          <w:rFonts w:hint="eastAsia"/>
-          <w:spacing w:val="20"/>
-          <w:szCs w:val="20"/>
-        </w:rPr>
-        <w:t xml:space="preserve"> </w:t>
-      </w:r>
-      <w:r>
-        <w:rPr>
-          <w:rFonts w:hint="eastAsia"/>
-          <w:spacing w:val="20"/>
-          <w:szCs w:val="20"/>
-        </w:rPr>
-        <w:t xml:space="preserve"> </w:t>
+          <w:rFonts w:hint="eastAsia" w:ascii="新細明體" w:hAnsi="新細明體"/>
+          <w:spacing w:val="20"/>
+          <w:szCs w:val="20"/>
+        </w:rPr>
+        <w:tab/>
+      </w:r>
+      <w:r>
+        <w:rPr>
+          <w:rFonts w:hint="eastAsia" w:ascii="新細明體" w:hAnsi="新細明體"/>
+          <w:spacing w:val="20"/>
+          <w:szCs w:val="20"/>
+        </w:rPr>
+        <w:t>B</w:t>
+      </w:r>
+      <w:r>
+        <w:rPr>
+          <w:rFonts w:hint="eastAsia" w:ascii="新細明體" w:hAnsi="新細明體"/>
+          <w:spacing w:val="20"/>
+          <w:szCs w:val="20"/>
+        </w:rPr>
+        <w:t>.</w:t>
+        <w:tab/>
+        <w:t>(NOT A) AND C</w:t>
       </w:r>
     </w:p>
     <w:p>
@@ -13713,7 +13359,7 @@
           <w:spacing w:val="20"/>
           <w:szCs w:val="20"/>
         </w:rPr>
-        <w:t>A</w:t>
+        <w:t>C</w:t>
       </w:r>
       <w:r>
         <w:rPr>
@@ -13723,7 +13369,7 @@
         </w:rPr>
         <w:t>.</w:t>
         <w:tab/>
-        <w:t>60</w:t>
+        <w:t>A XOR B</w:t>
       </w:r>
     </w:p>
     <w:p>
@@ -13747,9 +13393,9 @@
           <w:rFonts w:ascii="新細明體" w:hAnsi="新細明體"/>
         </w:rPr>
         <w:tab/>
-        <w:t>B.</w:t>
-        <w:tab/>
-        <w:t>100</w:t>
+        <w:t>D.</w:t>
+        <w:tab/>
+        <w:t>(NOT B) OR C</w:t>
       </w:r>
     </w:p>
     <w:p>
@@ -13768,15 +13414,6 @@
           <w:szCs w:val="20"/>
         </w:rPr>
       </w:pPr>
-      <w:r>
-        <w:rPr>
-          <w:rFonts w:ascii="新細明體" w:hAnsi="新細明體"/>
-        </w:rPr>
-        <w:tab/>
-        <w:t>C.</w:t>
-        <w:tab/>
-        <w:t>合格</w:t>
-      </w:r>
     </w:p>
     <w:p>
       <w:pPr>
@@ -13796,14 +13433,10 @@
       </w:pPr>
       <w:r>
         <w:rPr>
-          <w:rFonts w:ascii="新細明體" w:hAnsi="新細明體"/>
-          <w:spacing w:val="20"/>
-          <w:szCs w:val="20"/>
-        </w:rPr>
-        <w:tab/>
-        <w:t>D.</w:t>
-        <w:tab/>
-        <w:t>不合格</w:t>
+          <w:spacing w:val="20"/>
+          <w:szCs w:val="20"/>
+        </w:rPr>
+        <w:t xml:space="preserve"> </w:t>
       </w:r>
     </w:p>
     <w:p>
@@ -15278,7 +14911,7 @@
           <w:spacing w:val="20"/>
           <w:szCs w:val="20"/>
         </w:rPr>
-        <w:t>「煦風書社」以試算表「Order」記錄義賣收入；右側為商品參考單價對照。部分資料見下表。</w:t>
+        <w:t>「煦風書社」以試算表「Order」記錄義賣收入（Order 範圍已設定為 Excel 表格）；PriceRef 為參考單價對照。部分資料見下表。</w:t>
       </w:r>
     </w:p>
     <w:p>
@@ -16278,42 +15911,42 @@
           <w:spacing w:val="20"/>
           <w:szCs w:val="20"/>
         </w:rPr>
-        <w:t xml:space="preserve"> </w:t>
-      </w:r>
-      <w:r>
-        <w:rPr>
-          <w:rFonts w:hint="eastAsia" w:ascii="新細明體" w:hAnsi="新細明體"/>
-          <w:szCs w:val="20"/>
-        </w:rPr>
-        <w:t>S</w:t>
+        <w:t>結</w:t>
+      </w:r>
+      <w:r>
+        <w:rPr>
+          <w:rFonts w:hint="eastAsia" w:ascii="新細明體" w:hAnsi="新細明體"/>
+          <w:szCs w:val="20"/>
+        </w:rPr>
+        <w:t>構</w:t>
       </w:r>
       <w:r>
         <w:rPr>
           <w:rFonts w:ascii="新細明體" w:hAnsi="新細明體"/>
           <w:szCs w:val="20"/>
         </w:rPr>
-        <w:t>U</w:t>
-      </w:r>
-      <w:r>
-        <w:rPr>
-          <w:rFonts w:hint="eastAsia" w:ascii="新細明體" w:hAnsi="新細明體"/>
-          <w:szCs w:val="20"/>
-        </w:rPr>
-        <w:t>M</w:t>
-      </w:r>
-      <w:r>
-        <w:rPr>
-          <w:rFonts w:hint="eastAsia" w:ascii="新細明體" w:hAnsi="新細明體"/>
-          <w:szCs w:val="20"/>
-        </w:rPr>
-        <w:t>I</w:t>
-      </w:r>
-      <w:r>
-        <w:rPr>
-          <w:rFonts w:hint="eastAsia" w:ascii="新細明體" w:hAnsi="新細明體"/>
-          <w:szCs w:val="20"/>
-        </w:rPr>
-        <w:t>F：加總 B 欄為「明信片」的 F 欄總價（範圍 F$2:F$50），寫出公式。</w:t>
+        <w:t>化</w:t>
+      </w:r>
+      <w:r>
+        <w:rPr>
+          <w:rFonts w:hint="eastAsia" w:ascii="新細明體" w:hAnsi="新細明體"/>
+          <w:szCs w:val="20"/>
+        </w:rPr>
+        <w:t>參</w:t>
+      </w:r>
+      <w:r>
+        <w:rPr>
+          <w:rFonts w:hint="eastAsia" w:ascii="新細明體" w:hAnsi="新細明體"/>
+          <w:szCs w:val="20"/>
+        </w:rPr>
+        <w:t>照</w:t>
+      </w:r>
+      <w:r>
+        <w:rPr>
+          <w:rFonts w:hint="eastAsia" w:ascii="新細明體" w:hAnsi="新細明體"/>
+          <w:szCs w:val="20"/>
+        </w:rPr>
+        <w:t>：加總 Order 表格中商品為「明信片」的總價，寫出公式。</w:t>
         <w:tab/>
         <w:t>(2 分)</w:t>
       </w:r>
@@ -16528,7 +16161,7 @@
           <w:rFonts w:hint="eastAsia" w:ascii="新細明體" w:hAnsi="新細明體"/>
           <w:szCs w:val="20"/>
         </w:rPr>
-        <w:t>室添置桌上電腦，主要部件包括 CPU、RAM、儲存裝置及顯示器。下表列出兩款候選規格。</w:t>
+        <w:t>室添置桌上電腦，下表列出電腦 A 與電腦 B 的硬件規格（請細看下表各列的數值與類型）。</w:t>
       </w:r>
     </w:p>
     <w:p>
@@ -16563,7 +16196,7 @@
               <w:rPr>
                 <w:rFonts w:ascii="新細明體" w:hAnsi="新細明體"/>
               </w:rPr>
-              <w:t>部件</w:t>
+              <w:t>硬件規格</w:t>
             </w:r>
           </w:p>
         </w:tc>
@@ -16628,7 +16261,7 @@
               <w:rPr>
                 <w:rFonts w:ascii="新細明體" w:hAnsi="新細明體"/>
               </w:rPr>
-              <w:t>Intel Core i5-12400</w:t>
+              <w:t>Intel Core i3（3.3 GHz）</w:t>
             </w:r>
           </w:p>
         </w:tc>
@@ -16643,7 +16276,7 @@
               <w:rPr>
                 <w:rFonts w:ascii="新細明體" w:hAnsi="新細明體"/>
               </w:rPr>
-              <w:t>AMD Ryzen 5 5600G</w:t>
+              <w:t>Intel Core i7（4.2 GHz）</w:t>
             </w:r>
           </w:p>
         </w:tc>
@@ -16676,7 +16309,7 @@
               <w:rPr>
                 <w:rFonts w:ascii="新細明體" w:hAnsi="新細明體"/>
               </w:rPr>
-              <w:t>8 GB DDR4</w:t>
+              <w:t>8 GB</w:t>
             </w:r>
           </w:p>
         </w:tc>
@@ -16691,7 +16324,7 @@
               <w:rPr>
                 <w:rFonts w:ascii="新細明體" w:hAnsi="新細明體"/>
               </w:rPr>
-              <w:t>16 GB DDR4</w:t>
+              <w:t>16 GB</w:t>
             </w:r>
           </w:p>
         </w:tc>
@@ -16709,7 +16342,7 @@
               <w:rPr>
                 <w:rFonts w:ascii="新細明體" w:hAnsi="新細明體"/>
               </w:rPr>
-              <w:t>儲存裝置</w:t>
+              <w:t>主儲存</w:t>
             </w:r>
           </w:p>
         </w:tc>
@@ -16724,7 +16357,7 @@
               <w:rPr>
                 <w:rFonts w:ascii="新細明體" w:hAnsi="新細明體"/>
               </w:rPr>
-              <w:t>256 GB SSD</w:t>
+              <w:t>256 GB 硬碟（HDD）</w:t>
             </w:r>
           </w:p>
         </w:tc>
@@ -16739,7 +16372,7 @@
               <w:rPr>
                 <w:rFonts w:ascii="新細明體" w:hAnsi="新細明體"/>
               </w:rPr>
-              <w:t>512 GB SSD</w:t>
+              <w:t>512 GB 固態硬碟（SSD）</w:t>
             </w:r>
           </w:p>
         </w:tc>
@@ -16757,7 +16390,7 @@
               <w:rPr>
                 <w:rFonts w:ascii="新細明體" w:hAnsi="新細明體"/>
               </w:rPr>
-              <w:t>顯示器</w:t>
+              <w:t>顯示卡</w:t>
             </w:r>
           </w:p>
         </w:tc>
@@ -16772,7 +16405,7 @@
               <w:rPr>
                 <w:rFonts w:ascii="新細明體" w:hAnsi="新細明體"/>
               </w:rPr>
-              <w:t>24" FHD</w:t>
+              <w:t>內置顯示</w:t>
             </w:r>
           </w:p>
         </w:tc>
@@ -16787,7 +16420,55 @@
               <w:rPr>
                 <w:rFonts w:ascii="新細明體" w:hAnsi="新細明體"/>
               </w:rPr>
-              <w:t>27" FHD</w:t>
+              <w:t>NVIDIA 獨立顯卡（4 GB）</w:t>
+            </w:r>
+          </w:p>
+        </w:tc>
+      </w:tr>
+      <w:tr>
+        <w:tc>
+          <w:tcPr>
+            <w:tcW w:type="dxa" w:w="3489"/>
+            <w:vAlign w:val="center"/>
+            <w:shd w:val="clear" w:color="auto" w:fill="D9D9D9"/>
+          </w:tcPr>
+          <w:p>
+            <w:pPr/>
+            <w:r>
+              <w:rPr>
+                <w:rFonts w:ascii="新細明體" w:hAnsi="新細明體"/>
+              </w:rPr>
+              <w:t>螢幕</w:t>
+            </w:r>
+          </w:p>
+        </w:tc>
+        <w:tc>
+          <w:tcPr>
+            <w:tcW w:type="dxa" w:w="3489"/>
+            <w:vAlign w:val="center"/>
+          </w:tcPr>
+          <w:p>
+            <w:pPr/>
+            <w:r>
+              <w:rPr>
+                <w:rFonts w:ascii="新細明體" w:hAnsi="新細明體"/>
+              </w:rPr>
+              <w:t>21 吋</w:t>
+            </w:r>
+          </w:p>
+        </w:tc>
+        <w:tc>
+          <w:tcPr>
+            <w:tcW w:type="dxa" w:w="3489"/>
+            <w:vAlign w:val="center"/>
+          </w:tcPr>
+          <w:p>
+            <w:pPr/>
+            <w:r>
+              <w:rPr>
+                <w:rFonts w:ascii="新細明體" w:hAnsi="新細明體"/>
+              </w:rPr>
+              <w:t>27 吋</w:t>
             </w:r>
           </w:p>
         </w:tc>
@@ -16818,7 +16499,7 @@
         <w:tab/>
         <w:t>(a)</w:t>
         <w:tab/>
-        <w:t>就下表所列部件，各舉一例說明其功能（須與部件直接相關）。</w:t>
+        <w:t>根據下表，說明電腦 A 通常適合甚麼用途？電腦 B 通常適合甚麼用途？（各舉一例，須寫明引用下表哪一項規格，例如 RAM 或主儲存）</w:t>
         <w:tab/>
         <w:t>(2 分)</w:t>
       </w:r>
@@ -16923,7 +16604,7 @@
         </w:rPr>
         <w:t>)</w:t>
         <w:tab/>
-        <w:t>說明人工智能可如何協助青禾醫務室管理日常運作，並舉出一項限制。</w:t>
+        <w:t>若醫務室須同時開啟病人管理系統及醫療影像軟件，應選購電腦 A 還是電腦 B？須引用下表至少兩項規格（例如 RAM、主儲存、顯示卡）說明理由。</w:t>
         <w:tab/>
         <w:t>(3 分)</w:t>
       </w:r>
@@ -19145,7 +18826,7 @@
           <w:spacing w:val="20"/>
           <w:szCs w:val="20"/>
         </w:rPr>
-        <w:t>「德望」網店使用資料表 TRANSACTION(TID, Item, Qty, ADate) 記錄交易，部分記錄見表。</w:t>
+        <w:t>「德望」網店使用資料表 TRANSACTION(TID, Item, Qty, ADate) 記錄交易，部分記錄見下表。</w:t>
       </w:r>
     </w:p>
     <w:p>
@@ -19813,7 +19494,7 @@
         </w:rPr>
         <w:t>b)</w:t>
         <w:tab/>
-        <w:t>寫出一條 SELECT，列出 Qty ≥ 5 的 Item 及 Qty。</w:t>
+        <w:t>寫出一條 SELECT 語句，查詢 Qty ≥ 5 的交易；並以表格列出查詢結果將顯示的 Item 及 Qty。</w:t>
         <w:tab/>
         <w:t>(2 分)</w:t>
       </w:r>
@@ -29872,9 +29553,6 @@
           <w:szCs w:val="20"/>
         </w:rPr>
       </w:pPr>
-      <w:r>
-        <w:t>2025–2026 年度　中五級　資訊及通訊科技科　下學期考試答案</w:t>
-      </w:r>
     </w:p>
     <w:p>
       <w:pPr>
@@ -29895,27 +29573,27 @@
         </w:rPr>
       </w:pPr>
       <w:r>
+        <w:t>2025–2026 年度　中五級　資訊及通訊科技科　下學期考試答案</w:t>
+      </w:r>
+    </w:p>
+    <w:p>
+      <w:pPr>
+        <w:tabs>
+          <w:tab w:pos="567" w:val="left"/>
+          <w:tab w:pos="993" w:val="left"/>
+          <w:tab w:pos="1418" w:val="left"/>
+          <w:tab w:pos="1843" w:val="left"/>
+          <w:tab w:pos="2268" w:val="left"/>
+        </w:tabs>
+        <w:snapToGrid w:val="0"/>
+        <w:ind/>
+        <w:rPr>
+          <w:spacing w:val="20"/>
+          <w:szCs w:val="20"/>
+        </w:rPr>
+      </w:pPr>
+      <w:r>
         <w:t>甲部</w:t>
-      </w:r>
-    </w:p>
-    <w:p>
-      <w:pPr>
-        <w:tabs>
-          <w:tab w:pos="567" w:val="left"/>
-          <w:tab w:pos="993" w:val="left"/>
-          <w:tab w:pos="1418" w:val="left"/>
-          <w:tab w:pos="1843" w:val="left"/>
-          <w:tab w:pos="2268" w:val="left"/>
-        </w:tabs>
-        <w:snapToGrid w:val="0"/>
-        <w:ind/>
-        <w:rPr>
-          <w:spacing w:val="20"/>
-          <w:szCs w:val="20"/>
-        </w:rPr>
-      </w:pPr>
-      <w:r>
-        <w:t>BBADC DDBDB ACCAB</w:t>
       </w:r>
     </w:p>
     <w:p>
@@ -29937,7 +29615,7 @@
         </w:rPr>
       </w:pPr>
       <w:r>
-        <w:t>DACCD ABAAB DCCBA</w:t>
+        <w:t>BBADC DCADB CCCAB</w:t>
       </w:r>
     </w:p>
     <w:p>
@@ -29958,6 +29636,9 @@
           <w:u w:val="single"/>
         </w:rPr>
       </w:pPr>
+      <w:r>
+        <w:t>DACAC ABAAB DBCBA</w:t>
+      </w:r>
     </w:p>
     <w:p>
       <w:pPr>
@@ -29978,9 +29659,6 @@
           <w:szCs w:val="20"/>
         </w:rPr>
       </w:pPr>
-      <w:r>
-        <w:t>乙部</w:t>
-      </w:r>
     </w:p>
     <w:p>
       <w:pPr>
@@ -30001,7 +29679,7 @@
         </w:rPr>
       </w:pPr>
       <w:r>
-        <w:t>1.</w:t>
+        <w:t>乙部</w:t>
       </w:r>
     </w:p>
     <w:p>
@@ -30019,21 +29697,19 @@
         <w:rPr>
           <w:rFonts w:hint="eastAsia"/>
         </w:rPr>
-        <w:tab/>
+        <w:t>1</w:t>
       </w:r>
       <w:r>
         <w:rPr>
           <w:rFonts w:hint="eastAsia"/>
         </w:rPr>
-        <w:t>(</w:t>
+        <w:t>.</w:t>
       </w:r>
       <w:r>
         <w:rPr>
           <w:rFonts w:hint="eastAsia"/>
         </w:rPr>
-        <w:t>a)</w:t>
-        <w:tab/>
-        <w:t>=IF(AND(E2="Y",D2&gt;=5),C2*D2*0.9,C2*D2)</w:t>
+        <w:t xml:space="preserve"> </w:t>
       </w:r>
     </w:p>
     <w:p>
@@ -30051,9 +29727,9 @@
           <w:bCs/>
         </w:rPr>
         <w:tab/>
-        <w:t>(b)</w:t>
-        <w:tab/>
-        <w:t>=SUMIF(B$2:B$50,"明信片",F$2:F$50)</w:t>
+        <w:t>(a)</w:t>
+        <w:tab/>
+        <w:t>=IF(AND(E2="Y",D2&gt;=5),C2*D2*0.9,C2*D2)</w:t>
       </w:r>
     </w:p>
     <w:p>
@@ -30082,7 +29758,7 @@
           <w:szCs w:val="20"/>
           <w:u w:val="single"/>
         </w:rPr>
-        <w:t xml:space="preserve"> </w:t>
+        <w:tab/>
       </w:r>
       <w:r>
         <w:rPr>
@@ -30093,7 +29769,7 @@
           <w:szCs w:val="20"/>
           <w:u w:val="single"/>
         </w:rPr>
-        <w:t xml:space="preserve"> </w:t>
+        <w:t>(</w:t>
       </w:r>
       <w:r>
         <w:rPr>
@@ -30104,7 +29780,7 @@
           <w:szCs w:val="20"/>
           <w:u w:val="single"/>
         </w:rPr>
-        <w:t xml:space="preserve"> </w:t>
+        <w:t>b</w:t>
       </w:r>
       <w:r>
         <w:rPr>
@@ -30115,7 +29791,7 @@
           <w:szCs w:val="20"/>
           <w:u w:val="single"/>
         </w:rPr>
-        <w:t xml:space="preserve"> </w:t>
+        <w:t>)</w:t>
       </w:r>
       <w:r>
         <w:rPr>
@@ -30126,7 +29802,7 @@
           <w:szCs w:val="20"/>
           <w:u w:val="single"/>
         </w:rPr>
-        <w:t xml:space="preserve"> </w:t>
+        <w:tab/>
       </w:r>
       <w:r>
         <w:rPr>
@@ -30137,7 +29813,7 @@
           <w:szCs w:val="20"/>
           <w:u w:val="single"/>
         </w:rPr>
-        <w:t xml:space="preserve"> </w:t>
+        <w:t>=</w:t>
       </w:r>
       <w:r>
         <w:rPr>
@@ -30148,7 +29824,7 @@
           <w:szCs w:val="20"/>
           <w:u w:val="single"/>
         </w:rPr>
-        <w:t xml:space="preserve"> </w:t>
+        <w:t>SUMIF(Order[商品],"明信片",Order[總價])</w:t>
       </w:r>
     </w:p>
     <w:p>
@@ -30165,6 +29841,16 @@
           <w:spacing w:val="20"/>
           <w:szCs w:val="20"/>
         </w:rPr>
+        <w:t xml:space="preserve"> </w:t>
+      </w:r>
+    </w:p>
+    <w:p>
+      <w:pPr>
+        <w:rPr>
+          <w:szCs w:val="20"/>
+        </w:rPr>
+      </w:pPr>
+      <w:r>
         <w:t>2.</w:t>
       </w:r>
     </w:p>
@@ -30172,19 +29858,6 @@
       <w:pPr>
         <w:rPr>
           <w:szCs w:val="20"/>
-        </w:rPr>
-      </w:pPr>
-      <w:r>
-        <w:tab/>
-        <w:t>(a)</w:t>
-        <w:tab/>
-        <w:t>CPU：執行指令；RAM：暫存執行中資料；儲存：永久保存檔案；顯示器：輸出畫面</w:t>
-      </w:r>
-    </w:p>
-    <w:p>
-      <w:pPr>
-        <w:rPr>
-          <w:szCs w:val="20"/>
           <w:lang w:val="en-HK"/>
         </w:rPr>
       </w:pPr>
@@ -30209,7 +29882,7 @@
           <w:spacing w:val="20"/>
           <w:szCs w:val="20"/>
         </w:rPr>
-        <w:t>b</w:t>
+        <w:t>a</w:t>
       </w:r>
       <w:r>
         <w:rPr>
@@ -30232,7 +29905,7 @@
           <w:spacing w:val="20"/>
           <w:szCs w:val="20"/>
         </w:rPr>
-        <w:t>雲</w:t>
+        <w:t>A</w:t>
       </w:r>
       <w:r>
         <w:rPr>
@@ -30240,7 +29913,7 @@
           <w:spacing w:val="20"/>
           <w:szCs w:val="20"/>
         </w:rPr>
-        <w:t>端：節省本地硬件成本、易備份；限制：需網絡、私隱風險；本地：速度快、離線可用；限制：硬件成本高、難擴充</w:t>
+        <w:t>：8 GB RAM、256 GB HDD，適合文書／簡單網頁；B：Core i7、獨立顯卡，適合醫療影像或較多程式</w:t>
       </w:r>
     </w:p>
     <w:p>
@@ -30253,6 +29926,12 @@
           <w:lang w:val="en-HK"/>
         </w:rPr>
       </w:pPr>
+      <w:r>
+        <w:tab/>
+        <w:t>(b)</w:t>
+        <w:tab/>
+        <w:t>選 B；16 GB RAM 可同時運行兩個系統；SSD 較快；獨立顯卡有助醫療影像</w:t>
+      </w:r>
     </w:p>
     <w:p>
       <w:pPr>
@@ -30272,7 +29951,7 @@
           <w:spacing w:val="20"/>
           <w:szCs w:val="20"/>
         </w:rPr>
-        <w:t>3.</w:t>
+        <w:t xml:space="preserve"> </w:t>
       </w:r>
     </w:p>
     <w:p>
@@ -30287,10 +29966,7 @@
         </w:rPr>
       </w:pPr>
       <w:r>
-        <w:tab/>
-        <w:t>(a)</w:t>
-        <w:tab/>
-        <w:t>1920×1080×24/8 = 6,220,800 bytes/張；40 張 ≈ 237.3 MB（展示計算）</w:t>
+        <w:t>3.</w:t>
       </w:r>
     </w:p>
     <w:p>
@@ -30314,9 +29990,9 @@
       </w:pPr>
       <w:r>
         <w:tab/>
-        <w:t>(b)</w:t>
-        <w:tab/>
-        <w:t>JPEG 檔較細但有損；PNG 無損但檔案較大</w:t>
+        <w:t>(a)</w:t>
+        <w:tab/>
+        <w:t>1920×1080×24/8 = 6,220,800 bytes/張；40 張 ≈ 237.3 MB（展示計算）</w:t>
       </w:r>
     </w:p>
     <w:p>
@@ -30339,7 +30015,7 @@
           <w:szCs w:val="20"/>
           <w:u w:val="single"/>
         </w:rPr>
-        <w:t xml:space="preserve"> </w:t>
+        <w:tab/>
       </w:r>
       <w:r>
         <w:rPr>
@@ -30348,7 +30024,7 @@
           <w:szCs w:val="20"/>
           <w:u w:val="single"/>
         </w:rPr>
-        <w:t xml:space="preserve"> </w:t>
+        <w:t>(</w:t>
       </w:r>
       <w:r>
         <w:rPr>
@@ -30358,7 +30034,7 @@
           <w:szCs w:val="20"/>
           <w:u w:val="single"/>
         </w:rPr>
-        <w:t xml:space="preserve"> </w:t>
+        <w:t>b</w:t>
       </w:r>
       <w:r>
         <w:rPr>
@@ -30367,7 +30043,7 @@
           <w:szCs w:val="20"/>
           <w:u w:val="single"/>
         </w:rPr>
-        <w:t xml:space="preserve"> </w:t>
+        <w:t>)</w:t>
       </w:r>
       <w:r>
         <w:rPr>
@@ -30376,7 +30052,7 @@
           <w:szCs w:val="20"/>
           <w:u w:val="single"/>
         </w:rPr>
-        <w:t xml:space="preserve"> </w:t>
+        <w:tab/>
       </w:r>
       <w:r>
         <w:rPr>
@@ -30386,7 +30062,7 @@
           <w:szCs w:val="20"/>
           <w:u w:val="single"/>
         </w:rPr>
-        <w:t xml:space="preserve"> </w:t>
+        <w:t>J</w:t>
       </w:r>
       <w:r>
         <w:rPr>
@@ -30396,7 +30072,7 @@
           <w:szCs w:val="20"/>
           <w:u w:val="single"/>
         </w:rPr>
-        <w:t xml:space="preserve"> </w:t>
+        <w:t>PEG 檔較細但有損；PNG 無損但檔案較大</w:t>
       </w:r>
     </w:p>
     <w:p>
@@ -30418,7 +30094,7 @@
           <w:szCs w:val="20"/>
           <w:u w:val="single"/>
         </w:rPr>
-        <w:t>4.</w:t>
+        <w:t xml:space="preserve"> </w:t>
       </w:r>
     </w:p>
     <w:p>
@@ -30437,7 +30113,7 @@
           <w:bCs/>
           <w:szCs w:val="20"/>
         </w:rPr>
-        <w:tab/>
+        <w:t>4</w:t>
       </w:r>
       <w:r>
         <w:rPr>
@@ -30445,7 +30121,7 @@
           <w:bCs/>
           <w:szCs w:val="20"/>
         </w:rPr>
-        <w:t>(</w:t>
+        <w:t>.</w:t>
       </w:r>
       <w:r>
         <w:rPr>
@@ -30453,7 +30129,7 @@
           <w:bCs/>
           <w:szCs w:val="20"/>
         </w:rPr>
-        <w:t>a</w:t>
+        <w:t xml:space="preserve"> </w:t>
       </w:r>
       <w:r>
         <w:rPr>
@@ -30461,7 +30137,7 @@
           <w:bCs/>
           <w:szCs w:val="20"/>
         </w:rPr>
-        <w:t>)</w:t>
+        <w:t xml:space="preserve"> </w:t>
       </w:r>
       <w:r>
         <w:rPr>
@@ -30469,8 +30145,7 @@
           <w:bCs/>
           <w:szCs w:val="20"/>
         </w:rPr>
-        <w:tab/>
-        <w:t>key=5 不在陣列內 → found 維持 FALSE → 最終 OUTPUT = 0</w:t>
+        <w:t xml:space="preserve"> </w:t>
       </w:r>
     </w:p>
     <w:p>
@@ -30505,19 +30180,25 @@
           <w:bCs/>
           <w:szCs w:val="20"/>
         </w:rPr>
-        <w:t>b)</w:t>
+        <w:t>a)</w:t>
+        <w:tab/>
+        <w:t>key=5 不在陣列內 → found 維持 FALSE → 最終 OUTPUT = 0</w:t>
+      </w:r>
+    </w:p>
+    <w:p>
+      <w:pPr>
+        <w:snapToGrid w:val="0"/>
+        <w:ind w:right="480"/>
+        <w:rPr>
+          <w:szCs w:val="20"/>
+        </w:rPr>
+      </w:pPr>
+      <w:r>
+        <w:tab/>
+        <w:t>(b)</w:t>
         <w:tab/>
         <w:t>逐一比對每個元素，最壞需檢查 n 個位置</w:t>
       </w:r>
-    </w:p>
-    <w:p>
-      <w:pPr>
-        <w:snapToGrid w:val="0"/>
-        <w:ind w:right="480"/>
-        <w:rPr>
-          <w:szCs w:val="20"/>
-        </w:rPr>
-      </w:pPr>
     </w:p>
     <w:p>
       <w:pPr>
@@ -30538,7 +30219,7 @@
           <w:szCs w:val="20"/>
           <w:u w:val="single"/>
         </w:rPr>
-        <w:t>5</w:t>
+        <w:t xml:space="preserve"> </w:t>
       </w:r>
       <w:r>
         <w:rPr>
@@ -30548,7 +30229,7 @@
           <w:szCs w:val="20"/>
           <w:u w:val="single"/>
         </w:rPr>
-        <w:t>.</w:t>
+        <w:t xml:space="preserve"> </w:t>
       </w:r>
     </w:p>
     <w:p>
@@ -30570,39 +30251,39 @@
           <w:rFonts w:hint="eastAsia"/>
           <w:szCs w:val="20"/>
         </w:rPr>
-        <w:tab/>
-      </w:r>
-      <w:r>
-        <w:rPr>
-          <w:szCs w:val="20"/>
-        </w:rPr>
-        <w:t>(</w:t>
-      </w:r>
-      <w:r>
-        <w:rPr>
-          <w:szCs w:val="20"/>
-        </w:rPr>
-        <w:t>a</w:t>
-      </w:r>
-      <w:r>
-        <w:rPr>
-          <w:szCs w:val="20"/>
-        </w:rPr>
-        <w:t>)</w:t>
+        <w:t>5</w:t>
+      </w:r>
+      <w:r>
+        <w:rPr>
+          <w:szCs w:val="20"/>
+        </w:rPr>
+        <w:t>.</w:t>
+      </w:r>
+      <w:r>
+        <w:rPr>
+          <w:szCs w:val="20"/>
+        </w:rPr>
+        <w:t xml:space="preserve"> </w:t>
+      </w:r>
+      <w:r>
+        <w:rPr>
+          <w:szCs w:val="20"/>
+        </w:rPr>
+        <w:t xml:space="preserve"> </w:t>
       </w:r>
       <w:r>
         <w:rPr>
           <w:rFonts w:ascii="Courier New" w:hAnsi="Courier New" w:cs="Courier New"/>
           <w:szCs w:val="20"/>
         </w:rPr>
-        <w:tab/>
+        <w:t xml:space="preserve"> </w:t>
       </w:r>
       <w:r>
         <w:rPr>
           <w:rFonts w:ascii="Courier New" w:hAnsi="Courier New" w:cs="Courier New"/>
           <w:szCs w:val="20"/>
         </w:rPr>
-        <w:t>CREATE TABLE TRANSACTION (TID CHAR(6) PRIMARY KEY, Item VARCHAR(40) NOT NULL, Qty INTEGER, ADate DATE);</w:t>
+        <w:t xml:space="preserve"> </w:t>
       </w:r>
     </w:p>
     <w:p>
@@ -30637,9 +30318,9 @@
           <w:rFonts w:ascii="Courier New" w:hAnsi="Courier New" w:cs="Courier New"/>
           <w:szCs w:val="20"/>
         </w:rPr>
-        <w:t>b)</w:t>
-        <w:tab/>
-        <w:t>SELECT Item, Qty FROM TRANSACTION WHERE Qty &gt;= 5;</w:t>
+        <w:t>a)</w:t>
+        <w:tab/>
+        <w:t>CREATE TABLE TRANSACTION (TID CHAR(6) PRIMARY KEY, Item VARCHAR(40) NOT NULL, Qty INTEGER, ADate DATE);</w:t>
       </w:r>
     </w:p>
     <w:p>
@@ -30657,6 +30338,12 @@
           <w:szCs w:val="20"/>
         </w:rPr>
       </w:pPr>
+      <w:r>
+        <w:tab/>
+        <w:t>(b)</w:t>
+        <w:tab/>
+        <w:t>SELECT Item, Qty FROM TRANSACTION WHERE Qty &gt;= 5; 結果例：明信片|8；徽章|6</w:t>
+      </w:r>
     </w:p>
     <w:p>
       <w:pPr>
@@ -30678,14 +30365,14 @@
           <w:rFonts w:cs="Courier New" w:hint="eastAsia"/>
           <w:szCs w:val="20"/>
         </w:rPr>
-        <w:t>6</w:t>
+        <w:t xml:space="preserve"> </w:t>
       </w:r>
       <w:r>
         <w:rPr>
           <w:rFonts w:cs="Courier New"/>
           <w:szCs w:val="20"/>
         </w:rPr>
-        <w:t>.</w:t>
+        <w:t xml:space="preserve"> </w:t>
       </w:r>
       <w:r>
         <w:rPr>
@@ -30749,29 +30436,27 @@
           <w:rFonts w:cs="新細明體"/>
           <w:szCs w:val="20"/>
         </w:rPr>
-        <w:tab/>
+        <w:t>6</w:t>
       </w:r>
       <w:r>
         <w:rPr>
           <w:rFonts w:cs="新細明體"/>
           <w:szCs w:val="20"/>
         </w:rPr>
-        <w:t>(</w:t>
-      </w:r>
-      <w:r>
-        <w:rPr>
-          <w:szCs w:val="20"/>
-        </w:rPr>
-        <w:t>a</w:t>
+        <w:t>.</w:t>
+      </w:r>
+      <w:r>
+        <w:rPr>
+          <w:szCs w:val="20"/>
+        </w:rPr>
+        <w:t xml:space="preserve"> </w:t>
       </w:r>
       <w:r>
         <w:rPr>
           <w:rFonts w:ascii="新細明體" w:hAnsi="新細明體" w:cs="新細明體" w:hint="eastAsia"/>
           <w:szCs w:val="20"/>
         </w:rPr>
-        <w:t>)</w:t>
-        <w:tab/>
-        <w:t>例：Intel Core i7；AMD Ryzen 7</w:t>
+        <w:t xml:space="preserve"> </w:t>
       </w:r>
     </w:p>
     <w:p>
@@ -30808,9 +30493,9 @@
           <w:rFonts w:ascii="新細明體" w:hAnsi="新細明體" w:cs="新細明體" w:hint="eastAsia"/>
           <w:szCs w:val="20"/>
         </w:rPr>
-        <w:t>b)</w:t>
-        <w:tab/>
-        <w:t>RAM 增加可同時運行更多程式／減少換頁</w:t>
+        <w:t>a)</w:t>
+        <w:tab/>
+        <w:t>例：Intel Core i7；AMD Ryzen 7</w:t>
       </w:r>
     </w:p>
     <w:p>
@@ -30831,7 +30516,7 @@
         <w:t>(</w:t>
       </w:r>
       <w:r>
-        <w:t>c</w:t>
+        <w:t>b</w:t>
       </w:r>
       <w:r>
         <w:t>)</w:t>
@@ -30841,7 +30526,7 @@
           <w:rFonts w:hint="eastAsia"/>
         </w:rPr>
         <w:tab/>
-        <w:t>SSD：快、抗震；HDD：容量大、成本低</w:t>
+        <w:t>RAM 增加可同時運行更多程式／減少換頁</w:t>
       </w:r>
     </w:p>
     <w:p>
@@ -30862,7 +30547,7 @@
         <w:t>(</w:t>
       </w:r>
       <w:r>
-        <w:t>d</w:t>
+        <w:t>c</w:t>
       </w:r>
       <w:r>
         <w:rPr>
@@ -30870,7 +30555,7 @@
         </w:rPr>
         <w:t>)</w:t>
         <w:tab/>
-        <w:t>例：升級顯示卡須同時安裝新驅動程式</w:t>
+        <w:t>SSD：快、抗震；HDD：容量大、成本低</w:t>
       </w:r>
     </w:p>
     <w:p>
@@ -30884,6 +30569,12 @@
         <w:snapToGrid w:val="0"/>
         <w:ind w:right="480"/>
       </w:pPr>
+      <w:r>
+        <w:tab/>
+        <w:t>(d)</w:t>
+        <w:tab/>
+        <w:t>例：升級顯示卡須同時安裝新驅動程式</w:t>
+      </w:r>
     </w:p>
     <w:p>
       <w:pPr>
@@ -30900,10 +30591,10 @@
         <w:rPr>
           <w:rFonts w:hint="eastAsia"/>
         </w:rPr>
-        <w:t>丙</w:t>
-      </w:r>
-      <w:r>
-        <w:t>部</w:t>
+        <w:t xml:space="preserve"> </w:t>
+      </w:r>
+      <w:r>
+        <w:t xml:space="preserve"> </w:t>
       </w:r>
       <w:r>
         <w:t xml:space="preserve"> </w:t>
@@ -30960,10 +30651,10 @@
         <w:ind w:right="480"/>
       </w:pPr>
       <w:r>
-        <w:t>1</w:t>
-      </w:r>
-      <w:r>
-        <w:t>.</w:t>
+        <w:t>丙</w:t>
+      </w:r>
+      <w:r>
+        <w:t>部</w:t>
       </w:r>
       <w:r>
         <w:t xml:space="preserve"> </w:t>
@@ -31008,28 +30699,28 @@
         <w:ind w:left="1276" w:right="480" w:hangingChars="638" w:hanging="1276"/>
       </w:pPr>
       <w:r>
-        <w:tab/>
-      </w:r>
-      <w:r>
-        <w:t>(</w:t>
-      </w:r>
-      <w:r>
-        <w:t>a</w:t>
+        <w:t>1</w:t>
+      </w:r>
+      <w:r>
+        <w:t>.</w:t>
+      </w:r>
+      <w:r>
+        <w:t xml:space="preserve"> </w:t>
       </w:r>
       <w:r>
         <w:rPr>
           <w:rFonts w:hint="eastAsia"/>
         </w:rPr>
-        <w:t>)</w:t>
-      </w:r>
-      <w:r>
-        <w:tab/>
+        <w:t xml:space="preserve"> </w:t>
+      </w:r>
+      <w:r>
+        <w:t xml:space="preserve"> </w:t>
       </w:r>
       <w:r>
         <w:rPr>
           <w:rFonts w:hint="eastAsia"/>
         </w:rPr>
-        <w:t>ERD：Member–Booking–Screening–Cinema 四實體；Booking 連 Member、Screening；Screening 連 Cinema</w:t>
+        <w:t xml:space="preserve"> </w:t>
       </w:r>
     </w:p>
     <w:p>
@@ -31043,6 +30734,12 @@
         <w:snapToGrid w:val="0"/>
         <w:ind w:left="1276" w:right="480" w:hangingChars="638" w:hanging="1276"/>
       </w:pPr>
+      <w:r>
+        <w:tab/>
+        <w:t>(a)</w:t>
+        <w:tab/>
+        <w:t>ERD：Member–Booking–Screening–Cinema 四實體；Booking 連 Member、Screening；Screening 連 Cinema</w:t>
+      </w:r>
     </w:p>
     <w:p>
       <w:pPr>
@@ -31059,10 +30756,10 @@
         <w:rPr>
           <w:rFonts w:hint="eastAsia"/>
         </w:rPr>
-        <w:t>2</w:t>
-      </w:r>
-      <w:r>
-        <w:t>.</w:t>
+        <w:t xml:space="preserve"> </w:t>
+      </w:r>
+      <w:r>
+        <w:t xml:space="preserve"> </w:t>
       </w:r>
       <w:r>
         <w:t xml:space="preserve"> </w:t>
@@ -31087,7 +30784,7 @@
           <w:spacing w:val="20"/>
           <w:szCs w:val="20"/>
         </w:rPr>
-        <w:tab/>
+        <w:t>2</w:t>
       </w:r>
       <w:r>
         <w:rPr>
@@ -31095,23 +30792,21 @@
           <w:spacing w:val="20"/>
           <w:szCs w:val="20"/>
         </w:rPr>
-        <w:t>(</w:t>
-      </w:r>
-      <w:r>
-        <w:rPr>
-          <w:spacing w:val="20"/>
-          <w:szCs w:val="20"/>
-        </w:rPr>
-        <w:t>a</w:t>
-      </w:r>
-      <w:r>
-        <w:rPr>
-          <w:spacing w:val="20"/>
-          <w:szCs w:val="20"/>
-        </w:rPr>
-        <w:t>)</w:t>
-        <w:tab/>
-        <w:t>MID CHAR(6) PRIMARY KEY, TITLE VARCHAR(80) NOT NULL, …</w:t>
+        <w:t>.</w:t>
+      </w:r>
+      <w:r>
+        <w:rPr>
+          <w:spacing w:val="20"/>
+          <w:szCs w:val="20"/>
+        </w:rPr>
+        <w:t xml:space="preserve"> </w:t>
+      </w:r>
+      <w:r>
+        <w:rPr>
+          <w:spacing w:val="20"/>
+          <w:szCs w:val="20"/>
+        </w:rPr>
+        <w:t xml:space="preserve"> </w:t>
       </w:r>
     </w:p>
     <w:p>
@@ -31131,9 +30826,9 @@
       </w:pPr>
       <w:r>
         <w:tab/>
-        <w:t>(b)</w:t>
-        <w:tab/>
-        <w:t>防止借書記錄指向不存在的會員；刪除會員時可限制</w:t>
+        <w:t>(a)</w:t>
+        <w:tab/>
+        <w:t>MID CHAR(6) PRIMARY KEY, TITLE VARCHAR(80) NOT NULL, …</w:t>
       </w:r>
     </w:p>
     <w:p>
@@ -31156,21 +30851,21 @@
           <w:spacing w:val="20"/>
           <w:szCs w:val="20"/>
         </w:rPr>
-        <w:t xml:space="preserve"> </w:t>
-      </w:r>
-      <w:r>
-        <w:rPr>
-          <w:spacing w:val="20"/>
-          <w:szCs w:val="20"/>
-        </w:rPr>
-        <w:t xml:space="preserve"> </w:t>
-      </w:r>
-      <w:r>
-        <w:rPr>
-          <w:spacing w:val="20"/>
-          <w:szCs w:val="20"/>
-        </w:rPr>
-        <w:t xml:space="preserve"> </w:t>
+        <w:tab/>
+      </w:r>
+      <w:r>
+        <w:rPr>
+          <w:spacing w:val="20"/>
+          <w:szCs w:val="20"/>
+        </w:rPr>
+        <w:t>(</w:t>
+      </w:r>
+      <w:r>
+        <w:rPr>
+          <w:spacing w:val="20"/>
+          <w:szCs w:val="20"/>
+        </w:rPr>
+        <w:t>b</w:t>
       </w:r>
       <w:r>
         <w:rPr>
@@ -31178,21 +30873,21 @@
           <w:spacing w:val="20"/>
           <w:szCs w:val="20"/>
         </w:rPr>
-        <w:t xml:space="preserve"> </w:t>
-      </w:r>
-      <w:r>
-        <w:rPr>
-          <w:spacing w:val="20"/>
-          <w:szCs w:val="20"/>
-        </w:rPr>
-        <w:t xml:space="preserve"> </w:t>
-      </w:r>
-      <w:r>
-        <w:rPr>
-          <w:spacing w:val="20"/>
-          <w:szCs w:val="20"/>
-        </w:rPr>
-        <w:t xml:space="preserve"> </w:t>
+        <w:t>)</w:t>
+      </w:r>
+      <w:r>
+        <w:rPr>
+          <w:spacing w:val="20"/>
+          <w:szCs w:val="20"/>
+        </w:rPr>
+        <w:tab/>
+      </w:r>
+      <w:r>
+        <w:rPr>
+          <w:spacing w:val="20"/>
+          <w:szCs w:val="20"/>
+        </w:rPr>
+        <w:t>防</w:t>
       </w:r>
       <w:r>
         <w:rPr>
@@ -31200,7 +30895,7 @@
           <w:spacing w:val="20"/>
           <w:szCs w:val="20"/>
         </w:rPr>
-        <w:t xml:space="preserve"> </w:t>
+        <w:t>止</w:t>
       </w:r>
       <w:r>
         <w:rPr>
@@ -31208,14 +30903,14 @@
           <w:spacing w:val="20"/>
           <w:szCs w:val="20"/>
         </w:rPr>
-        <w:t xml:space="preserve"> </w:t>
-      </w:r>
-      <w:r>
-        <w:rPr>
-          <w:spacing w:val="20"/>
-          <w:szCs w:val="20"/>
-        </w:rPr>
-        <w:t xml:space="preserve"> </w:t>
+        <w:t>借</w:t>
+      </w:r>
+      <w:r>
+        <w:rPr>
+          <w:spacing w:val="20"/>
+          <w:szCs w:val="20"/>
+        </w:rPr>
+        <w:t>書</w:t>
       </w:r>
       <w:r>
         <w:rPr>
@@ -31223,7 +30918,7 @@
           <w:spacing w:val="20"/>
           <w:szCs w:val="20"/>
         </w:rPr>
-        <w:t xml:space="preserve"> </w:t>
+        <w:t>記錄指向不存在的會員；刪除會員時可限制</w:t>
       </w:r>
     </w:p>
     <w:p>
@@ -31245,14 +30940,14 @@
           <w:spacing w:val="20"/>
           <w:szCs w:val="20"/>
         </w:rPr>
-        <w:t>3</w:t>
-      </w:r>
-      <w:r>
-        <w:rPr>
-          <w:spacing w:val="20"/>
-          <w:szCs w:val="20"/>
-        </w:rPr>
-        <w:t>.</w:t>
+        <w:t xml:space="preserve"> </w:t>
+      </w:r>
+      <w:r>
+        <w:rPr>
+          <w:spacing w:val="20"/>
+          <w:szCs w:val="20"/>
+        </w:rPr>
+        <w:t xml:space="preserve"> </w:t>
       </w:r>
       <w:r>
         <w:rPr>
@@ -31282,14 +30977,14 @@
           <w:spacing w:val="20"/>
           <w:szCs w:val="20"/>
         </w:rPr>
-        <w:tab/>
-      </w:r>
-      <w:r>
-        <w:rPr>
-          <w:spacing w:val="20"/>
-          <w:szCs w:val="20"/>
-        </w:rPr>
-        <w:t>(</w:t>
+        <w:t>3</w:t>
+      </w:r>
+      <w:r>
+        <w:rPr>
+          <w:spacing w:val="20"/>
+          <w:szCs w:val="20"/>
+        </w:rPr>
+        <w:t>.</w:t>
       </w:r>
       <w:r>
         <w:rPr>
@@ -31297,7 +30992,7 @@
           <w:spacing w:val="20"/>
           <w:szCs w:val="20"/>
         </w:rPr>
-        <w:t>a</w:t>
+        <w:t xml:space="preserve"> </w:t>
       </w:r>
       <w:r>
         <w:rPr>
@@ -31305,28 +31000,28 @@
           <w:spacing w:val="20"/>
           <w:szCs w:val="20"/>
         </w:rPr>
-        <w:t>)</w:t>
-      </w:r>
-      <w:r>
-        <w:rPr>
-          <w:spacing w:val="20"/>
-          <w:szCs w:val="20"/>
-        </w:rPr>
-        <w:tab/>
-      </w:r>
-      <w:r>
-        <w:rPr>
-          <w:spacing w:val="20"/>
-          <w:szCs w:val="20"/>
-        </w:rPr>
-        <w:t>姓</w:t>
-      </w:r>
-      <w:r>
-        <w:rPr>
-          <w:spacing w:val="20"/>
-          <w:szCs w:val="20"/>
-        </w:rPr>
-        <w:t>名</w:t>
+        <w:t xml:space="preserve"> </w:t>
+      </w:r>
+      <w:r>
+        <w:rPr>
+          <w:spacing w:val="20"/>
+          <w:szCs w:val="20"/>
+        </w:rPr>
+        <w:t xml:space="preserve"> </w:t>
+      </w:r>
+      <w:r>
+        <w:rPr>
+          <w:spacing w:val="20"/>
+          <w:szCs w:val="20"/>
+        </w:rPr>
+        <w:t xml:space="preserve"> </w:t>
+      </w:r>
+      <w:r>
+        <w:rPr>
+          <w:spacing w:val="20"/>
+          <w:szCs w:val="20"/>
+        </w:rPr>
+        <w:t xml:space="preserve"> </w:t>
       </w:r>
       <w:r>
         <w:rPr>
@@ -31334,7 +31029,7 @@
           <w:spacing w:val="20"/>
           <w:szCs w:val="20"/>
         </w:rPr>
-        <w:t>／電話重複；更新電話要改多筆 → 更新異常</w:t>
+        <w:t xml:space="preserve"> </w:t>
       </w:r>
     </w:p>
     <w:p>
@@ -31371,7 +31066,7 @@
           <w:spacing w:val="20"/>
           <w:szCs w:val="20"/>
         </w:rPr>
-        <w:t>b</w:t>
+        <w:t>a</w:t>
       </w:r>
       <w:r>
         <w:rPr>
@@ -31395,7 +31090,7 @@
           <w:spacing w:val="20"/>
           <w:szCs w:val="20"/>
         </w:rPr>
-        <w:t>分拆 MEMBER(MID, Name, Phone) 與 LOAN(MID, BID, …)</w:t>
+        <w:t>姓名／電話重複；更新電話要改多筆 → 更新異常</w:t>
       </w:r>
     </w:p>
     <w:p>
@@ -31417,14 +31112,14 @@
           <w:spacing w:val="20"/>
           <w:szCs w:val="20"/>
         </w:rPr>
-        <w:t xml:space="preserve"> </w:t>
-      </w:r>
-      <w:r>
-        <w:rPr>
-          <w:spacing w:val="20"/>
-          <w:szCs w:val="20"/>
-        </w:rPr>
-        <w:t xml:space="preserve"> </w:t>
+        <w:tab/>
+      </w:r>
+      <w:r>
+        <w:rPr>
+          <w:spacing w:val="20"/>
+          <w:szCs w:val="20"/>
+        </w:rPr>
+        <w:t>(</w:t>
       </w:r>
       <w:r>
         <w:rPr>
@@ -31432,7 +31127,9 @@
           <w:spacing w:val="20"/>
           <w:szCs w:val="20"/>
         </w:rPr>
-        <w:t xml:space="preserve"> </w:t>
+        <w:t>b)</w:t>
+        <w:tab/>
+        <w:t>分拆 MEMBER(MID, Name, Phone) 與 LOAN(MID, BID, …)</w:t>
       </w:r>
     </w:p>
     <w:p>
@@ -31454,14 +31151,14 @@
           <w:spacing w:val="20"/>
           <w:szCs w:val="20"/>
         </w:rPr>
-        <w:t>4</w:t>
-      </w:r>
-      <w:r>
-        <w:rPr>
-          <w:spacing w:val="20"/>
-          <w:szCs w:val="20"/>
-        </w:rPr>
-        <w:t>.</w:t>
+        <w:t xml:space="preserve"> </w:t>
+      </w:r>
+      <w:r>
+        <w:rPr>
+          <w:spacing w:val="20"/>
+          <w:szCs w:val="20"/>
+        </w:rPr>
+        <w:t xml:space="preserve"> </w:t>
       </w:r>
       <w:r>
         <w:rPr>
@@ -31491,14 +31188,14 @@
           <w:spacing w:val="20"/>
           <w:szCs w:val="20"/>
         </w:rPr>
-        <w:tab/>
-      </w:r>
-      <w:r>
-        <w:rPr>
-          <w:spacing w:val="20"/>
-          <w:szCs w:val="20"/>
-        </w:rPr>
-        <w:t>(</w:t>
+        <w:t>4</w:t>
+      </w:r>
+      <w:r>
+        <w:rPr>
+          <w:spacing w:val="20"/>
+          <w:szCs w:val="20"/>
+        </w:rPr>
+        <w:t>.</w:t>
       </w:r>
       <w:r>
         <w:rPr>
@@ -31506,9 +31203,7 @@
           <w:spacing w:val="20"/>
           <w:szCs w:val="20"/>
         </w:rPr>
-        <w:t>a)</w:t>
-        <w:tab/>
-        <w:t>SELECT M.MName, F.FName FROM MEMBER M INNER JOIN RESERVE R ON M.MID=R.MEMID INNER JOIN FACILITY F ON R.FID=F.FID;</w:t>
+        <w:t xml:space="preserve"> </w:t>
       </w:r>
     </w:p>
     <w:p>
@@ -31528,9 +31223,9 @@
       </w:pPr>
       <w:r>
         <w:tab/>
-        <w:t>(b)</w:t>
-        <w:tab/>
-        <w:t>SELECT F.FName, COUNT(*) FROM RESERVE R JOIN FACILITY F ON R.FID=F.FID GROUP BY F.FName HAVING COUNT(*)&gt;=2;</w:t>
+        <w:t>(a)</w:t>
+        <w:tab/>
+        <w:t>SELECT M.MName, F.FName FROM MEMBER M INNER JOIN RESERVE R ON M.MID=R.MEMID INNER JOIN FACILITY F ON R.FID=F.FID;</w:t>
       </w:r>
     </w:p>
     <w:p>
@@ -31554,7 +31249,7 @@
         <w:t>(</w:t>
       </w:r>
       <w:r>
-        <w:t>c</w:t>
+        <w:t>b</w:t>
       </w:r>
       <w:r>
         <w:rPr>
@@ -31566,13 +31261,13 @@
         <w:tab/>
       </w:r>
       <w:r>
-        <w:t>M</w:t>
+        <w:t>S</w:t>
       </w:r>
       <w:r>
         <w:rPr>
           <w:rFonts w:hint="eastAsia"/>
         </w:rPr>
-        <w:t>INUS 或 UNION 擇一；例：曾訂 F01 但未訂 F02 的 MID</w:t>
+        <w:t>ELECT F.FName, COUNT(*) FROM RESERVE R JOIN FACILITY F ON R.FID=F.FID GROUP BY F.FName HAVING COUNT(*)&gt;=2;</w:t>
       </w:r>
     </w:p>
     <w:p>
@@ -31587,16 +31282,18 @@
         <w:ind w:left="1276" w:right="480" w:hangingChars="638" w:hanging="1276"/>
       </w:pPr>
       <w:r>
-        <w:t xml:space="preserve"> </w:t>
-      </w:r>
-      <w:r>
-        <w:t xml:space="preserve"> </w:t>
+        <w:tab/>
+      </w:r>
+      <w:r>
+        <w:t>(</w:t>
       </w:r>
       <w:r>
         <w:rPr>
           <w:rFonts w:hint="eastAsia"/>
         </w:rPr>
-        <w:t xml:space="preserve"> </w:t>
+        <w:t>c)</w:t>
+        <w:tab/>
+        <w:t>MINUS 或 UNION 擇一；例：曾訂 F01 但未訂 F02 的 MID</w:t>
       </w:r>
     </w:p>
     <w:p>
@@ -31611,10 +31308,10 @@
         <w:ind w:left="1276" w:right="480" w:hangingChars="638" w:hanging="1276"/>
       </w:pPr>
       <w:r>
-        <w:t>5</w:t>
-      </w:r>
-      <w:r>
-        <w:t>.</w:t>
+        <w:t xml:space="preserve"> </w:t>
+      </w:r>
+      <w:r>
+        <w:t xml:space="preserve"> </w:t>
       </w:r>
       <w:r>
         <w:rPr>
@@ -31635,18 +31332,16 @@
         <w:ind w:left="1276" w:right="480" w:hangingChars="638" w:hanging="1276"/>
       </w:pPr>
       <w:r>
-        <w:tab/>
-      </w:r>
-      <w:r>
-        <w:t>(</w:t>
+        <w:t>5</w:t>
+      </w:r>
+      <w:r>
+        <w:t>.</w:t>
       </w:r>
       <w:r>
         <w:rPr>
           <w:rFonts w:hint="eastAsia"/>
         </w:rPr>
-        <w:t>a)</w:t>
-        <w:tab/>
-        <w:t>Grid[3][2]=1 為牆；Grid[3][3]=0 可向右移</w:t>
+        <w:t xml:space="preserve"> </w:t>
       </w:r>
     </w:p>
     <w:p>
@@ -31670,7 +31365,7 @@
         <w:rPr>
           <w:rFonts w:hint="eastAsia"/>
         </w:rPr>
-        <w:t>b</w:t>
+        <w:t>a</w:t>
       </w:r>
       <w:r>
         <w:rPr>
@@ -31683,7 +31378,7 @@
           <w:rFonts w:hint="eastAsia"/>
         </w:rPr>
         <w:tab/>
-        <w:t>POP→5；POP→1；最終頂端=1</w:t>
+        <w:t>Grid[3][2]=1 為牆；Grid[3][3]=0 可向右移</w:t>
       </w:r>
     </w:p>
     <w:p>
@@ -31698,31 +31393,31 @@
         <w:ind w:left="1276" w:right="480" w:hangingChars="638" w:hanging="1276"/>
       </w:pPr>
       <w:r>
-        <w:t xml:space="preserve"> </w:t>
-      </w:r>
-      <w:r>
-        <w:t xml:space="preserve"> </w:t>
-      </w:r>
-      <w:r>
-        <w:t xml:space="preserve"> </w:t>
+        <w:tab/>
+      </w:r>
+      <w:r>
+        <w:t>(</w:t>
+      </w:r>
+      <w:r>
+        <w:t>b</w:t>
       </w:r>
       <w:r>
         <w:rPr>
           <w:rFonts w:hint="eastAsia"/>
         </w:rPr>
-        <w:t xml:space="preserve"> </w:t>
+        <w:t>)</w:t>
       </w:r>
       <w:r>
         <w:rPr>
           <w:rFonts w:hint="eastAsia"/>
         </w:rPr>
-        <w:t xml:space="preserve"> </w:t>
+        <w:tab/>
       </w:r>
       <w:r>
         <w:rPr>
           <w:rFonts w:hint="eastAsia"/>
         </w:rPr>
-        <w:t xml:space="preserve"> </w:t>
+        <w:t>POP→5；POP→1；最終頂端=1</w:t>
       </w:r>
     </w:p>
     <w:p>
@@ -31737,10 +31432,10 @@
         <w:ind w:left="1276" w:right="480" w:hangingChars="638" w:hanging="1276"/>
       </w:pPr>
       <w:r>
-        <w:t>6</w:t>
-      </w:r>
-      <w:r>
-        <w:t>.</w:t>
+        <w:t xml:space="preserve"> </w:t>
+      </w:r>
+      <w:r>
+        <w:t xml:space="preserve"> </w:t>
       </w:r>
       <w:r>
         <w:t xml:space="preserve"> </w:t>
@@ -31776,31 +31471,31 @@
         <w:ind w:left="1276" w:right="480" w:hangingChars="638" w:hanging="1276"/>
       </w:pPr>
       <w:r>
-        <w:tab/>
-      </w:r>
-      <w:r>
-        <w:t>(</w:t>
-      </w:r>
-      <w:r>
-        <w:t>a</w:t>
+        <w:t>6</w:t>
+      </w:r>
+      <w:r>
+        <w:t>.</w:t>
+      </w:r>
+      <w:r>
+        <w:t xml:space="preserve"> </w:t>
       </w:r>
       <w:r>
         <w:rPr>
           <w:rFonts w:hint="eastAsia"/>
         </w:rPr>
-        <w:t>)</w:t>
+        <w:t xml:space="preserve"> </w:t>
       </w:r>
       <w:r>
         <w:rPr>
           <w:rFonts w:hint="eastAsia"/>
         </w:rPr>
-        <w:tab/>
+        <w:t xml:space="preserve"> </w:t>
       </w:r>
       <w:r>
         <w:rPr>
           <w:rFonts w:hint="eastAsia"/>
         </w:rPr>
-        <w:t>Dequeue 後 Front 指向下一個輪候者</w:t>
+        <w:t xml:space="preserve"> </w:t>
       </w:r>
     </w:p>
     <w:p>
@@ -31821,7 +31516,7 @@
         <w:t>(</w:t>
       </w:r>
       <w:r>
-        <w:t>b</w:t>
+        <w:t>a</w:t>
       </w:r>
       <w:r>
         <w:rPr>
@@ -31839,19 +31534,19 @@
         <w:rPr>
           <w:rFonts w:hint="eastAsia"/>
         </w:rPr>
-        <w:t>二</w:t>
+        <w:t>D</w:t>
       </w:r>
       <w:r>
         <w:rPr>
           <w:rFonts w:hint="eastAsia"/>
         </w:rPr>
-        <w:t>分</w:t>
+        <w:t>e</w:t>
       </w:r>
       <w:r>
         <w:rPr>
           <w:rFonts w:hint="eastAsia"/>
         </w:rPr>
-        <w:t>：mid 取中，比較後縮小範圍（至少兩步）</w:t>
+        <w:t>queue 後 Front 指向下一個輪候者</w:t>
       </w:r>
     </w:p>
     <w:p>
@@ -31866,28 +31561,29 @@
         <w:ind w:left="1276" w:right="480" w:hangingChars="638" w:hanging="1276"/>
       </w:pPr>
       <w:r>
-        <w:t xml:space="preserve"> </w:t>
-      </w:r>
-      <w:r>
-        <w:t xml:space="preserve"> </w:t>
+        <w:tab/>
+      </w:r>
+      <w:r>
+        <w:t>(</w:t>
       </w:r>
       <w:r>
         <w:rPr>
           <w:rFonts w:hint="eastAsia"/>
         </w:rPr>
-        <w:t xml:space="preserve"> </w:t>
+        <w:t>b</w:t>
       </w:r>
       <w:r>
         <w:rPr>
           <w:rFonts w:hint="eastAsia"/>
         </w:rPr>
-        <w:t xml:space="preserve"> </w:t>
+        <w:t>)</w:t>
       </w:r>
       <w:r>
         <w:rPr>
           <w:rFonts w:hint="eastAsia"/>
         </w:rPr>
-        <w:t xml:space="preserve"> </w:t>
+        <w:tab/>
+        <w:t>二分：mid 取中，比較後縮小範圍（至少兩步）</w:t>
       </w:r>
     </w:p>
     <w:p>
@@ -31902,10 +31598,10 @@
         <w:ind w:left="1276" w:right="480" w:hangingChars="638" w:hanging="1276"/>
       </w:pPr>
       <w:r>
-        <w:t>7</w:t>
-      </w:r>
-      <w:r>
-        <w:t>.</w:t>
+        <w:t xml:space="preserve"> </w:t>
+      </w:r>
+      <w:r>
+        <w:t xml:space="preserve"> </w:t>
       </w:r>
       <w:r>
         <w:rPr>
@@ -31938,15 +31634,13 @@
         <w:ind w:left="1276" w:right="480" w:hangingChars="638" w:hanging="1276"/>
       </w:pPr>
       <w:r>
-        <w:tab/>
-      </w:r>
-      <w:r>
-        <w:t>(</w:t>
-      </w:r>
-      <w:r>
-        <w:t>a)</w:t>
-        <w:tab/>
-        <w:t>首輪降序：比較 (1,2) 若 72&lt;45 則交換 → 索引 1 與 2</w:t>
+        <w:t>7</w:t>
+      </w:r>
+      <w:r>
+        <w:t>.</w:t>
+      </w:r>
+      <w:r>
+        <w:t xml:space="preserve"> </w:t>
       </w:r>
     </w:p>
     <w:p>
@@ -31973,9 +31667,9 @@
         <w:rPr>
           <w:rFonts w:ascii="Courier New" w:hAnsi="Courier New" w:cs="Courier New"/>
         </w:rPr>
-        <w:t>b)</w:t>
-        <w:tab/>
-        <w:t>沿 Next 由 Head 走訪；刪除 Score=45 結點要調整 Next／Head</w:t>
+        <w:t>a)</w:t>
+        <w:tab/>
+        <w:t>首輪降序：比較 (1,2) 若 72&lt;45 則交換 → 索引 1 與 2</w:t>
       </w:r>
     </w:p>
     <w:p>
@@ -31993,6 +31687,12 @@
           <w:szCs w:val="20"/>
         </w:rPr>
       </w:pPr>
+      <w:r>
+        <w:tab/>
+        <w:t>(b)</w:t>
+        <w:tab/>
+        <w:t>沿 Next 由 Head 走訪；刪除 Score=45 結點要調整 Next／Head</w:t>
+      </w:r>
     </w:p>
     <w:p>
       <w:pPr>

</xml_diff>